<commit_message>
Week 2: selected image processing methods and neural network model, formulated func and nonfunc requirements
</commit_message>
<xml_diff>
--- a/docs/ІК-51мп_ЯковенкоДО.docx
+++ b/docs/ІК-51мп_ЯковенкоДО.docx
@@ -9777,7 +9777,7 @@
                 <w:u w:val="single"/>
                 <w:lang w:eastAsia="ru-RU"/>
               </w:rPr>
-              <w:t>знайомлення з індивідуальним завданням</w:t>
+              <w:t>знайомлення з індивідуальним завданням та форм</w:t>
             </w:r>
             <w:r>
               <w:rPr>
@@ -9788,7 +9788,7 @@
                 <w:u w:val="single"/>
                 <w:lang w:eastAsia="ru-RU"/>
               </w:rPr>
-              <w:t xml:space="preserve"> та </w:t>
+              <w:t>у</w:t>
             </w:r>
             <w:r>
               <w:rPr>
@@ -9799,73 +9799,7 @@
                 <w:u w:val="single"/>
                 <w:lang w:eastAsia="ru-RU"/>
               </w:rPr>
-              <w:t>форм</w:t>
-            </w:r>
-            <w:r>
-              <w:rPr>
-                <w:rFonts w:ascii="Times New Roman" w:eastAsia="Times New Roman" w:hAnsi="Times New Roman"/>
-                <w:bCs/>
-                <w:sz w:val="20"/>
-                <w:szCs w:val="20"/>
-                <w:u w:val="single"/>
-                <w:lang w:eastAsia="ru-RU"/>
-              </w:rPr>
-              <w:t>у</w:t>
-            </w:r>
-            <w:r>
-              <w:rPr>
-                <w:rFonts w:ascii="Times New Roman" w:eastAsia="Times New Roman" w:hAnsi="Times New Roman"/>
-                <w:bCs/>
-                <w:sz w:val="20"/>
-                <w:szCs w:val="20"/>
-                <w:u w:val="single"/>
-                <w:lang w:eastAsia="ru-RU"/>
-              </w:rPr>
-              <w:t>ван</w:t>
-            </w:r>
-            <w:r>
-              <w:rPr>
-                <w:rFonts w:ascii="Times New Roman" w:eastAsia="Times New Roman" w:hAnsi="Times New Roman"/>
-                <w:bCs/>
-                <w:sz w:val="20"/>
-                <w:szCs w:val="20"/>
-                <w:u w:val="single"/>
-                <w:lang w:eastAsia="ru-RU"/>
-              </w:rPr>
-              <w:t>ня</w:t>
-            </w:r>
-            <w:r>
-              <w:rPr>
-                <w:rFonts w:ascii="Times New Roman" w:eastAsia="Times New Roman" w:hAnsi="Times New Roman"/>
-                <w:bCs/>
-                <w:sz w:val="20"/>
-                <w:szCs w:val="20"/>
-                <w:u w:val="single"/>
-                <w:lang w:eastAsia="ru-RU"/>
-              </w:rPr>
-              <w:t xml:space="preserve"> чітк</w:t>
-            </w:r>
-            <w:r>
-              <w:rPr>
-                <w:rFonts w:ascii="Times New Roman" w:eastAsia="Times New Roman" w:hAnsi="Times New Roman"/>
-                <w:bCs/>
-                <w:sz w:val="20"/>
-                <w:szCs w:val="20"/>
-                <w:u w:val="single"/>
-                <w:lang w:eastAsia="ru-RU"/>
-              </w:rPr>
-              <w:t>ого</w:t>
-            </w:r>
-            <w:r>
-              <w:rPr>
-                <w:rFonts w:ascii="Times New Roman" w:eastAsia="Times New Roman" w:hAnsi="Times New Roman"/>
-                <w:bCs/>
-                <w:sz w:val="20"/>
-                <w:szCs w:val="20"/>
-                <w:u w:val="single"/>
-                <w:lang w:eastAsia="ru-RU"/>
-              </w:rPr>
-              <w:t xml:space="preserve"> уявлення про мету роботи. Проведено комплексний аналіз предметної області за темою розробки. Також було досліджено проблематику традиційних методів технічного огляду фасадів (зокрема, обмеження ручної інспекції) та вивчено актуальність залучення безпілотників для автоматизації цього процесу. Здійснено пошук та детальний огляд існуючих рішень, які наразі використовуються для моніторингу стану </w:t>
+              <w:t xml:space="preserve">вання чіткого уявлення про мету роботи. Проведено комплексний аналіз предметної області за темою розробки. Також було досліджено проблематику традиційних методів технічного огляду фасадів (зокрема, обмеження ручної інспекції) та вивчено актуальність залучення безпілотників для автоматизації цього процесу. Здійснено пошук та детальний огляд існуючих рішень, які наразі використовуються для моніторингу стану </w:t>
             </w:r>
             <w:r>
               <w:rPr>
@@ -10397,12 +10331,12 @@
               <w:rPr>
                 <w:rFonts w:ascii="UkrainianBaltica" w:hAnsi="UkrainianBaltica"/>
               </w:rPr>
-              <w:t>____</w:t>
+              <w:t>___</w:t>
             </w:r>
             <w:r>
               <w:rPr>
                 <w:rFonts w:ascii="Cambria" w:hAnsi="Cambria"/>
-                <w:highlight w:val="yellow"/>
+                <w:u w:val="single"/>
                 <w:lang w:val="ru-RU"/>
               </w:rPr>
               <w:t>2</w:t>
@@ -10411,7 +10345,13 @@
               <w:rPr>
                 <w:rFonts w:ascii="UkrainianBaltica" w:hAnsi="UkrainianBaltica"/>
               </w:rPr>
-              <w:t>__ тиждень практики</w:t>
+              <w:t xml:space="preserve">___ </w:t>
+            </w:r>
+            <w:r>
+              <w:rPr>
+                <w:rFonts w:ascii="UkrainianBaltica" w:hAnsi="UkrainianBaltica"/>
+              </w:rPr>
+              <w:t>тиждень практики</w:t>
             </w:r>
           </w:p>
           <w:p>
@@ -10439,7 +10379,82 @@
                 <w:szCs w:val="20"/>
                 <w:lang w:eastAsia="ru-RU"/>
               </w:rPr>
-              <w:t>__________________</w:t>
+              <w:t>___</w:t>
+            </w:r>
+            <w:r>
+              <w:rPr>
+                <w:rFonts w:ascii="Times New Roman" w:eastAsia="Times New Roman" w:hAnsi="Times New Roman"/>
+                <w:b/>
+                <w:sz w:val="20"/>
+                <w:szCs w:val="20"/>
+                <w:lang w:eastAsia="ru-RU"/>
+              </w:rPr>
+              <w:t>_</w:t>
+            </w:r>
+            <w:r>
+              <w:rPr>
+                <w:rFonts w:ascii="Times New Roman" w:eastAsia="Times New Roman" w:hAnsi="Times New Roman"/>
+                <w:bCs/>
+                <w:sz w:val="20"/>
+                <w:szCs w:val="20"/>
+                <w:u w:val="single"/>
+                <w:lang w:eastAsia="ru-RU"/>
+              </w:rPr>
+              <w:t>31</w:t>
+            </w:r>
+            <w:r>
+              <w:rPr>
+                <w:rFonts w:ascii="Times New Roman" w:eastAsia="Times New Roman" w:hAnsi="Times New Roman"/>
+                <w:bCs/>
+                <w:sz w:val="20"/>
+                <w:szCs w:val="20"/>
+                <w:u w:val="single"/>
+                <w:lang w:eastAsia="ru-RU"/>
+              </w:rPr>
+              <w:t>.08–</w:t>
+            </w:r>
+            <w:r>
+              <w:rPr>
+                <w:rFonts w:ascii="Times New Roman" w:eastAsia="Times New Roman" w:hAnsi="Times New Roman"/>
+                <w:bCs/>
+                <w:sz w:val="20"/>
+                <w:szCs w:val="20"/>
+                <w:u w:val="single"/>
+                <w:lang w:eastAsia="ru-RU"/>
+              </w:rPr>
+              <w:t>04.</w:t>
+            </w:r>
+            <w:r>
+              <w:rPr>
+                <w:rFonts w:ascii="Times New Roman" w:eastAsia="Times New Roman" w:hAnsi="Times New Roman"/>
+                <w:bCs/>
+                <w:sz w:val="20"/>
+                <w:szCs w:val="20"/>
+                <w:u w:val="single"/>
+                <w:lang w:eastAsia="ru-RU"/>
+              </w:rPr>
+              <w:t>0</w:t>
+            </w:r>
+            <w:r>
+              <w:rPr>
+                <w:rFonts w:ascii="Times New Roman" w:eastAsia="Times New Roman" w:hAnsi="Times New Roman"/>
+                <w:bCs/>
+                <w:sz w:val="20"/>
+                <w:szCs w:val="20"/>
+                <w:u w:val="single"/>
+                <w:lang w:eastAsia="ru-RU"/>
+              </w:rPr>
+              <w:t>9</w:t>
+            </w:r>
+            <w:r>
+              <w:rPr>
+                <w:rFonts w:ascii="Times New Roman" w:eastAsia="Times New Roman" w:hAnsi="Times New Roman"/>
+                <w:b/>
+                <w:sz w:val="20"/>
+                <w:szCs w:val="20"/>
+                <w:lang w:eastAsia="ru-RU"/>
+              </w:rPr>
+              <w:t>____</w:t>
             </w:r>
             <w:r>
               <w:rPr>
@@ -10562,188 +10577,135 @@
                 <w:tab w:val="left" w:pos="7513"/>
               </w:tabs>
               <w:spacing w:after="0" w:line="480" w:lineRule="auto"/>
-              <w:ind w:left="601"/>
+              <w:ind w:left="601" w:right="288"/>
               <w:jc w:val="both"/>
               <w:rPr>
                 <w:rFonts w:ascii="Times New Roman" w:eastAsia="Times New Roman" w:hAnsi="Times New Roman"/>
                 <w:b/>
                 <w:sz w:val="20"/>
                 <w:szCs w:val="20"/>
-                <w:lang w:eastAsia="ru-RU"/>
-              </w:rPr>
-            </w:pPr>
-            <w:r>
-              <w:rPr>
-                <w:rFonts w:ascii="Times New Roman" w:eastAsia="Times New Roman" w:hAnsi="Times New Roman"/>
-                <w:b/>
-                <w:sz w:val="20"/>
-                <w:szCs w:val="20"/>
-                <w:lang w:eastAsia="ru-RU"/>
-              </w:rPr>
-              <w:t>_____________________________________________________________________</w:t>
-            </w:r>
-          </w:p>
-          <w:p>
-            <w:pPr>
-              <w:tabs>
-                <w:tab w:val="left" w:pos="601"/>
-                <w:tab w:val="left" w:pos="7513"/>
-              </w:tabs>
-              <w:spacing w:after="0" w:line="480" w:lineRule="auto"/>
-              <w:ind w:left="601"/>
-              <w:jc w:val="both"/>
-              <w:rPr>
-                <w:rFonts w:ascii="Times New Roman" w:eastAsia="Times New Roman" w:hAnsi="Times New Roman"/>
-                <w:b/>
-                <w:sz w:val="20"/>
-                <w:szCs w:val="20"/>
-                <w:lang w:eastAsia="ru-RU"/>
-              </w:rPr>
-            </w:pPr>
-            <w:r>
-              <w:rPr>
-                <w:rFonts w:ascii="Times New Roman" w:eastAsia="Times New Roman" w:hAnsi="Times New Roman"/>
-                <w:b/>
-                <w:sz w:val="20"/>
-                <w:szCs w:val="20"/>
-                <w:lang w:eastAsia="ru-RU"/>
-              </w:rPr>
-              <w:t>_____________________________________________________________________</w:t>
-            </w:r>
-          </w:p>
-          <w:p>
-            <w:pPr>
-              <w:tabs>
-                <w:tab w:val="left" w:pos="601"/>
-                <w:tab w:val="left" w:pos="7513"/>
-              </w:tabs>
-              <w:spacing w:after="0" w:line="480" w:lineRule="auto"/>
-              <w:ind w:left="601"/>
-              <w:jc w:val="both"/>
-              <w:rPr>
-                <w:rFonts w:ascii="Times New Roman" w:eastAsia="Times New Roman" w:hAnsi="Times New Roman"/>
-                <w:b/>
-                <w:sz w:val="20"/>
-                <w:szCs w:val="20"/>
-                <w:lang w:eastAsia="ru-RU"/>
-              </w:rPr>
-            </w:pPr>
-            <w:r>
-              <w:rPr>
-                <w:rFonts w:ascii="Times New Roman" w:eastAsia="Times New Roman" w:hAnsi="Times New Roman"/>
-                <w:b/>
-                <w:sz w:val="20"/>
-                <w:szCs w:val="20"/>
-                <w:lang w:eastAsia="ru-RU"/>
-              </w:rPr>
-              <w:t>_____________________________________________________________________</w:t>
-            </w:r>
-          </w:p>
-          <w:p>
-            <w:pPr>
-              <w:tabs>
-                <w:tab w:val="left" w:pos="601"/>
-                <w:tab w:val="left" w:pos="7513"/>
-              </w:tabs>
-              <w:spacing w:after="0" w:line="480" w:lineRule="auto"/>
-              <w:ind w:left="601"/>
-              <w:jc w:val="both"/>
-              <w:rPr>
-                <w:rFonts w:ascii="Times New Roman" w:eastAsia="Times New Roman" w:hAnsi="Times New Roman"/>
-                <w:b/>
-                <w:sz w:val="20"/>
-                <w:szCs w:val="20"/>
-                <w:lang w:eastAsia="ru-RU"/>
-              </w:rPr>
-            </w:pPr>
-            <w:r>
-              <w:rPr>
-                <w:rFonts w:ascii="Times New Roman" w:eastAsia="Times New Roman" w:hAnsi="Times New Roman"/>
-                <w:b/>
-                <w:sz w:val="20"/>
-                <w:szCs w:val="20"/>
-                <w:lang w:eastAsia="ru-RU"/>
-              </w:rPr>
-              <w:t>_____________________________________________________________________</w:t>
-            </w:r>
-          </w:p>
-          <w:p>
-            <w:pPr>
-              <w:tabs>
-                <w:tab w:val="left" w:pos="601"/>
-                <w:tab w:val="left" w:pos="7513"/>
-              </w:tabs>
-              <w:spacing w:after="0" w:line="480" w:lineRule="auto"/>
-              <w:ind w:left="601"/>
-              <w:jc w:val="both"/>
-              <w:rPr>
-                <w:rFonts w:ascii="Times New Roman" w:eastAsia="Times New Roman" w:hAnsi="Times New Roman"/>
-                <w:b/>
-                <w:sz w:val="20"/>
-                <w:szCs w:val="20"/>
-                <w:lang w:eastAsia="ru-RU"/>
-              </w:rPr>
-            </w:pPr>
-            <w:r>
-              <w:rPr>
-                <w:rFonts w:ascii="Times New Roman" w:eastAsia="Times New Roman" w:hAnsi="Times New Roman"/>
-                <w:b/>
-                <w:sz w:val="20"/>
-                <w:szCs w:val="20"/>
-                <w:lang w:eastAsia="ru-RU"/>
-              </w:rPr>
-              <w:t>_____________________________________________________________________</w:t>
-            </w:r>
-          </w:p>
-          <w:p>
-            <w:pPr>
-              <w:tabs>
-                <w:tab w:val="left" w:pos="601"/>
-                <w:tab w:val="left" w:pos="7513"/>
-              </w:tabs>
-              <w:spacing w:after="0" w:line="480" w:lineRule="auto"/>
-              <w:ind w:left="601"/>
-              <w:jc w:val="both"/>
-              <w:rPr>
-                <w:rFonts w:ascii="Times New Roman" w:eastAsia="Times New Roman" w:hAnsi="Times New Roman"/>
-                <w:b/>
-                <w:sz w:val="20"/>
-                <w:szCs w:val="20"/>
-                <w:lang w:eastAsia="ru-RU"/>
-              </w:rPr>
-            </w:pPr>
-            <w:r>
-              <w:rPr>
-                <w:rFonts w:ascii="Times New Roman" w:eastAsia="Times New Roman" w:hAnsi="Times New Roman"/>
-                <w:b/>
-                <w:sz w:val="20"/>
-                <w:szCs w:val="20"/>
-                <w:lang w:eastAsia="ru-RU"/>
-              </w:rPr>
-              <w:t>_____________________________________________________________________</w:t>
-            </w:r>
-          </w:p>
-          <w:p>
-            <w:pPr>
-              <w:tabs>
-                <w:tab w:val="left" w:pos="601"/>
-                <w:tab w:val="left" w:pos="7513"/>
-              </w:tabs>
-              <w:spacing w:after="0" w:line="480" w:lineRule="auto"/>
-              <w:ind w:left="601"/>
-              <w:jc w:val="both"/>
-              <w:rPr>
-                <w:rFonts w:ascii="Times New Roman" w:eastAsia="Times New Roman" w:hAnsi="Times New Roman"/>
-                <w:b/>
-                <w:sz w:val="20"/>
-                <w:szCs w:val="20"/>
-                <w:lang w:eastAsia="ru-RU"/>
-              </w:rPr>
-            </w:pPr>
-            <w:r>
-              <w:rPr>
-                <w:rFonts w:ascii="Times New Roman" w:eastAsia="Times New Roman" w:hAnsi="Times New Roman"/>
-                <w:b/>
+                <w:u w:val="single"/>
+                <w:lang w:eastAsia="ru-RU"/>
+              </w:rPr>
+            </w:pPr>
+            <w:r>
+              <w:rPr>
+                <w:rFonts w:ascii="Times New Roman" w:eastAsia="Times New Roman" w:hAnsi="Times New Roman"/>
+                <w:bCs/>
+                <w:sz w:val="20"/>
+                <w:szCs w:val="20"/>
+                <w:u w:val="single"/>
+                <w:lang w:eastAsia="ru-RU"/>
+              </w:rPr>
+              <w:t xml:space="preserve">Здійснено дослідження методів попередньої обробки зображень, необхідних для підготовки </w:t>
+            </w:r>
+            <w:proofErr w:type="spellStart"/>
+            <w:r>
+              <w:rPr>
+                <w:rFonts w:ascii="Times New Roman" w:eastAsia="Times New Roman" w:hAnsi="Times New Roman"/>
+                <w:bCs/>
+                <w:sz w:val="20"/>
+                <w:szCs w:val="20"/>
+                <w:u w:val="single"/>
+                <w:lang w:eastAsia="ru-RU"/>
+              </w:rPr>
+              <w:t>фотоданих</w:t>
+            </w:r>
+            <w:proofErr w:type="spellEnd"/>
+            <w:r>
+              <w:rPr>
+                <w:rFonts w:ascii="Times New Roman" w:eastAsia="Times New Roman" w:hAnsi="Times New Roman"/>
+                <w:bCs/>
+                <w:sz w:val="20"/>
+                <w:szCs w:val="20"/>
+                <w:u w:val="single"/>
+                <w:lang w:eastAsia="ru-RU"/>
+              </w:rPr>
+              <w:t xml:space="preserve"> з БПЛА. Проведено аналіз існуючих </w:t>
+            </w:r>
+            <w:proofErr w:type="spellStart"/>
+            <w:r>
+              <w:rPr>
+                <w:rFonts w:ascii="Times New Roman" w:eastAsia="Times New Roman" w:hAnsi="Times New Roman"/>
+                <w:bCs/>
+                <w:sz w:val="20"/>
+                <w:szCs w:val="20"/>
+                <w:u w:val="single"/>
+                <w:lang w:eastAsia="ru-RU"/>
+              </w:rPr>
+              <w:t>архітектур</w:t>
+            </w:r>
+            <w:proofErr w:type="spellEnd"/>
+            <w:r>
+              <w:rPr>
+                <w:rFonts w:ascii="Times New Roman" w:eastAsia="Times New Roman" w:hAnsi="Times New Roman"/>
+                <w:bCs/>
+                <w:sz w:val="20"/>
+                <w:szCs w:val="20"/>
+                <w:u w:val="single"/>
+                <w:lang w:eastAsia="ru-RU"/>
+              </w:rPr>
+              <w:t xml:space="preserve"> нейронних мереж та обґрунтовано вибір моделі для вирішення задачі автоматичної </w:t>
+            </w:r>
+            <w:proofErr w:type="spellStart"/>
+            <w:r>
+              <w:rPr>
+                <w:rFonts w:ascii="Times New Roman" w:eastAsia="Times New Roman" w:hAnsi="Times New Roman"/>
+                <w:bCs/>
+                <w:sz w:val="20"/>
+                <w:szCs w:val="20"/>
+                <w:u w:val="single"/>
+                <w:lang w:eastAsia="ru-RU"/>
+              </w:rPr>
+              <w:t>детекції</w:t>
+            </w:r>
+            <w:proofErr w:type="spellEnd"/>
+            <w:r>
+              <w:rPr>
+                <w:rFonts w:ascii="Times New Roman" w:eastAsia="Times New Roman" w:hAnsi="Times New Roman"/>
+                <w:bCs/>
+                <w:sz w:val="20"/>
+                <w:szCs w:val="20"/>
+                <w:u w:val="single"/>
+                <w:lang w:eastAsia="ru-RU"/>
+              </w:rPr>
+              <w:t xml:space="preserve"> дефектів на фасадах. На основі попереднього аналізу предметної області та розглянутих програмних рішень сформовано детальні функціональні та нефункціональні вимоги до розроблюваної системи</w:t>
+            </w:r>
+            <w:r>
+              <w:rPr>
+                <w:rFonts w:ascii="Times New Roman" w:eastAsia="Times New Roman" w:hAnsi="Times New Roman"/>
+                <w:bCs/>
+                <w:sz w:val="20"/>
+                <w:szCs w:val="20"/>
+                <w:u w:val="single"/>
+                <w:lang w:eastAsia="ru-RU"/>
+              </w:rPr>
+              <w:t>.</w:t>
+            </w:r>
+            <w:r>
+              <w:rPr>
+                <w:rFonts w:ascii="Times New Roman" w:eastAsia="Times New Roman" w:hAnsi="Times New Roman"/>
+                <w:bCs/>
+                <w:sz w:val="20"/>
+                <w:szCs w:val="20"/>
+                <w:lang w:eastAsia="ru-RU"/>
+              </w:rPr>
+              <w:t>______________________</w:t>
+            </w:r>
+            <w:r>
+              <w:rPr>
+                <w:rFonts w:ascii="Times New Roman" w:eastAsia="Times New Roman" w:hAnsi="Times New Roman"/>
+                <w:bCs/>
+                <w:sz w:val="20"/>
+                <w:szCs w:val="20"/>
+                <w:lang w:eastAsia="ru-RU"/>
+              </w:rPr>
+              <w:t xml:space="preserve"> </w:t>
+            </w:r>
+            <w:r>
+              <w:rPr>
+                <w:rFonts w:ascii="Times New Roman" w:eastAsia="Times New Roman" w:hAnsi="Times New Roman"/>
+                <w:bCs/>
                 <w:sz w:val="20"/>
                 <w:szCs w:val="20"/>
                 <w:lang w:eastAsia="ru-RU"/>

</xml_diff>

<commit_message>
Week 3: defined technology stack; added use case, component, deployment diagrams
</commit_message>
<xml_diff>
--- a/docs/ІК-51мп_ЯковенкоДО.docx
+++ b/docs/ІК-51мп_ЯковенкоДО.docx
@@ -9896,7 +9896,7 @@
             <w:r>
               <w:rPr>
                 <w:rFonts w:ascii="Cambria" w:hAnsi="Cambria"/>
-                <w:highlight w:val="yellow"/>
+                <w:u w:val="single"/>
                 <w:lang w:val="ru-RU"/>
               </w:rPr>
               <w:t>3</w:t>
@@ -9905,7 +9905,13 @@
               <w:rPr>
                 <w:rFonts w:ascii="UkrainianBaltica" w:hAnsi="UkrainianBaltica"/>
               </w:rPr>
-              <w:t>___ тиждень практики</w:t>
+              <w:t xml:space="preserve">___ </w:t>
+            </w:r>
+            <w:r>
+              <w:rPr>
+                <w:rFonts w:ascii="UkrainianBaltica" w:hAnsi="UkrainianBaltica"/>
+              </w:rPr>
+              <w:t>тиждень практики</w:t>
             </w:r>
           </w:p>
           <w:p>
@@ -9933,7 +9939,104 @@
                 <w:szCs w:val="20"/>
                 <w:lang w:eastAsia="ru-RU"/>
               </w:rPr>
-              <w:t>__________________</w:t>
+              <w:t>___</w:t>
+            </w:r>
+            <w:r>
+              <w:rPr>
+                <w:rFonts w:ascii="Times New Roman" w:eastAsia="Times New Roman" w:hAnsi="Times New Roman"/>
+                <w:b/>
+                <w:sz w:val="20"/>
+                <w:szCs w:val="20"/>
+                <w:lang w:eastAsia="ru-RU"/>
+              </w:rPr>
+              <w:t>_</w:t>
+            </w:r>
+            <w:r>
+              <w:rPr>
+                <w:rFonts w:ascii="Times New Roman" w:eastAsia="Times New Roman" w:hAnsi="Times New Roman"/>
+                <w:bCs/>
+                <w:sz w:val="20"/>
+                <w:szCs w:val="20"/>
+                <w:u w:val="single"/>
+                <w:lang w:eastAsia="ru-RU"/>
+              </w:rPr>
+              <w:t>07</w:t>
+            </w:r>
+            <w:r>
+              <w:rPr>
+                <w:rFonts w:ascii="Times New Roman" w:eastAsia="Times New Roman" w:hAnsi="Times New Roman"/>
+                <w:bCs/>
+                <w:sz w:val="20"/>
+                <w:szCs w:val="20"/>
+                <w:u w:val="single"/>
+                <w:lang w:eastAsia="ru-RU"/>
+              </w:rPr>
+              <w:t>.0</w:t>
+            </w:r>
+            <w:r>
+              <w:rPr>
+                <w:rFonts w:ascii="Times New Roman" w:eastAsia="Times New Roman" w:hAnsi="Times New Roman"/>
+                <w:bCs/>
+                <w:sz w:val="20"/>
+                <w:szCs w:val="20"/>
+                <w:u w:val="single"/>
+                <w:lang w:eastAsia="ru-RU"/>
+              </w:rPr>
+              <w:t>9</w:t>
+            </w:r>
+            <w:r>
+              <w:rPr>
+                <w:rFonts w:ascii="Times New Roman" w:eastAsia="Times New Roman" w:hAnsi="Times New Roman"/>
+                <w:bCs/>
+                <w:sz w:val="20"/>
+                <w:szCs w:val="20"/>
+                <w:u w:val="single"/>
+                <w:lang w:eastAsia="ru-RU"/>
+              </w:rPr>
+              <w:t>–</w:t>
+            </w:r>
+            <w:r>
+              <w:rPr>
+                <w:rFonts w:ascii="Times New Roman" w:eastAsia="Times New Roman" w:hAnsi="Times New Roman"/>
+                <w:bCs/>
+                <w:sz w:val="20"/>
+                <w:szCs w:val="20"/>
+                <w:u w:val="single"/>
+                <w:lang w:eastAsia="ru-RU"/>
+              </w:rPr>
+              <w:t>11</w:t>
+            </w:r>
+            <w:r>
+              <w:rPr>
+                <w:rFonts w:ascii="Times New Roman" w:eastAsia="Times New Roman" w:hAnsi="Times New Roman"/>
+                <w:bCs/>
+                <w:sz w:val="20"/>
+                <w:szCs w:val="20"/>
+                <w:u w:val="single"/>
+                <w:lang w:eastAsia="ru-RU"/>
+              </w:rPr>
+              <w:t>.0</w:t>
+            </w:r>
+            <w:r>
+              <w:rPr>
+                <w:rFonts w:ascii="Times New Roman" w:eastAsia="Times New Roman" w:hAnsi="Times New Roman"/>
+                <w:bCs/>
+                <w:sz w:val="20"/>
+                <w:szCs w:val="20"/>
+                <w:u w:val="single"/>
+                <w:lang w:eastAsia="ru-RU"/>
+              </w:rPr>
+              <w:t>9</w:t>
+            </w:r>
+            <w:r>
+              <w:rPr>
+                <w:rFonts w:ascii="Times New Roman" w:eastAsia="Times New Roman" w:hAnsi="Times New Roman"/>
+                <w:b/>
+                <w:sz w:val="20"/>
+                <w:szCs w:val="20"/>
+                <w:lang w:eastAsia="ru-RU"/>
+              </w:rPr>
+              <w:t>____</w:t>
             </w:r>
             <w:r>
               <w:rPr>
@@ -10052,197 +10155,218 @@
           <w:p>
             <w:pPr>
               <w:tabs>
-                <w:tab w:val="left" w:pos="601"/>
+                <w:tab w:val="left" w:pos="176"/>
                 <w:tab w:val="left" w:pos="7513"/>
               </w:tabs>
               <w:spacing w:after="0" w:line="480" w:lineRule="auto"/>
-              <w:ind w:left="601"/>
+              <w:ind w:left="608" w:right="286"/>
               <w:jc w:val="both"/>
               <w:rPr>
                 <w:rFonts w:ascii="Times New Roman" w:eastAsia="Times New Roman" w:hAnsi="Times New Roman"/>
-                <w:b/>
-                <w:sz w:val="20"/>
-                <w:szCs w:val="20"/>
-                <w:lang w:eastAsia="ru-RU"/>
-              </w:rPr>
-            </w:pPr>
-            <w:r>
-              <w:rPr>
-                <w:rFonts w:ascii="Times New Roman" w:eastAsia="Times New Roman" w:hAnsi="Times New Roman"/>
-                <w:b/>
-                <w:sz w:val="20"/>
-                <w:szCs w:val="20"/>
-                <w:lang w:eastAsia="ru-RU"/>
-              </w:rPr>
-              <w:t>_____________________________________________________________________</w:t>
-            </w:r>
-          </w:p>
-          <w:p>
-            <w:pPr>
-              <w:tabs>
-                <w:tab w:val="left" w:pos="601"/>
-                <w:tab w:val="left" w:pos="7513"/>
-              </w:tabs>
-              <w:spacing w:after="0" w:line="480" w:lineRule="auto"/>
-              <w:ind w:left="601"/>
-              <w:jc w:val="both"/>
-              <w:rPr>
-                <w:rFonts w:ascii="Times New Roman" w:eastAsia="Times New Roman" w:hAnsi="Times New Roman"/>
-                <w:b/>
-                <w:sz w:val="20"/>
-                <w:szCs w:val="20"/>
-                <w:lang w:eastAsia="ru-RU"/>
-              </w:rPr>
-            </w:pPr>
-            <w:r>
-              <w:rPr>
-                <w:rFonts w:ascii="Times New Roman" w:eastAsia="Times New Roman" w:hAnsi="Times New Roman"/>
-                <w:b/>
-                <w:sz w:val="20"/>
-                <w:szCs w:val="20"/>
-                <w:lang w:eastAsia="ru-RU"/>
-              </w:rPr>
-              <w:t>_____________________________________________________________________</w:t>
-            </w:r>
-          </w:p>
-          <w:p>
-            <w:pPr>
-              <w:tabs>
-                <w:tab w:val="left" w:pos="601"/>
-                <w:tab w:val="left" w:pos="7513"/>
-              </w:tabs>
-              <w:spacing w:after="0" w:line="480" w:lineRule="auto"/>
-              <w:ind w:left="601"/>
-              <w:jc w:val="both"/>
-              <w:rPr>
-                <w:rFonts w:ascii="Times New Roman" w:eastAsia="Times New Roman" w:hAnsi="Times New Roman"/>
-                <w:b/>
-                <w:sz w:val="20"/>
-                <w:szCs w:val="20"/>
-                <w:lang w:eastAsia="ru-RU"/>
-              </w:rPr>
-            </w:pPr>
-            <w:r>
-              <w:rPr>
-                <w:rFonts w:ascii="Times New Roman" w:eastAsia="Times New Roman" w:hAnsi="Times New Roman"/>
-                <w:b/>
-                <w:sz w:val="20"/>
-                <w:szCs w:val="20"/>
-                <w:lang w:eastAsia="ru-RU"/>
-              </w:rPr>
-              <w:t>_____________________________________________________________________</w:t>
-            </w:r>
-          </w:p>
-          <w:p>
-            <w:pPr>
-              <w:tabs>
-                <w:tab w:val="left" w:pos="601"/>
-                <w:tab w:val="left" w:pos="7513"/>
-              </w:tabs>
-              <w:spacing w:after="0" w:line="480" w:lineRule="auto"/>
-              <w:ind w:left="601"/>
-              <w:jc w:val="both"/>
-              <w:rPr>
-                <w:rFonts w:ascii="Times New Roman" w:eastAsia="Times New Roman" w:hAnsi="Times New Roman"/>
-                <w:b/>
-                <w:sz w:val="20"/>
-                <w:szCs w:val="20"/>
-                <w:lang w:eastAsia="ru-RU"/>
-              </w:rPr>
-            </w:pPr>
-            <w:r>
-              <w:rPr>
-                <w:rFonts w:ascii="Times New Roman" w:eastAsia="Times New Roman" w:hAnsi="Times New Roman"/>
-                <w:b/>
-                <w:sz w:val="20"/>
-                <w:szCs w:val="20"/>
-                <w:lang w:eastAsia="ru-RU"/>
-              </w:rPr>
-              <w:t>_____________________________________________________________________</w:t>
-            </w:r>
-          </w:p>
-          <w:p>
-            <w:pPr>
-              <w:tabs>
-                <w:tab w:val="left" w:pos="601"/>
-                <w:tab w:val="left" w:pos="7513"/>
-              </w:tabs>
-              <w:spacing w:after="0" w:line="480" w:lineRule="auto"/>
-              <w:ind w:left="601"/>
-              <w:jc w:val="both"/>
-              <w:rPr>
-                <w:rFonts w:ascii="Times New Roman" w:eastAsia="Times New Roman" w:hAnsi="Times New Roman"/>
-                <w:b/>
-                <w:sz w:val="20"/>
-                <w:szCs w:val="20"/>
-                <w:lang w:eastAsia="ru-RU"/>
-              </w:rPr>
-            </w:pPr>
-            <w:r>
-              <w:rPr>
-                <w:rFonts w:ascii="Times New Roman" w:eastAsia="Times New Roman" w:hAnsi="Times New Roman"/>
-                <w:b/>
-                <w:sz w:val="20"/>
-                <w:szCs w:val="20"/>
-                <w:lang w:eastAsia="ru-RU"/>
-              </w:rPr>
-              <w:t>_____________________________________________________________________</w:t>
-            </w:r>
-          </w:p>
-          <w:p>
-            <w:pPr>
-              <w:tabs>
-                <w:tab w:val="left" w:pos="601"/>
-                <w:tab w:val="left" w:pos="7513"/>
-              </w:tabs>
-              <w:spacing w:after="0" w:line="480" w:lineRule="auto"/>
-              <w:ind w:left="601"/>
-              <w:jc w:val="both"/>
-              <w:rPr>
-                <w:rFonts w:ascii="Times New Roman" w:eastAsia="Times New Roman" w:hAnsi="Times New Roman"/>
-                <w:b/>
-                <w:sz w:val="20"/>
-                <w:szCs w:val="20"/>
-                <w:lang w:eastAsia="ru-RU"/>
-              </w:rPr>
-            </w:pPr>
-            <w:r>
-              <w:rPr>
-                <w:rFonts w:ascii="Times New Roman" w:eastAsia="Times New Roman" w:hAnsi="Times New Roman"/>
-                <w:b/>
-                <w:sz w:val="20"/>
-                <w:szCs w:val="20"/>
-                <w:lang w:eastAsia="ru-RU"/>
-              </w:rPr>
-              <w:t>_____________________________________________________________________</w:t>
-            </w:r>
-          </w:p>
-          <w:p>
-            <w:pPr>
-              <w:tabs>
-                <w:tab w:val="left" w:pos="601"/>
-                <w:tab w:val="left" w:pos="7513"/>
-              </w:tabs>
-              <w:spacing w:after="0" w:line="480" w:lineRule="auto"/>
-              <w:ind w:left="601"/>
-              <w:jc w:val="both"/>
-              <w:rPr>
-                <w:rFonts w:ascii="Times New Roman" w:eastAsia="Times New Roman" w:hAnsi="Times New Roman"/>
-                <w:b/>
-                <w:sz w:val="20"/>
-                <w:szCs w:val="20"/>
-                <w:lang w:eastAsia="ru-RU"/>
-              </w:rPr>
-            </w:pPr>
-            <w:r>
-              <w:rPr>
-                <w:rFonts w:ascii="Times New Roman" w:eastAsia="Times New Roman" w:hAnsi="Times New Roman"/>
-                <w:b/>
-                <w:sz w:val="20"/>
-                <w:szCs w:val="20"/>
-                <w:lang w:eastAsia="ru-RU"/>
-              </w:rPr>
-              <w:t>_____________________________________________________________________</w:t>
+                <w:bCs/>
+                <w:sz w:val="20"/>
+                <w:szCs w:val="20"/>
+                <w:u w:val="single"/>
+                <w:lang w:eastAsia="ru-RU"/>
+              </w:rPr>
+            </w:pPr>
+            <w:r>
+              <w:rPr>
+                <w:rFonts w:ascii="Times New Roman" w:eastAsia="Times New Roman" w:hAnsi="Times New Roman"/>
+                <w:bCs/>
+                <w:sz w:val="20"/>
+                <w:szCs w:val="20"/>
+                <w:u w:val="single"/>
+                <w:lang w:eastAsia="ru-RU"/>
+              </w:rPr>
+              <w:t xml:space="preserve">Здійснено аналіз та остаточний вибір набору даних для навчання й тестування інтелектуальної моделі. В якості базового </w:t>
+            </w:r>
+            <w:proofErr w:type="spellStart"/>
+            <w:r>
+              <w:rPr>
+                <w:rFonts w:ascii="Times New Roman" w:eastAsia="Times New Roman" w:hAnsi="Times New Roman"/>
+                <w:bCs/>
+                <w:sz w:val="20"/>
+                <w:szCs w:val="20"/>
+                <w:u w:val="single"/>
+                <w:lang w:eastAsia="ru-RU"/>
+              </w:rPr>
+              <w:t>датасету</w:t>
+            </w:r>
+            <w:proofErr w:type="spellEnd"/>
+            <w:r>
+              <w:rPr>
+                <w:rFonts w:ascii="Times New Roman" w:eastAsia="Times New Roman" w:hAnsi="Times New Roman"/>
+                <w:bCs/>
+                <w:sz w:val="20"/>
+                <w:szCs w:val="20"/>
+                <w:u w:val="single"/>
+                <w:lang w:eastAsia="ru-RU"/>
+              </w:rPr>
+              <w:t xml:space="preserve"> обрано CUBIT-</w:t>
+            </w:r>
+            <w:proofErr w:type="spellStart"/>
+            <w:r>
+              <w:rPr>
+                <w:rFonts w:ascii="Times New Roman" w:eastAsia="Times New Roman" w:hAnsi="Times New Roman"/>
+                <w:bCs/>
+                <w:sz w:val="20"/>
+                <w:szCs w:val="20"/>
+                <w:u w:val="single"/>
+                <w:lang w:eastAsia="ru-RU"/>
+              </w:rPr>
+              <w:t>InSeg</w:t>
+            </w:r>
+            <w:proofErr w:type="spellEnd"/>
+            <w:r>
+              <w:rPr>
+                <w:rFonts w:ascii="Times New Roman" w:eastAsia="Times New Roman" w:hAnsi="Times New Roman"/>
+                <w:bCs/>
+                <w:sz w:val="20"/>
+                <w:szCs w:val="20"/>
+                <w:u w:val="single"/>
+                <w:lang w:eastAsia="ru-RU"/>
+              </w:rPr>
+              <w:t xml:space="preserve">, який спеціалізується на задачі </w:t>
+            </w:r>
+            <w:proofErr w:type="spellStart"/>
+            <w:r>
+              <w:rPr>
+                <w:rFonts w:ascii="Times New Roman" w:eastAsia="Times New Roman" w:hAnsi="Times New Roman"/>
+                <w:bCs/>
+                <w:sz w:val="20"/>
+                <w:szCs w:val="20"/>
+                <w:u w:val="single"/>
+                <w:lang w:eastAsia="ru-RU"/>
+              </w:rPr>
+              <w:t>Instance</w:t>
+            </w:r>
+            <w:proofErr w:type="spellEnd"/>
+            <w:r>
+              <w:rPr>
+                <w:rFonts w:ascii="Times New Roman" w:eastAsia="Times New Roman" w:hAnsi="Times New Roman"/>
+                <w:bCs/>
+                <w:sz w:val="20"/>
+                <w:szCs w:val="20"/>
+                <w:u w:val="single"/>
+                <w:lang w:eastAsia="ru-RU"/>
+              </w:rPr>
+              <w:t xml:space="preserve"> </w:t>
+            </w:r>
+            <w:proofErr w:type="spellStart"/>
+            <w:r>
+              <w:rPr>
+                <w:rFonts w:ascii="Times New Roman" w:eastAsia="Times New Roman" w:hAnsi="Times New Roman"/>
+                <w:bCs/>
+                <w:sz w:val="20"/>
+                <w:szCs w:val="20"/>
+                <w:u w:val="single"/>
+                <w:lang w:eastAsia="ru-RU"/>
+              </w:rPr>
+              <w:t>Segmentation</w:t>
+            </w:r>
+            <w:proofErr w:type="spellEnd"/>
+            <w:r>
+              <w:rPr>
+                <w:rFonts w:ascii="Times New Roman" w:eastAsia="Times New Roman" w:hAnsi="Times New Roman"/>
+                <w:bCs/>
+                <w:sz w:val="20"/>
+                <w:szCs w:val="20"/>
+                <w:u w:val="single"/>
+                <w:lang w:eastAsia="ru-RU"/>
+              </w:rPr>
+              <w:t xml:space="preserve"> </w:t>
+            </w:r>
+            <w:r>
+              <w:rPr>
+                <w:rFonts w:ascii="Times New Roman" w:eastAsia="Times New Roman" w:hAnsi="Times New Roman"/>
+                <w:bCs/>
+                <w:sz w:val="20"/>
+                <w:szCs w:val="20"/>
+                <w:u w:val="single"/>
+                <w:lang w:eastAsia="ru-RU"/>
+              </w:rPr>
+              <w:t xml:space="preserve">структурних пошкоджень фасадів. Визначено оптимальний технологічний стек для програмної реалізації програмного продукту. На основі сформованих раніше вимог розпочато </w:t>
+            </w:r>
+            <w:proofErr w:type="spellStart"/>
+            <w:r>
+              <w:rPr>
+                <w:rFonts w:ascii="Times New Roman" w:eastAsia="Times New Roman" w:hAnsi="Times New Roman"/>
+                <w:bCs/>
+                <w:sz w:val="20"/>
+                <w:szCs w:val="20"/>
+                <w:u w:val="single"/>
+                <w:lang w:eastAsia="ru-RU"/>
+              </w:rPr>
+              <w:t>проєктування</w:t>
+            </w:r>
+            <w:proofErr w:type="spellEnd"/>
+            <w:r>
+              <w:rPr>
+                <w:rFonts w:ascii="Times New Roman" w:eastAsia="Times New Roman" w:hAnsi="Times New Roman"/>
+                <w:bCs/>
+                <w:sz w:val="20"/>
+                <w:szCs w:val="20"/>
+                <w:u w:val="single"/>
+                <w:lang w:eastAsia="ru-RU"/>
+              </w:rPr>
+              <w:t xml:space="preserve"> архітектури клієнт-серверного веб-додатка, включаючи розробку </w:t>
+            </w:r>
+            <w:proofErr w:type="spellStart"/>
+            <w:r>
+              <w:rPr>
+                <w:rFonts w:ascii="Times New Roman" w:eastAsia="Times New Roman" w:hAnsi="Times New Roman"/>
+                <w:bCs/>
+                <w:sz w:val="20"/>
+                <w:szCs w:val="20"/>
+                <w:u w:val="single"/>
+                <w:lang w:eastAsia="ru-RU"/>
+              </w:rPr>
+              <w:t>сх</w:t>
+            </w:r>
+            <w:proofErr w:type="spellEnd"/>
+            <w:r>
+              <w:rPr>
+                <w:rFonts w:ascii="Times New Roman" w:eastAsia="Times New Roman" w:hAnsi="Times New Roman"/>
+                <w:bCs/>
+                <w:sz w:val="20"/>
+                <w:szCs w:val="20"/>
+                <w:u w:val="single"/>
+                <w:lang w:eastAsia="ru-RU"/>
+              </w:rPr>
+              <w:t xml:space="preserve">ем взаємодії між модулем </w:t>
+            </w:r>
+            <w:r>
+              <w:rPr>
+                <w:rFonts w:ascii="Times New Roman" w:eastAsia="Times New Roman" w:hAnsi="Times New Roman"/>
+                <w:bCs/>
+                <w:sz w:val="20"/>
+                <w:szCs w:val="20"/>
+                <w:u w:val="single"/>
+                <w:lang w:eastAsia="ru-RU"/>
+              </w:rPr>
+              <w:t>ШІ</w:t>
+            </w:r>
+            <w:r>
+              <w:rPr>
+                <w:rFonts w:ascii="Times New Roman" w:eastAsia="Times New Roman" w:hAnsi="Times New Roman"/>
+                <w:bCs/>
+                <w:sz w:val="20"/>
+                <w:szCs w:val="20"/>
+                <w:u w:val="single"/>
+                <w:lang w:eastAsia="ru-RU"/>
+              </w:rPr>
+              <w:t>, базою даних та інтерфейсом користувача.</w:t>
+            </w:r>
+            <w:r>
+              <w:rPr>
+                <w:rFonts w:ascii="Times New Roman" w:eastAsia="Times New Roman" w:hAnsi="Times New Roman"/>
+                <w:bCs/>
+                <w:sz w:val="20"/>
+                <w:szCs w:val="20"/>
+                <w:lang w:eastAsia="ru-RU"/>
+              </w:rPr>
+              <w:t>______</w:t>
             </w:r>
           </w:p>
           <w:p>
@@ -10269,24 +10393,6 @@
                 <w:tab w:val="left" w:pos="176"/>
                 <w:tab w:val="left" w:pos="7513"/>
               </w:tabs>
-              <w:spacing w:after="0" w:line="360" w:lineRule="auto"/>
-              <w:ind w:left="284"/>
-              <w:jc w:val="both"/>
-              <w:rPr>
-                <w:rFonts w:ascii="Times New Roman" w:eastAsia="Times New Roman" w:hAnsi="Times New Roman"/>
-                <w:b/>
-                <w:sz w:val="20"/>
-                <w:szCs w:val="20"/>
-                <w:lang w:eastAsia="ru-RU"/>
-              </w:rPr>
-            </w:pPr>
-          </w:p>
-          <w:p>
-            <w:pPr>
-              <w:tabs>
-                <w:tab w:val="left" w:pos="176"/>
-                <w:tab w:val="left" w:pos="7513"/>
-              </w:tabs>
               <w:spacing w:after="0" w:line="240" w:lineRule="auto"/>
               <w:rPr>
                 <w:rFonts w:ascii="Times New Roman" w:eastAsia="Times New Roman" w:hAnsi="Times New Roman"/>
@@ -10690,27 +10796,7 @@
                 <w:szCs w:val="20"/>
                 <w:lang w:eastAsia="ru-RU"/>
               </w:rPr>
-              <w:t>______________________</w:t>
-            </w:r>
-            <w:r>
-              <w:rPr>
-                <w:rFonts w:ascii="Times New Roman" w:eastAsia="Times New Roman" w:hAnsi="Times New Roman"/>
-                <w:bCs/>
-                <w:sz w:val="20"/>
-                <w:szCs w:val="20"/>
-                <w:lang w:eastAsia="ru-RU"/>
-              </w:rPr>
-              <w:t xml:space="preserve"> </w:t>
-            </w:r>
-            <w:r>
-              <w:rPr>
-                <w:rFonts w:ascii="Times New Roman" w:eastAsia="Times New Roman" w:hAnsi="Times New Roman"/>
-                <w:bCs/>
-                <w:sz w:val="20"/>
-                <w:szCs w:val="20"/>
-                <w:lang w:eastAsia="ru-RU"/>
-              </w:rPr>
-              <w:t>_____________________________________________________________________</w:t>
+              <w:t>______________________ _____________________________________________________________________</w:t>
             </w:r>
           </w:p>
           <w:p>

</xml_diff>

<commit_message>
Week 4: dataset image preprocessing and model training for 35 epochs
</commit_message>
<xml_diff>
--- a/docs/ІК-51мп_ЯковенкоДО.docx
+++ b/docs/ІК-51мп_ЯковенкоДО.docx
@@ -10310,31 +10310,7 @@
                 <w:u w:val="single"/>
                 <w:lang w:eastAsia="ru-RU"/>
               </w:rPr>
-              <w:t xml:space="preserve"> архітектури клієнт-серверного веб-додатка, включаючи розробку </w:t>
-            </w:r>
-            <w:proofErr w:type="spellStart"/>
-            <w:r>
-              <w:rPr>
-                <w:rFonts w:ascii="Times New Roman" w:eastAsia="Times New Roman" w:hAnsi="Times New Roman"/>
-                <w:bCs/>
-                <w:sz w:val="20"/>
-                <w:szCs w:val="20"/>
-                <w:u w:val="single"/>
-                <w:lang w:eastAsia="ru-RU"/>
-              </w:rPr>
-              <w:t>сх</w:t>
-            </w:r>
-            <w:proofErr w:type="spellEnd"/>
-            <w:r>
-              <w:rPr>
-                <w:rFonts w:ascii="Times New Roman" w:eastAsia="Times New Roman" w:hAnsi="Times New Roman"/>
-                <w:bCs/>
-                <w:sz w:val="20"/>
-                <w:szCs w:val="20"/>
-                <w:u w:val="single"/>
-                <w:lang w:eastAsia="ru-RU"/>
-              </w:rPr>
-              <w:t xml:space="preserve">ем взаємодії між модулем </w:t>
+              <w:t xml:space="preserve"> архітектури клієнт-серверного веб-додатка, включаючи розробку схем взаємодії між модулем </w:t>
             </w:r>
             <w:r>
               <w:rPr>
@@ -10851,7 +10827,7 @@
             <w:r>
               <w:rPr>
                 <w:rFonts w:ascii="Cambria" w:hAnsi="Cambria"/>
-                <w:highlight w:val="yellow"/>
+                <w:u w:val="single"/>
                 <w:lang w:val="ru-RU"/>
               </w:rPr>
               <w:t>4</w:t>
@@ -10888,7 +10864,115 @@
                 <w:szCs w:val="20"/>
                 <w:lang w:eastAsia="ru-RU"/>
               </w:rPr>
-              <w:t>__________________</w:t>
+              <w:t>___</w:t>
+            </w:r>
+            <w:r>
+              <w:rPr>
+                <w:rFonts w:ascii="Times New Roman" w:eastAsia="Times New Roman" w:hAnsi="Times New Roman"/>
+                <w:b/>
+                <w:sz w:val="20"/>
+                <w:szCs w:val="20"/>
+                <w:lang w:eastAsia="ru-RU"/>
+              </w:rPr>
+              <w:t>_</w:t>
+            </w:r>
+            <w:r>
+              <w:rPr>
+                <w:rFonts w:ascii="Times New Roman" w:eastAsia="Times New Roman" w:hAnsi="Times New Roman"/>
+                <w:bCs/>
+                <w:sz w:val="20"/>
+                <w:szCs w:val="20"/>
+                <w:u w:val="single"/>
+                <w:lang w:eastAsia="ru-RU"/>
+              </w:rPr>
+              <w:t>14</w:t>
+            </w:r>
+            <w:r>
+              <w:rPr>
+                <w:rFonts w:ascii="Times New Roman" w:eastAsia="Times New Roman" w:hAnsi="Times New Roman"/>
+                <w:bCs/>
+                <w:sz w:val="20"/>
+                <w:szCs w:val="20"/>
+                <w:u w:val="single"/>
+                <w:lang w:eastAsia="ru-RU"/>
+              </w:rPr>
+              <w:t>.0</w:t>
+            </w:r>
+            <w:r>
+              <w:rPr>
+                <w:rFonts w:ascii="Times New Roman" w:eastAsia="Times New Roman" w:hAnsi="Times New Roman"/>
+                <w:bCs/>
+                <w:sz w:val="20"/>
+                <w:szCs w:val="20"/>
+                <w:u w:val="single"/>
+                <w:lang w:eastAsia="ru-RU"/>
+              </w:rPr>
+              <w:t>9</w:t>
+            </w:r>
+            <w:r>
+              <w:rPr>
+                <w:rFonts w:ascii="Times New Roman" w:eastAsia="Times New Roman" w:hAnsi="Times New Roman"/>
+                <w:bCs/>
+                <w:sz w:val="20"/>
+                <w:szCs w:val="20"/>
+                <w:u w:val="single"/>
+                <w:lang w:eastAsia="ru-RU"/>
+              </w:rPr>
+              <w:t>–</w:t>
+            </w:r>
+            <w:r>
+              <w:rPr>
+                <w:rFonts w:ascii="Times New Roman" w:eastAsia="Times New Roman" w:hAnsi="Times New Roman"/>
+                <w:bCs/>
+                <w:sz w:val="20"/>
+                <w:szCs w:val="20"/>
+                <w:u w:val="single"/>
+                <w:lang w:eastAsia="ru-RU"/>
+              </w:rPr>
+              <w:t>1</w:t>
+            </w:r>
+            <w:r>
+              <w:rPr>
+                <w:rFonts w:ascii="Times New Roman" w:eastAsia="Times New Roman" w:hAnsi="Times New Roman"/>
+                <w:bCs/>
+                <w:sz w:val="20"/>
+                <w:szCs w:val="20"/>
+                <w:u w:val="single"/>
+                <w:lang w:eastAsia="ru-RU"/>
+              </w:rPr>
+              <w:t>8</w:t>
+            </w:r>
+            <w:r>
+              <w:rPr>
+                <w:rFonts w:ascii="Times New Roman" w:eastAsia="Times New Roman" w:hAnsi="Times New Roman"/>
+                <w:bCs/>
+                <w:sz w:val="20"/>
+                <w:szCs w:val="20"/>
+                <w:u w:val="single"/>
+                <w:lang w:eastAsia="ru-RU"/>
+              </w:rPr>
+              <w:t>.0</w:t>
+            </w:r>
+            <w:r>
+              <w:rPr>
+                <w:rFonts w:ascii="Times New Roman" w:eastAsia="Times New Roman" w:hAnsi="Times New Roman"/>
+                <w:bCs/>
+                <w:sz w:val="20"/>
+                <w:szCs w:val="20"/>
+                <w:u w:val="single"/>
+                <w:lang w:eastAsia="ru-RU"/>
+              </w:rPr>
+              <w:t>9</w:t>
+            </w:r>
+            <w:r>
+              <w:rPr>
+                <w:rFonts w:ascii="Times New Roman" w:eastAsia="Times New Roman" w:hAnsi="Times New Roman"/>
+                <w:b/>
+                <w:sz w:val="20"/>
+                <w:szCs w:val="20"/>
+                <w:lang w:eastAsia="ru-RU"/>
+              </w:rPr>
+              <w:t>____</w:t>
             </w:r>
             <w:r>
               <w:rPr>
@@ -11018,186 +11102,159 @@
                 <w:b/>
                 <w:sz w:val="20"/>
                 <w:szCs w:val="20"/>
-                <w:lang w:eastAsia="ru-RU"/>
-              </w:rPr>
-            </w:pPr>
-            <w:r>
-              <w:rPr>
-                <w:rFonts w:ascii="Times New Roman" w:eastAsia="Times New Roman" w:hAnsi="Times New Roman"/>
-                <w:b/>
-                <w:sz w:val="20"/>
-                <w:szCs w:val="20"/>
-                <w:lang w:eastAsia="ru-RU"/>
-              </w:rPr>
-              <w:t>_____________________________________________________________________</w:t>
-            </w:r>
-          </w:p>
-          <w:p>
-            <w:pPr>
-              <w:tabs>
-                <w:tab w:val="left" w:pos="601"/>
-                <w:tab w:val="left" w:pos="7513"/>
-              </w:tabs>
-              <w:spacing w:after="0" w:line="480" w:lineRule="auto"/>
-              <w:ind w:left="601"/>
-              <w:jc w:val="both"/>
-              <w:rPr>
-                <w:rFonts w:ascii="Times New Roman" w:eastAsia="Times New Roman" w:hAnsi="Times New Roman"/>
-                <w:b/>
-                <w:sz w:val="20"/>
-                <w:szCs w:val="20"/>
-                <w:lang w:eastAsia="ru-RU"/>
-              </w:rPr>
-            </w:pPr>
-            <w:r>
-              <w:rPr>
-                <w:rFonts w:ascii="Times New Roman" w:eastAsia="Times New Roman" w:hAnsi="Times New Roman"/>
-                <w:b/>
-                <w:sz w:val="20"/>
-                <w:szCs w:val="20"/>
-                <w:lang w:eastAsia="ru-RU"/>
-              </w:rPr>
-              <w:t>_____________________________________________________________________</w:t>
-            </w:r>
-          </w:p>
-          <w:p>
-            <w:pPr>
-              <w:tabs>
-                <w:tab w:val="left" w:pos="601"/>
-                <w:tab w:val="left" w:pos="7513"/>
-              </w:tabs>
-              <w:spacing w:after="0" w:line="480" w:lineRule="auto"/>
-              <w:ind w:left="601"/>
-              <w:jc w:val="both"/>
-              <w:rPr>
-                <w:rFonts w:ascii="Times New Roman" w:eastAsia="Times New Roman" w:hAnsi="Times New Roman"/>
-                <w:b/>
-                <w:sz w:val="20"/>
-                <w:szCs w:val="20"/>
-                <w:lang w:eastAsia="ru-RU"/>
-              </w:rPr>
-            </w:pPr>
-            <w:r>
-              <w:rPr>
-                <w:rFonts w:ascii="Times New Roman" w:eastAsia="Times New Roman" w:hAnsi="Times New Roman"/>
-                <w:b/>
-                <w:sz w:val="20"/>
-                <w:szCs w:val="20"/>
-                <w:lang w:eastAsia="ru-RU"/>
-              </w:rPr>
-              <w:t>_____________________________________________________________________</w:t>
-            </w:r>
-          </w:p>
-          <w:p>
-            <w:pPr>
-              <w:tabs>
-                <w:tab w:val="left" w:pos="601"/>
-                <w:tab w:val="left" w:pos="7513"/>
-              </w:tabs>
-              <w:spacing w:after="0" w:line="480" w:lineRule="auto"/>
-              <w:ind w:left="601"/>
-              <w:jc w:val="both"/>
-              <w:rPr>
-                <w:rFonts w:ascii="Times New Roman" w:eastAsia="Times New Roman" w:hAnsi="Times New Roman"/>
-                <w:b/>
-                <w:sz w:val="20"/>
-                <w:szCs w:val="20"/>
-                <w:lang w:eastAsia="ru-RU"/>
-              </w:rPr>
-            </w:pPr>
-            <w:r>
-              <w:rPr>
-                <w:rFonts w:ascii="Times New Roman" w:eastAsia="Times New Roman" w:hAnsi="Times New Roman"/>
-                <w:b/>
-                <w:sz w:val="20"/>
-                <w:szCs w:val="20"/>
-                <w:lang w:eastAsia="ru-RU"/>
-              </w:rPr>
-              <w:t>_____________________________________________________________________</w:t>
-            </w:r>
-          </w:p>
-          <w:p>
-            <w:pPr>
-              <w:tabs>
-                <w:tab w:val="left" w:pos="601"/>
-                <w:tab w:val="left" w:pos="7513"/>
-              </w:tabs>
-              <w:spacing w:after="0" w:line="480" w:lineRule="auto"/>
-              <w:ind w:left="601"/>
-              <w:jc w:val="both"/>
-              <w:rPr>
-                <w:rFonts w:ascii="Times New Roman" w:eastAsia="Times New Roman" w:hAnsi="Times New Roman"/>
-                <w:b/>
-                <w:sz w:val="20"/>
-                <w:szCs w:val="20"/>
-                <w:lang w:eastAsia="ru-RU"/>
-              </w:rPr>
-            </w:pPr>
-            <w:r>
-              <w:rPr>
-                <w:rFonts w:ascii="Times New Roman" w:eastAsia="Times New Roman" w:hAnsi="Times New Roman"/>
-                <w:b/>
-                <w:sz w:val="20"/>
-                <w:szCs w:val="20"/>
-                <w:lang w:eastAsia="ru-RU"/>
-              </w:rPr>
-              <w:t>_____________________________________________________________________</w:t>
-            </w:r>
-          </w:p>
-          <w:p>
-            <w:pPr>
-              <w:tabs>
-                <w:tab w:val="left" w:pos="601"/>
-                <w:tab w:val="left" w:pos="7513"/>
-              </w:tabs>
-              <w:spacing w:after="0" w:line="480" w:lineRule="auto"/>
-              <w:ind w:left="601"/>
-              <w:jc w:val="both"/>
-              <w:rPr>
-                <w:rFonts w:ascii="Times New Roman" w:eastAsia="Times New Roman" w:hAnsi="Times New Roman"/>
-                <w:b/>
-                <w:sz w:val="20"/>
-                <w:szCs w:val="20"/>
-                <w:lang w:eastAsia="ru-RU"/>
-              </w:rPr>
-            </w:pPr>
-            <w:r>
-              <w:rPr>
-                <w:rFonts w:ascii="Times New Roman" w:eastAsia="Times New Roman" w:hAnsi="Times New Roman"/>
-                <w:b/>
-                <w:sz w:val="20"/>
-                <w:szCs w:val="20"/>
-                <w:lang w:eastAsia="ru-RU"/>
-              </w:rPr>
-              <w:t>_____________________________________________________________________</w:t>
-            </w:r>
-          </w:p>
-          <w:p>
-            <w:pPr>
-              <w:tabs>
-                <w:tab w:val="left" w:pos="601"/>
-                <w:tab w:val="left" w:pos="7513"/>
-              </w:tabs>
-              <w:spacing w:after="0" w:line="480" w:lineRule="auto"/>
-              <w:ind w:left="601"/>
-              <w:jc w:val="both"/>
-              <w:rPr>
-                <w:rFonts w:ascii="Times New Roman" w:eastAsia="Times New Roman" w:hAnsi="Times New Roman"/>
-                <w:b/>
-                <w:sz w:val="20"/>
-                <w:szCs w:val="20"/>
-                <w:lang w:eastAsia="ru-RU"/>
-              </w:rPr>
-            </w:pPr>
-            <w:r>
-              <w:rPr>
-                <w:rFonts w:ascii="Times New Roman" w:eastAsia="Times New Roman" w:hAnsi="Times New Roman"/>
-                <w:b/>
-                <w:sz w:val="20"/>
-                <w:szCs w:val="20"/>
-                <w:lang w:eastAsia="ru-RU"/>
-              </w:rPr>
-              <w:t>_____________________________________________________________________</w:t>
+                <w:u w:val="single"/>
+                <w:lang w:eastAsia="ru-RU"/>
+              </w:rPr>
+            </w:pPr>
+            <w:r>
+              <w:rPr>
+                <w:rFonts w:ascii="Times New Roman" w:eastAsia="Times New Roman" w:hAnsi="Times New Roman"/>
+                <w:bCs/>
+                <w:sz w:val="20"/>
+                <w:szCs w:val="20"/>
+                <w:u w:val="single"/>
+                <w:lang w:eastAsia="ru-RU"/>
+              </w:rPr>
+              <w:t>Проведено підготовку набору даних CUBIT-</w:t>
+            </w:r>
+            <w:proofErr w:type="spellStart"/>
+            <w:r>
+              <w:rPr>
+                <w:rFonts w:ascii="Times New Roman" w:eastAsia="Times New Roman" w:hAnsi="Times New Roman"/>
+                <w:bCs/>
+                <w:sz w:val="20"/>
+                <w:szCs w:val="20"/>
+                <w:u w:val="single"/>
+                <w:lang w:eastAsia="ru-RU"/>
+              </w:rPr>
+              <w:t>InSeg</w:t>
+            </w:r>
+            <w:proofErr w:type="spellEnd"/>
+            <w:r>
+              <w:rPr>
+                <w:rFonts w:ascii="Times New Roman" w:eastAsia="Times New Roman" w:hAnsi="Times New Roman"/>
+                <w:bCs/>
+                <w:sz w:val="20"/>
+                <w:szCs w:val="20"/>
+                <w:u w:val="single"/>
+                <w:lang w:eastAsia="ru-RU"/>
+              </w:rPr>
+              <w:t xml:space="preserve"> для подальшого навчання моделі розпізнавання пошкоджень фасадів. Визначено послідовність попередньої обробки зображень, включаючи масштабування, збереження пропорцій та підготовку анотацій. Для навчання моделі створено окремий </w:t>
+            </w:r>
+            <w:proofErr w:type="spellStart"/>
+            <w:r>
+              <w:rPr>
+                <w:rFonts w:ascii="Times New Roman" w:eastAsia="Times New Roman" w:hAnsi="Times New Roman"/>
+                <w:bCs/>
+                <w:sz w:val="20"/>
+                <w:szCs w:val="20"/>
+                <w:u w:val="single"/>
+                <w:lang w:eastAsia="ru-RU"/>
+              </w:rPr>
+              <w:t>Kaggle</w:t>
+            </w:r>
+            <w:proofErr w:type="spellEnd"/>
+            <w:r>
+              <w:rPr>
+                <w:rFonts w:ascii="Times New Roman" w:eastAsia="Times New Roman" w:hAnsi="Times New Roman"/>
+                <w:bCs/>
+                <w:sz w:val="20"/>
+                <w:szCs w:val="20"/>
+                <w:u w:val="single"/>
+                <w:lang w:eastAsia="ru-RU"/>
+              </w:rPr>
+              <w:t xml:space="preserve"> </w:t>
+            </w:r>
+            <w:proofErr w:type="spellStart"/>
+            <w:r>
+              <w:rPr>
+                <w:rFonts w:ascii="Times New Roman" w:eastAsia="Times New Roman" w:hAnsi="Times New Roman"/>
+                <w:bCs/>
+                <w:sz w:val="20"/>
+                <w:szCs w:val="20"/>
+                <w:u w:val="single"/>
+                <w:lang w:eastAsia="ru-RU"/>
+              </w:rPr>
+              <w:t>Notebook</w:t>
+            </w:r>
+            <w:proofErr w:type="spellEnd"/>
+            <w:r>
+              <w:rPr>
+                <w:rFonts w:ascii="Times New Roman" w:eastAsia="Times New Roman" w:hAnsi="Times New Roman"/>
+                <w:bCs/>
+                <w:sz w:val="20"/>
+                <w:szCs w:val="20"/>
+                <w:u w:val="single"/>
+                <w:lang w:eastAsia="ru-RU"/>
+              </w:rPr>
+              <w:t xml:space="preserve"> із використанням GPU-прискорювача. Розпочато навчання моделі YOLOv9-C-SEG на підготовленому наборі даних та налаштовано збереження результатів навчання і ваг моделі</w:t>
+            </w:r>
+            <w:r>
+              <w:rPr>
+                <w:rFonts w:ascii="Times New Roman" w:eastAsia="Times New Roman" w:hAnsi="Times New Roman"/>
+                <w:bCs/>
+                <w:sz w:val="20"/>
+                <w:szCs w:val="20"/>
+                <w:u w:val="single"/>
+                <w:lang w:eastAsia="ru-RU"/>
+              </w:rPr>
+              <w:t xml:space="preserve">. Завершено </w:t>
+            </w:r>
+            <w:proofErr w:type="spellStart"/>
+            <w:r>
+              <w:rPr>
+                <w:rFonts w:ascii="Times New Roman" w:eastAsia="Times New Roman" w:hAnsi="Times New Roman"/>
+                <w:bCs/>
+                <w:sz w:val="20"/>
+                <w:szCs w:val="20"/>
+                <w:u w:val="single"/>
+                <w:lang w:eastAsia="ru-RU"/>
+              </w:rPr>
+              <w:t>проєктування</w:t>
+            </w:r>
+            <w:proofErr w:type="spellEnd"/>
+            <w:r>
+              <w:rPr>
+                <w:rFonts w:ascii="Times New Roman" w:eastAsia="Times New Roman" w:hAnsi="Times New Roman"/>
+                <w:bCs/>
+                <w:sz w:val="20"/>
+                <w:szCs w:val="20"/>
+                <w:u w:val="single"/>
+                <w:lang w:eastAsia="ru-RU"/>
+              </w:rPr>
+              <w:t xml:space="preserve"> архітектури веб-додатка</w:t>
+            </w:r>
+            <w:r>
+              <w:rPr>
+                <w:rFonts w:ascii="Times New Roman" w:eastAsia="Times New Roman" w:hAnsi="Times New Roman"/>
+                <w:bCs/>
+                <w:sz w:val="20"/>
+                <w:szCs w:val="20"/>
+                <w:u w:val="single"/>
+                <w:lang w:eastAsia="ru-RU"/>
+              </w:rPr>
+              <w:t>.</w:t>
+            </w:r>
+            <w:r>
+              <w:rPr>
+                <w:rFonts w:ascii="Times New Roman" w:eastAsia="Times New Roman" w:hAnsi="Times New Roman"/>
+                <w:bCs/>
+                <w:sz w:val="20"/>
+                <w:szCs w:val="20"/>
+                <w:lang w:eastAsia="ru-RU"/>
+              </w:rPr>
+              <w:t>_____________________________</w:t>
+            </w:r>
+            <w:r>
+              <w:rPr>
+                <w:rFonts w:ascii="Times New Roman" w:eastAsia="Times New Roman" w:hAnsi="Times New Roman"/>
+                <w:bCs/>
+                <w:sz w:val="20"/>
+                <w:szCs w:val="20"/>
+                <w:u w:val="single"/>
+                <w:lang w:eastAsia="ru-RU"/>
+              </w:rPr>
+              <w:t xml:space="preserve"> </w:t>
             </w:r>
           </w:p>
           <w:p>
@@ -11207,7 +11264,6 @@
                 <w:tab w:val="left" w:pos="7513"/>
               </w:tabs>
               <w:spacing w:after="0" w:line="360" w:lineRule="auto"/>
-              <w:ind w:left="284"/>
               <w:jc w:val="both"/>
               <w:rPr>
                 <w:rFonts w:ascii="Times New Roman" w:eastAsia="Times New Roman" w:hAnsi="Times New Roman"/>
@@ -11264,11 +11320,7 @@
         </w:tc>
       </w:tr>
     </w:tbl>
-    <w:p>
-      <w:pPr>
-        <w:ind w:firstLine="708"/>
-      </w:pPr>
-    </w:p>
+    <w:p/>
     <w:sectPr>
       <w:pgSz w:w="16838" w:h="11906" w:orient="landscape"/>
       <w:pgMar w:top="568" w:right="1134" w:bottom="284" w:left="1134" w:header="709" w:footer="709" w:gutter="0"/>

</xml_diff>

<commit_message>
Week 5-8: MVP version. Server-side and client-side components have been added. Damage detection and 3D building model generation are implemented
</commit_message>
<xml_diff>
--- a/docs/ІК-51мп_ЯковенкоДО.docx
+++ b/docs/ІК-51мп_ЯковенкоДО.docx
@@ -34,6 +34,7 @@
                 <w:bottom w:val="single" w:sz="12" w:space="1" w:color="auto"/>
               </w:pBdr>
               <w:spacing w:before="0" w:beforeAutospacing="0" w:after="0" w:afterAutospacing="0" w:line="240" w:lineRule="auto"/>
+              <w:ind w:left="322" w:right="270"/>
               <w:jc w:val="center"/>
               <w:rPr>
                 <w:rFonts w:ascii="Times New Roman" w:hAnsi="Times New Roman"/>
@@ -100,34 +101,6 @@
                 <w:szCs w:val="20"/>
               </w:rPr>
               <w:t xml:space="preserve"> СТУДЕНТА НА ПРАКТИЦІ</w:t>
-            </w:r>
-          </w:p>
-          <w:p>
-            <w:pPr>
-              <w:tabs>
-                <w:tab w:val="left" w:pos="176"/>
-                <w:tab w:val="left" w:pos="7513"/>
-              </w:tabs>
-              <w:spacing w:after="0" w:line="240" w:lineRule="auto"/>
-              <w:jc w:val="both"/>
-              <w:rPr>
-                <w:rFonts w:ascii="Times New Roman" w:eastAsia="Times New Roman" w:hAnsi="Times New Roman"/>
-                <w:b/>
-                <w:sz w:val="20"/>
-                <w:szCs w:val="20"/>
-                <w:lang w:val="ru-RU" w:eastAsia="ru-RU"/>
-              </w:rPr>
-            </w:pPr>
-            <w:r>
-              <w:rPr>
-                <w:rFonts w:ascii="Times New Roman" w:eastAsia="Times New Roman" w:hAnsi="Times New Roman"/>
-                <w:bCs/>
-                <w:sz w:val="20"/>
-                <w:szCs w:val="20"/>
-                <w:highlight w:val="yellow"/>
-                <w:lang w:eastAsia="ru-RU"/>
-              </w:rPr>
-              <w:t>Відгук керівника практики підприємства</w:t>
             </w:r>
           </w:p>
           <w:p>
@@ -141,196 +114,323 @@
                 <w:tab w:val="left" w:pos="176"/>
                 <w:tab w:val="left" w:pos="7513"/>
               </w:tabs>
-              <w:spacing w:after="0" w:line="240" w:lineRule="auto"/>
-              <w:jc w:val="center"/>
-              <w:rPr>
-                <w:rFonts w:ascii="Times New Roman" w:eastAsia="Times New Roman" w:hAnsi="Times New Roman"/>
-                <w:sz w:val="20"/>
-                <w:szCs w:val="20"/>
-                <w:lang w:val="ru-RU" w:eastAsia="ru-RU"/>
-              </w:rPr>
-            </w:pPr>
-          </w:p>
-          <w:p>
-            <w:pPr>
-              <w:pBdr>
-                <w:top w:val="single" w:sz="4" w:space="1" w:color="auto"/>
-                <w:bottom w:val="single" w:sz="4" w:space="1" w:color="auto"/>
-                <w:between w:val="single" w:sz="4" w:space="1" w:color="auto"/>
-              </w:pBdr>
+              <w:spacing w:after="0"/>
+              <w:ind w:left="322" w:right="270"/>
+              <w:rPr>
+                <w:rFonts w:ascii="Times New Roman" w:hAnsi="Times New Roman"/>
+                <w:sz w:val="16"/>
+                <w:szCs w:val="16"/>
+                <w:u w:val="single"/>
+              </w:rPr>
+            </w:pPr>
+            <w:r>
+              <w:rPr>
+                <w:rFonts w:ascii="Times New Roman" w:hAnsi="Times New Roman"/>
+                <w:sz w:val="20"/>
+                <w:szCs w:val="20"/>
+                <w:u w:val="single"/>
+              </w:rPr>
+              <w:t>Студентка під час проходження переддипломної практики продемонструвала</w:t>
+            </w:r>
+            <w:r>
+              <w:rPr>
+                <w:rFonts w:ascii="Times New Roman" w:eastAsia="Times New Roman" w:hAnsi="Times New Roman"/>
+                <w:bCs/>
+                <w:sz w:val="20"/>
+                <w:szCs w:val="20"/>
+                <w:lang w:eastAsia="ru-RU"/>
+              </w:rPr>
+              <w:t>_____</w:t>
+            </w:r>
+            <w:r>
+              <w:rPr>
+                <w:rFonts w:ascii="Times New Roman" w:hAnsi="Times New Roman"/>
+                <w:sz w:val="20"/>
+                <w:szCs w:val="20"/>
+                <w:u w:val="single"/>
+              </w:rPr>
+              <w:t xml:space="preserve"> високий рівень професійної підготовки, самостійність та відповідальність під час</w:t>
+            </w:r>
+            <w:r>
+              <w:rPr>
+                <w:rFonts w:ascii="Times New Roman" w:eastAsia="Times New Roman" w:hAnsi="Times New Roman"/>
+                <w:bCs/>
+                <w:sz w:val="20"/>
+                <w:szCs w:val="20"/>
+                <w:lang w:eastAsia="ru-RU"/>
+              </w:rPr>
+              <w:t>_</w:t>
+            </w:r>
+            <w:r>
+              <w:rPr>
+                <w:rFonts w:ascii="Times New Roman" w:eastAsia="Times New Roman" w:hAnsi="Times New Roman"/>
+                <w:bCs/>
+                <w:sz w:val="20"/>
+                <w:szCs w:val="20"/>
+                <w:lang w:eastAsia="ru-RU"/>
+              </w:rPr>
+              <w:t>_</w:t>
+            </w:r>
+            <w:r>
+              <w:rPr>
+                <w:rFonts w:ascii="Times New Roman" w:eastAsia="Times New Roman" w:hAnsi="Times New Roman"/>
+                <w:bCs/>
+                <w:sz w:val="20"/>
+                <w:szCs w:val="20"/>
+                <w:lang w:eastAsia="ru-RU"/>
+              </w:rPr>
+              <w:t xml:space="preserve"> </w:t>
+            </w:r>
+            <w:r>
+              <w:rPr>
+                <w:rFonts w:ascii="Times New Roman" w:hAnsi="Times New Roman"/>
+                <w:sz w:val="20"/>
+                <w:szCs w:val="20"/>
+                <w:u w:val="single"/>
+              </w:rPr>
+              <w:t>виконання поставлених завдань. Провела аналіз існуючих рішень, дослідила</w:t>
+            </w:r>
+            <w:r>
+              <w:rPr>
+                <w:rFonts w:ascii="Times New Roman" w:eastAsia="Times New Roman" w:hAnsi="Times New Roman"/>
+                <w:bCs/>
+                <w:sz w:val="20"/>
+                <w:szCs w:val="20"/>
+                <w:lang w:eastAsia="ru-RU"/>
+              </w:rPr>
+              <w:t>______</w:t>
+            </w:r>
+            <w:r>
+              <w:rPr>
+                <w:rFonts w:ascii="Times New Roman" w:hAnsi="Times New Roman"/>
+                <w:sz w:val="20"/>
+                <w:szCs w:val="20"/>
+                <w:u w:val="single"/>
+              </w:rPr>
+              <w:t xml:space="preserve"> методи штучного інтелекту та розробила систему автоматизованого виявлення</w:t>
+            </w:r>
+            <w:r>
+              <w:rPr>
+                <w:rFonts w:ascii="Times New Roman" w:eastAsia="Times New Roman" w:hAnsi="Times New Roman"/>
+                <w:bCs/>
+                <w:sz w:val="20"/>
+                <w:szCs w:val="20"/>
+                <w:lang w:eastAsia="ru-RU"/>
+              </w:rPr>
+              <w:t>___</w:t>
+            </w:r>
+            <w:r>
+              <w:rPr>
+                <w:rFonts w:ascii="Times New Roman" w:eastAsia="Times New Roman" w:hAnsi="Times New Roman"/>
+                <w:bCs/>
+                <w:sz w:val="20"/>
+                <w:szCs w:val="20"/>
+                <w:lang w:eastAsia="ru-RU"/>
+              </w:rPr>
+              <w:t>_</w:t>
+            </w:r>
+            <w:r>
+              <w:rPr>
+                <w:rFonts w:ascii="Times New Roman" w:hAnsi="Times New Roman"/>
+                <w:sz w:val="20"/>
+                <w:szCs w:val="20"/>
+                <w:u w:val="single"/>
+              </w:rPr>
+              <w:t xml:space="preserve"> дефектів фасадів будівель. У повному обсязі виконала програму практики.</w:t>
+            </w:r>
+            <w:r>
+              <w:rPr>
+                <w:rFonts w:ascii="Times New Roman" w:eastAsia="Times New Roman" w:hAnsi="Times New Roman"/>
+                <w:bCs/>
+                <w:sz w:val="20"/>
+                <w:szCs w:val="20"/>
+                <w:lang w:eastAsia="ru-RU"/>
+              </w:rPr>
+              <w:t>_______</w:t>
+            </w:r>
+            <w:r>
+              <w:rPr>
+                <w:rFonts w:ascii="Times New Roman" w:eastAsia="Times New Roman" w:hAnsi="Times New Roman"/>
+                <w:bCs/>
+                <w:sz w:val="20"/>
+                <w:szCs w:val="20"/>
+                <w:lang w:eastAsia="ru-RU"/>
+              </w:rPr>
+              <w:br/>
+            </w:r>
+            <w:r>
+              <w:rPr>
+                <w:rFonts w:ascii="Times New Roman" w:hAnsi="Times New Roman"/>
+                <w:sz w:val="20"/>
+                <w:szCs w:val="20"/>
+                <w:u w:val="single"/>
+              </w:rPr>
+              <w:br/>
+              <w:t>Рекомендована оцінка “відмінно” (95 балів)</w:t>
+            </w:r>
+            <w:r>
+              <w:rPr>
+                <w:rFonts w:ascii="Times New Roman" w:hAnsi="Times New Roman"/>
+                <w:sz w:val="20"/>
+                <w:szCs w:val="20"/>
+              </w:rPr>
+              <w:br/>
+            </w:r>
+            <w:r>
+              <w:rPr>
+                <w:rFonts w:ascii="Times New Roman" w:hAnsi="Times New Roman"/>
+              </w:rPr>
+              <w:br/>
+            </w:r>
+            <w:r>
+              <w:rPr>
+                <w:rFonts w:ascii="Times New Roman" w:hAnsi="Times New Roman"/>
+                <w:u w:val="single"/>
+              </w:rPr>
+              <w:t>Керівник практики від підприємства, організації, установи</w:t>
+            </w:r>
+            <w:r>
+              <w:rPr>
+                <w:rFonts w:ascii="Times New Roman" w:hAnsi="Times New Roman"/>
+                <w:u w:val="single"/>
+              </w:rPr>
+              <w:t xml:space="preserve">.   </w:t>
+            </w:r>
+            <w:r>
+              <w:rPr>
+                <w:rFonts w:ascii="Times New Roman" w:hAnsi="Times New Roman"/>
+                <w:sz w:val="16"/>
+                <w:szCs w:val="16"/>
+                <w:u w:val="single"/>
+              </w:rPr>
+              <w:t>КПІ ім. Ігоря</w:t>
+            </w:r>
+            <w:r>
+              <w:rPr>
+                <w:rFonts w:ascii="Times New Roman" w:eastAsia="Times New Roman" w:hAnsi="Times New Roman"/>
+                <w:bCs/>
+                <w:sz w:val="20"/>
+                <w:szCs w:val="20"/>
+                <w:lang w:eastAsia="ru-RU"/>
+              </w:rPr>
+              <w:t>______</w:t>
+            </w:r>
+            <w:r>
+              <w:rPr>
+                <w:rFonts w:ascii="Times New Roman" w:hAnsi="Times New Roman"/>
+                <w:sz w:val="16"/>
+                <w:szCs w:val="16"/>
+                <w:u w:val="single"/>
+              </w:rPr>
+              <w:t xml:space="preserve"> </w:t>
+            </w:r>
+            <w:r>
+              <w:rPr>
+                <w:rFonts w:ascii="Times New Roman" w:hAnsi="Times New Roman"/>
+                <w:sz w:val="16"/>
+                <w:szCs w:val="16"/>
+              </w:rPr>
+              <w:t>Сікорського,</w:t>
+            </w:r>
+            <w:r>
+              <w:rPr>
+                <w:rFonts w:ascii="Times New Roman" w:hAnsi="Times New Roman"/>
+                <w:sz w:val="16"/>
+                <w:szCs w:val="16"/>
+              </w:rPr>
+              <w:t xml:space="preserve"> </w:t>
+            </w:r>
+            <w:r>
+              <w:rPr>
+                <w:rFonts w:ascii="Times New Roman" w:hAnsi="Times New Roman"/>
+                <w:sz w:val="16"/>
+                <w:szCs w:val="16"/>
+              </w:rPr>
+              <w:t>ННЦ ІКТ «</w:t>
+            </w:r>
+            <w:proofErr w:type="spellStart"/>
+            <w:r>
+              <w:rPr>
+                <w:rFonts w:ascii="Times New Roman" w:hAnsi="Times New Roman"/>
+                <w:sz w:val="16"/>
+                <w:szCs w:val="16"/>
+              </w:rPr>
+              <w:t>Неткрекер</w:t>
+            </w:r>
+            <w:proofErr w:type="spellEnd"/>
+            <w:r>
+              <w:rPr>
+                <w:rFonts w:ascii="Times New Roman" w:hAnsi="Times New Roman"/>
+                <w:sz w:val="16"/>
+                <w:szCs w:val="16"/>
+              </w:rPr>
+              <w:t xml:space="preserve">» навчально-наукова лабораторія </w:t>
+            </w:r>
+            <w:proofErr w:type="spellStart"/>
+            <w:r>
+              <w:rPr>
+                <w:rFonts w:ascii="Times New Roman" w:hAnsi="Times New Roman"/>
+                <w:sz w:val="16"/>
+                <w:szCs w:val="16"/>
+              </w:rPr>
+              <w:t>проєктування</w:t>
+            </w:r>
+            <w:proofErr w:type="spellEnd"/>
+            <w:r>
+              <w:rPr>
+                <w:rFonts w:ascii="Times New Roman" w:hAnsi="Times New Roman"/>
+                <w:sz w:val="16"/>
+                <w:szCs w:val="16"/>
+              </w:rPr>
+              <w:t xml:space="preserve"> OSS-систем</w:t>
+            </w:r>
+            <w:r>
+              <w:rPr>
+                <w:rFonts w:ascii="Times New Roman" w:hAnsi="Times New Roman"/>
+                <w:sz w:val="16"/>
+                <w:szCs w:val="16"/>
+              </w:rPr>
+              <w:t xml:space="preserve">            </w:t>
+            </w:r>
+          </w:p>
+          <w:p>
+            <w:pPr>
               <w:tabs>
                 <w:tab w:val="left" w:pos="176"/>
                 <w:tab w:val="left" w:pos="7513"/>
               </w:tabs>
-              <w:spacing w:after="0" w:line="240" w:lineRule="auto"/>
+              <w:spacing w:after="0" w:line="192" w:lineRule="auto"/>
+              <w:ind w:left="322" w:right="270" w:hanging="176"/>
               <w:jc w:val="center"/>
               <w:rPr>
-                <w:rFonts w:ascii="Times New Roman" w:eastAsia="Times New Roman" w:hAnsi="Times New Roman"/>
-                <w:b/>
-                <w:sz w:val="20"/>
-                <w:szCs w:val="20"/>
-                <w:lang w:eastAsia="ru-RU"/>
-              </w:rPr>
-            </w:pPr>
-          </w:p>
-          <w:p>
-            <w:pPr>
-              <w:pBdr>
-                <w:bottom w:val="single" w:sz="12" w:space="1" w:color="auto"/>
-                <w:between w:val="single" w:sz="12" w:space="1" w:color="auto"/>
-              </w:pBdr>
-              <w:tabs>
-                <w:tab w:val="left" w:pos="176"/>
-                <w:tab w:val="left" w:pos="7513"/>
-              </w:tabs>
-              <w:spacing w:after="0" w:line="240" w:lineRule="auto"/>
-              <w:jc w:val="both"/>
-              <w:rPr>
-                <w:rFonts w:ascii="Times New Roman" w:eastAsia="Times New Roman" w:hAnsi="Times New Roman"/>
-                <w:b/>
-                <w:sz w:val="20"/>
-                <w:szCs w:val="20"/>
-                <w:lang w:eastAsia="ru-RU"/>
-              </w:rPr>
-            </w:pPr>
-          </w:p>
-          <w:p>
-            <w:pPr>
-              <w:pBdr>
-                <w:bottom w:val="single" w:sz="4" w:space="1" w:color="auto"/>
-                <w:between w:val="single" w:sz="12" w:space="1" w:color="auto"/>
-              </w:pBdr>
-              <w:tabs>
-                <w:tab w:val="left" w:pos="176"/>
-                <w:tab w:val="left" w:pos="7513"/>
-              </w:tabs>
-              <w:spacing w:after="0" w:line="240" w:lineRule="auto"/>
-              <w:jc w:val="both"/>
-              <w:rPr>
-                <w:rFonts w:ascii="Times New Roman" w:eastAsia="Times New Roman" w:hAnsi="Times New Roman"/>
-                <w:b/>
-                <w:sz w:val="20"/>
-                <w:szCs w:val="20"/>
-                <w:lang w:val="ru-RU" w:eastAsia="ru-RU"/>
-              </w:rPr>
-            </w:pPr>
-          </w:p>
-          <w:p>
-            <w:pPr>
-              <w:pStyle w:val="NormalWeb"/>
-              <w:spacing w:before="0" w:beforeAutospacing="0" w:after="0" w:afterAutospacing="0" w:line="240" w:lineRule="auto"/>
-              <w:rPr>
-                <w:rFonts w:ascii="Times New Roman" w:hAnsi="Times New Roman"/>
-              </w:rPr>
-            </w:pPr>
-            <w:r>
-              <w:rPr>
-                <w:rFonts w:ascii="Times New Roman" w:hAnsi="Times New Roman"/>
-              </w:rPr>
-              <w:t>__________________________________________________________________________________________________________________________________________________________________________________________________________________________________________________________________________________________________________________________________________________________________________________________________________________________________________</w:t>
-            </w:r>
-          </w:p>
-          <w:p>
-            <w:pPr>
-              <w:pStyle w:val="NormalWeb"/>
-              <w:spacing w:before="120" w:beforeAutospacing="0" w:after="0" w:afterAutospacing="0" w:line="240" w:lineRule="auto"/>
-              <w:ind w:left="284"/>
-              <w:rPr>
-                <w:lang w:val="uk-UA"/>
-              </w:rPr>
-            </w:pPr>
-            <w:r>
-              <w:rPr>
-                <w:rFonts w:ascii="Times New Roman" w:hAnsi="Times New Roman"/>
-                <w:lang w:val="uk-UA"/>
-              </w:rPr>
-              <w:t xml:space="preserve">Керівник практики </w:t>
-            </w:r>
-            <w:proofErr w:type="spellStart"/>
-            <w:r>
-              <w:rPr>
-                <w:rFonts w:ascii="Times New Roman" w:hAnsi="Times New Roman"/>
-              </w:rPr>
-              <w:t>від</w:t>
-            </w:r>
-            <w:proofErr w:type="spellEnd"/>
-            <w:r>
-              <w:rPr>
-                <w:rFonts w:ascii="Times New Roman" w:hAnsi="Times New Roman"/>
-              </w:rPr>
-              <w:t xml:space="preserve"> </w:t>
-            </w:r>
-            <w:proofErr w:type="spellStart"/>
-            <w:r>
-              <w:rPr>
-                <w:rFonts w:ascii="Times New Roman" w:hAnsi="Times New Roman"/>
-              </w:rPr>
-              <w:t>підприємства</w:t>
-            </w:r>
-            <w:proofErr w:type="spellEnd"/>
-            <w:r>
-              <w:rPr>
-                <w:rFonts w:ascii="Times New Roman" w:hAnsi="Times New Roman"/>
-              </w:rPr>
-              <w:t xml:space="preserve">, </w:t>
-            </w:r>
-            <w:proofErr w:type="spellStart"/>
-            <w:r>
-              <w:rPr>
-                <w:rFonts w:ascii="Times New Roman" w:hAnsi="Times New Roman"/>
-              </w:rPr>
-              <w:t>організації</w:t>
-            </w:r>
-            <w:proofErr w:type="spellEnd"/>
-            <w:r>
-              <w:rPr>
-                <w:rFonts w:ascii="Times New Roman" w:hAnsi="Times New Roman"/>
-              </w:rPr>
-              <w:t>, установи</w:t>
-            </w:r>
-            <w:r>
-              <w:t xml:space="preserve"> </w:t>
-            </w:r>
-            <w:r>
-              <w:rPr>
-                <w:sz w:val="2"/>
-                <w:szCs w:val="2"/>
-                <w:u w:val="single"/>
-                <w:lang w:val="uk-UA"/>
-              </w:rPr>
-              <w:t>.</w:t>
-            </w:r>
-            <w:r>
-              <w:rPr>
-                <w:u w:val="single"/>
-                <w:lang w:val="uk-UA"/>
-              </w:rPr>
-              <w:t xml:space="preserve">                                 </w:t>
-            </w:r>
-            <w:r>
-              <w:rPr>
-                <w:sz w:val="2"/>
-                <w:szCs w:val="2"/>
-                <w:u w:val="single"/>
-                <w:lang w:val="uk-UA"/>
-              </w:rPr>
-              <w:t>.</w:t>
-            </w:r>
-          </w:p>
-          <w:p>
-            <w:pPr>
-              <w:pStyle w:val="NormalWeb"/>
-              <w:spacing w:before="120" w:beforeAutospacing="0" w:after="0" w:afterAutospacing="0" w:line="240" w:lineRule="auto"/>
-              <w:ind w:left="284"/>
-              <w:rPr>
-                <w:lang w:val="uk-UA"/>
-              </w:rPr>
-            </w:pPr>
-            <w:r>
-              <w:rPr>
-                <w:lang w:val="uk-UA"/>
-              </w:rPr>
-              <w:t>_______________________________________________________________</w:t>
+                <w:rFonts w:ascii="Times New Roman" w:hAnsi="Times New Roman"/>
+                <w:sz w:val="16"/>
+                <w:szCs w:val="16"/>
+              </w:rPr>
+            </w:pPr>
+            <w:r>
+              <w:rPr>
+                <w:rFonts w:ascii="Times New Roman" w:hAnsi="Times New Roman"/>
+                <w:sz w:val="16"/>
+                <w:szCs w:val="16"/>
+              </w:rPr>
+              <w:t>(</w:t>
+            </w:r>
+            <w:r>
+              <w:rPr>
+                <w:rFonts w:ascii="Times New Roman" w:hAnsi="Times New Roman"/>
+                <w:sz w:val="16"/>
+                <w:szCs w:val="16"/>
+              </w:rPr>
+              <w:t>найменування підприємства, організації, установи</w:t>
+            </w:r>
+            <w:r>
+              <w:rPr>
+                <w:rFonts w:ascii="Times New Roman" w:hAnsi="Times New Roman"/>
+                <w:sz w:val="16"/>
+                <w:szCs w:val="16"/>
+              </w:rPr>
+              <w:t>)</w:t>
             </w:r>
           </w:p>
           <w:p>
@@ -350,31 +450,6 @@
                 <w:lang w:eastAsia="ru-RU"/>
               </w:rPr>
             </w:pPr>
-            <w:r>
-              <w:rPr>
-                <w:rFonts w:ascii="Times New Roman" w:hAnsi="Times New Roman"/>
-                <w:sz w:val="16"/>
-                <w:szCs w:val="16"/>
-              </w:rPr>
-              <w:t>(</w:t>
-            </w:r>
-            <w:r>
-              <w:rPr>
-                <w:rFonts w:ascii="Times New Roman" w:hAnsi="Times New Roman"/>
-                <w:sz w:val="16"/>
-                <w:szCs w:val="16"/>
-                <w:highlight w:val="yellow"/>
-              </w:rPr>
-              <w:t>найменування підприємства, організації, установи</w:t>
-            </w:r>
-            <w:r>
-              <w:rPr>
-                <w:rFonts w:ascii="Times New Roman" w:hAnsi="Times New Roman"/>
-                <w:sz w:val="16"/>
-                <w:szCs w:val="16"/>
-              </w:rPr>
-              <w:t>)</w:t>
-            </w:r>
           </w:p>
           <w:p>
             <w:pPr>
@@ -391,7 +466,22 @@
                 <w:rFonts w:ascii="Times New Roman" w:hAnsi="Times New Roman"/>
                 <w:lang w:val="uk-UA"/>
               </w:rPr>
-              <w:t>_____________________                  _____________________</w:t>
+              <w:t>_____________________                  ______</w:t>
+            </w:r>
+            <w:r>
+              <w:rPr>
+                <w:rFonts w:ascii="Times New Roman" w:hAnsi="Times New Roman"/>
+                <w:u w:val="single"/>
+                <w:lang w:val="uk-UA"/>
+              </w:rPr>
+              <w:t>Роман БЕЛОУС</w:t>
+            </w:r>
+            <w:r>
+              <w:rPr>
+                <w:rFonts w:ascii="Times New Roman" w:hAnsi="Times New Roman"/>
+                <w:lang w:val="uk-UA"/>
+              </w:rPr>
+              <w:t>______</w:t>
             </w:r>
           </w:p>
           <w:p>
@@ -399,7 +489,6 @@
               <w:pStyle w:val="NormalWeb"/>
               <w:spacing w:before="0" w:beforeAutospacing="0" w:after="0" w:afterAutospacing="0" w:line="192" w:lineRule="auto"/>
               <w:ind w:left="284"/>
-              <w:jc w:val="center"/>
               <w:rPr>
                 <w:rFonts w:ascii="Times New Roman" w:hAnsi="Times New Roman"/>
                 <w:sz w:val="16"/>
@@ -414,6 +503,15 @@
                 <w:szCs w:val="16"/>
                 <w:lang w:val="uk-UA"/>
               </w:rPr>
+              <w:t xml:space="preserve">                               </w:t>
+            </w:r>
+            <w:r>
+              <w:rPr>
+                <w:rFonts w:ascii="Times New Roman" w:hAnsi="Times New Roman"/>
+                <w:sz w:val="16"/>
+                <w:szCs w:val="16"/>
+                <w:lang w:val="uk-UA"/>
+              </w:rPr>
               <w:t>(</w:t>
             </w:r>
             <w:r>
@@ -421,7 +519,6 @@
                 <w:rFonts w:ascii="Times New Roman" w:hAnsi="Times New Roman"/>
                 <w:sz w:val="16"/>
                 <w:szCs w:val="16"/>
-                <w:highlight w:val="yellow"/>
                 <w:lang w:val="uk-UA"/>
               </w:rPr>
               <w:t>підпис</w:t>
@@ -433,7 +530,7 @@
                 <w:szCs w:val="16"/>
                 <w:lang w:val="uk-UA"/>
               </w:rPr>
-              <w:t xml:space="preserve">)         </w:t>
+              <w:t xml:space="preserve">)    </w:t>
             </w:r>
             <w:r>
               <w:rPr>
@@ -442,6 +539,24 @@
                 <w:szCs w:val="16"/>
                 <w:lang w:val="uk-UA"/>
               </w:rPr>
+              <w:t xml:space="preserve">    </w:t>
+            </w:r>
+            <w:r>
+              <w:rPr>
+                <w:rFonts w:ascii="Times New Roman" w:hAnsi="Times New Roman"/>
+                <w:sz w:val="16"/>
+                <w:szCs w:val="16"/>
+                <w:lang w:val="uk-UA"/>
+              </w:rPr>
+              <w:t xml:space="preserve">     </w:t>
+            </w:r>
+            <w:r>
+              <w:rPr>
+                <w:rFonts w:ascii="Times New Roman" w:hAnsi="Times New Roman"/>
+                <w:sz w:val="16"/>
+                <w:szCs w:val="16"/>
+                <w:lang w:val="uk-UA"/>
+              </w:rPr>
               <w:t xml:space="preserve">        </w:t>
             </w:r>
             <w:r>
@@ -451,7 +566,7 @@
                 <w:szCs w:val="16"/>
                 <w:lang w:val="uk-UA"/>
               </w:rPr>
-              <w:t xml:space="preserve">                             </w:t>
+              <w:t xml:space="preserve">                          </w:t>
             </w:r>
             <w:r>
               <w:rPr>
@@ -460,17 +575,45 @@
                 <w:szCs w:val="16"/>
                 <w:lang w:val="uk-UA"/>
               </w:rPr>
+              <w:t xml:space="preserve">              </w:t>
+            </w:r>
+            <w:r>
+              <w:rPr>
+                <w:rFonts w:ascii="Times New Roman" w:hAnsi="Times New Roman"/>
+                <w:sz w:val="16"/>
+                <w:szCs w:val="16"/>
+                <w:lang w:val="uk-UA"/>
+              </w:rPr>
+              <w:t xml:space="preserve"> </w:t>
+            </w:r>
+            <w:r>
+              <w:rPr>
+                <w:rFonts w:ascii="Times New Roman" w:hAnsi="Times New Roman"/>
+                <w:sz w:val="16"/>
+                <w:szCs w:val="16"/>
+                <w:lang w:val="uk-UA"/>
+              </w:rPr>
               <w:t>(</w:t>
             </w:r>
-            <w:r>
-              <w:rPr>
-                <w:rFonts w:ascii="Times New Roman" w:hAnsi="Times New Roman"/>
-                <w:sz w:val="16"/>
-                <w:szCs w:val="16"/>
-                <w:highlight w:val="yellow"/>
+            <w:proofErr w:type="spellStart"/>
+            <w:r>
+              <w:rPr>
+                <w:rFonts w:ascii="Times New Roman" w:hAnsi="Times New Roman"/>
+                <w:sz w:val="16"/>
+                <w:szCs w:val="16"/>
                 <w:lang w:val="uk-UA"/>
               </w:rPr>
-              <w:t>Ім'я ПРІЗВИЩЕ</w:t>
+              <w:t>Імʼя</w:t>
+            </w:r>
+            <w:proofErr w:type="spellEnd"/>
+            <w:r>
+              <w:rPr>
+                <w:rFonts w:ascii="Times New Roman" w:hAnsi="Times New Roman"/>
+                <w:sz w:val="16"/>
+                <w:szCs w:val="16"/>
+                <w:lang w:val="uk-UA"/>
+              </w:rPr>
+              <w:t xml:space="preserve"> ПРІЗВИЩЕ</w:t>
             </w:r>
             <w:r>
               <w:rPr>
@@ -505,7 +648,22 @@
                 <w:rFonts w:ascii="Times New Roman" w:hAnsi="Times New Roman"/>
                 <w:lang w:val="uk-UA"/>
               </w:rPr>
-              <w:t>___</w:t>
+              <w:t>_</w:t>
+            </w:r>
+            <w:r>
+              <w:rPr>
+                <w:rFonts w:ascii="Times New Roman" w:hAnsi="Times New Roman"/>
+                <w:u w:val="single"/>
+                <w:lang w:val="uk-UA"/>
+              </w:rPr>
+              <w:t>15</w:t>
+            </w:r>
+            <w:r>
+              <w:rPr>
+                <w:rFonts w:ascii="Times New Roman" w:hAnsi="Times New Roman"/>
+                <w:lang w:val="uk-UA"/>
+              </w:rPr>
+              <w:t>_</w:t>
             </w:r>
             <w:r>
               <w:rPr>
@@ -603,74 +761,39 @@
                 <w:tab w:val="left" w:pos="176"/>
                 <w:tab w:val="left" w:pos="7513"/>
               </w:tabs>
-              <w:spacing w:after="0" w:line="240" w:lineRule="auto"/>
+              <w:spacing w:after="0"/>
+              <w:ind w:left="322" w:right="270"/>
               <w:jc w:val="both"/>
               <w:rPr>
                 <w:rFonts w:ascii="Times New Roman" w:eastAsia="Times New Roman" w:hAnsi="Times New Roman"/>
-                <w:b/>
-                <w:sz w:val="20"/>
-                <w:szCs w:val="20"/>
-                <w:lang w:eastAsia="ru-RU"/>
-              </w:rPr>
-            </w:pPr>
-            <w:r>
-              <w:rPr>
-                <w:rFonts w:ascii="Times New Roman" w:eastAsia="Times New Roman" w:hAnsi="Times New Roman"/>
-                <w:b/>
-                <w:sz w:val="20"/>
-                <w:szCs w:val="20"/>
+                <w:bCs/>
+                <w:sz w:val="20"/>
+                <w:szCs w:val="20"/>
+                <w:u w:val="single"/>
+                <w:lang w:eastAsia="ru-RU"/>
+              </w:rPr>
+            </w:pPr>
+            <w:r>
+              <w:rPr>
+                <w:rFonts w:ascii="Times New Roman" w:eastAsia="Times New Roman" w:hAnsi="Times New Roman"/>
+                <w:bCs/>
+                <w:sz w:val="20"/>
+                <w:szCs w:val="20"/>
+                <w:u w:val="single"/>
+                <w:lang w:eastAsia="ru-RU"/>
+              </w:rPr>
+              <w:t xml:space="preserve">     </w:t>
+            </w:r>
+            <w:r>
+              <w:rPr>
+                <w:rFonts w:ascii="Times New Roman" w:eastAsia="Times New Roman" w:hAnsi="Times New Roman"/>
+                <w:bCs/>
+                <w:sz w:val="20"/>
+                <w:szCs w:val="20"/>
+                <w:u w:val="single"/>
                 <w:lang w:val="ru-RU" w:eastAsia="ru-RU"/>
               </w:rPr>
-              <w:t xml:space="preserve">     </w:t>
-            </w:r>
-            <w:r>
-              <w:rPr>
-                <w:rFonts w:ascii="Times New Roman" w:eastAsia="Times New Roman" w:hAnsi="Times New Roman"/>
-                <w:b/>
-                <w:sz w:val="20"/>
-                <w:szCs w:val="20"/>
-                <w:lang w:eastAsia="ru-RU"/>
-              </w:rPr>
-              <w:t>________________________________________________________________________</w:t>
-            </w:r>
-          </w:p>
-          <w:p>
-            <w:pPr>
-              <w:tabs>
-                <w:tab w:val="left" w:pos="176"/>
-                <w:tab w:val="left" w:pos="7513"/>
-              </w:tabs>
-              <w:spacing w:after="0" w:line="240" w:lineRule="auto"/>
-              <w:ind w:left="284"/>
-              <w:rPr>
-                <w:rFonts w:ascii="Times New Roman" w:eastAsia="Times New Roman" w:hAnsi="Times New Roman"/>
-                <w:b/>
-                <w:sz w:val="20"/>
-                <w:szCs w:val="20"/>
-                <w:lang w:eastAsia="ru-RU"/>
-              </w:rPr>
-            </w:pPr>
-            <w:r>
-              <w:rPr>
-                <w:rFonts w:ascii="Times New Roman" w:eastAsia="Times New Roman" w:hAnsi="Times New Roman"/>
-                <w:b/>
-                <w:sz w:val="20"/>
-                <w:szCs w:val="20"/>
-                <w:lang w:eastAsia="ru-RU"/>
-              </w:rPr>
-              <w:t>__</w:t>
-            </w:r>
-            <w:r>
-              <w:rPr>
-                <w:rFonts w:ascii="Times New Roman" w:eastAsia="Times New Roman" w:hAnsi="Times New Roman"/>
-                <w:bCs/>
-                <w:sz w:val="20"/>
-                <w:szCs w:val="20"/>
-                <w:highlight w:val="yellow"/>
-                <w:u w:val="single"/>
-                <w:lang w:eastAsia="ru-RU"/>
-              </w:rPr>
-              <w:t xml:space="preserve">Відгук керівника магістерської </w:t>
+              <w:t xml:space="preserve">Студентка </w:t>
             </w:r>
             <w:proofErr w:type="spellStart"/>
             <w:r>
@@ -679,11 +802,10 @@
                 <w:bCs/>
                 <w:sz w:val="20"/>
                 <w:szCs w:val="20"/>
-                <w:highlight w:val="yellow"/>
-                <w:u w:val="single"/>
-                <w:lang w:eastAsia="ru-RU"/>
-              </w:rPr>
-              <w:t>дисертаці</w:t>
+                <w:u w:val="single"/>
+                <w:lang w:val="ru-RU" w:eastAsia="ru-RU"/>
+              </w:rPr>
+              <w:t>під</w:t>
             </w:r>
             <w:proofErr w:type="spellEnd"/>
             <w:r>
@@ -692,72 +814,739 @@
                 <w:bCs/>
                 <w:sz w:val="20"/>
                 <w:szCs w:val="20"/>
-                <w:highlight w:val="yellow"/>
-                <w:u w:val="single"/>
-                <w:lang w:eastAsia="ru-RU"/>
-              </w:rPr>
-              <w:t xml:space="preserve"> та рекомендована оцінка</w:t>
-            </w:r>
-            <w:r>
-              <w:rPr>
-                <w:rFonts w:ascii="Times New Roman" w:eastAsia="Times New Roman" w:hAnsi="Times New Roman"/>
-                <w:bCs/>
-                <w:sz w:val="20"/>
-                <w:szCs w:val="20"/>
-                <w:highlight w:val="yellow"/>
-                <w:u w:val="single"/>
-                <w:lang w:eastAsia="ru-RU"/>
-              </w:rPr>
-              <w:t>ї</w:t>
-            </w:r>
-            <w:r>
-              <w:rPr>
-                <w:rFonts w:ascii="Times New Roman" w:eastAsia="Times New Roman" w:hAnsi="Times New Roman"/>
-                <w:bCs/>
-                <w:sz w:val="20"/>
-                <w:szCs w:val="20"/>
-                <w:u w:val="single"/>
-                <w:lang w:eastAsia="ru-RU"/>
-              </w:rPr>
-              <w:t>_________________________________________________________________</w:t>
-            </w:r>
-            <w:r>
-              <w:rPr>
-                <w:rFonts w:ascii="Times New Roman" w:eastAsia="Times New Roman" w:hAnsi="Times New Roman"/>
-                <w:b/>
-                <w:sz w:val="20"/>
-                <w:szCs w:val="20"/>
-                <w:lang w:eastAsia="ru-RU"/>
-              </w:rPr>
-              <w:t>____________________________________________________________________________</w:t>
-            </w:r>
-          </w:p>
-          <w:p>
-            <w:pPr>
-              <w:tabs>
-                <w:tab w:val="left" w:pos="176"/>
-                <w:tab w:val="left" w:pos="7513"/>
-              </w:tabs>
-              <w:spacing w:after="0" w:line="240" w:lineRule="auto"/>
-              <w:ind w:left="282"/>
-              <w:jc w:val="both"/>
-              <w:rPr>
-                <w:rFonts w:ascii="Times New Roman" w:eastAsia="Times New Roman" w:hAnsi="Times New Roman"/>
-                <w:b/>
-                <w:sz w:val="20"/>
-                <w:szCs w:val="20"/>
-                <w:lang w:eastAsia="ru-RU"/>
-              </w:rPr>
-            </w:pPr>
-            <w:r>
-              <w:rPr>
-                <w:rFonts w:ascii="Times New Roman" w:eastAsia="Times New Roman" w:hAnsi="Times New Roman"/>
-                <w:b/>
-                <w:sz w:val="20"/>
-                <w:szCs w:val="20"/>
-                <w:lang w:eastAsia="ru-RU"/>
-              </w:rPr>
-              <w:t>________________________________________________________________________</w:t>
+                <w:u w:val="single"/>
+                <w:lang w:val="ru-RU" w:eastAsia="ru-RU"/>
+              </w:rPr>
+              <w:t xml:space="preserve"> час </w:t>
+            </w:r>
+            <w:proofErr w:type="spellStart"/>
+            <w:r>
+              <w:rPr>
+                <w:rFonts w:ascii="Times New Roman" w:eastAsia="Times New Roman" w:hAnsi="Times New Roman"/>
+                <w:bCs/>
+                <w:sz w:val="20"/>
+                <w:szCs w:val="20"/>
+                <w:u w:val="single"/>
+                <w:lang w:val="ru-RU" w:eastAsia="ru-RU"/>
+              </w:rPr>
+              <w:t>проходження</w:t>
+            </w:r>
+            <w:proofErr w:type="spellEnd"/>
+            <w:r>
+              <w:rPr>
+                <w:rFonts w:ascii="Times New Roman" w:eastAsia="Times New Roman" w:hAnsi="Times New Roman"/>
+                <w:bCs/>
+                <w:sz w:val="20"/>
+                <w:szCs w:val="20"/>
+                <w:u w:val="single"/>
+                <w:lang w:val="ru-RU" w:eastAsia="ru-RU"/>
+              </w:rPr>
+              <w:t xml:space="preserve"> </w:t>
+            </w:r>
+            <w:proofErr w:type="spellStart"/>
+            <w:r>
+              <w:rPr>
+                <w:rFonts w:ascii="Times New Roman" w:eastAsia="Times New Roman" w:hAnsi="Times New Roman"/>
+                <w:bCs/>
+                <w:sz w:val="20"/>
+                <w:szCs w:val="20"/>
+                <w:u w:val="single"/>
+                <w:lang w:val="ru-RU" w:eastAsia="ru-RU"/>
+              </w:rPr>
+              <w:t>переддипломної</w:t>
+            </w:r>
+            <w:proofErr w:type="spellEnd"/>
+            <w:r>
+              <w:rPr>
+                <w:rFonts w:ascii="Times New Roman" w:eastAsia="Times New Roman" w:hAnsi="Times New Roman"/>
+                <w:bCs/>
+                <w:sz w:val="20"/>
+                <w:szCs w:val="20"/>
+                <w:u w:val="single"/>
+                <w:lang w:val="ru-RU" w:eastAsia="ru-RU"/>
+              </w:rPr>
+              <w:t xml:space="preserve"> практики </w:t>
+            </w:r>
+            <w:proofErr w:type="spellStart"/>
+            <w:r>
+              <w:rPr>
+                <w:rFonts w:ascii="Times New Roman" w:eastAsia="Times New Roman" w:hAnsi="Times New Roman"/>
+                <w:bCs/>
+                <w:sz w:val="20"/>
+                <w:szCs w:val="20"/>
+                <w:u w:val="single"/>
+                <w:lang w:val="ru-RU" w:eastAsia="ru-RU"/>
+              </w:rPr>
+              <w:t>продемонструвала</w:t>
+            </w:r>
+            <w:proofErr w:type="spellEnd"/>
+            <w:r>
+              <w:rPr>
+                <w:rFonts w:ascii="Times New Roman" w:eastAsia="Times New Roman" w:hAnsi="Times New Roman"/>
+                <w:bCs/>
+                <w:sz w:val="20"/>
+                <w:szCs w:val="20"/>
+                <w:u w:val="single"/>
+                <w:lang w:val="ru-RU" w:eastAsia="ru-RU"/>
+              </w:rPr>
+              <w:t xml:space="preserve"> </w:t>
+            </w:r>
+            <w:proofErr w:type="spellStart"/>
+            <w:r>
+              <w:rPr>
+                <w:rFonts w:ascii="Times New Roman" w:eastAsia="Times New Roman" w:hAnsi="Times New Roman"/>
+                <w:bCs/>
+                <w:sz w:val="20"/>
+                <w:szCs w:val="20"/>
+                <w:u w:val="single"/>
+                <w:lang w:val="ru-RU" w:eastAsia="ru-RU"/>
+              </w:rPr>
+              <w:t>високий</w:t>
+            </w:r>
+            <w:proofErr w:type="spellEnd"/>
+            <w:r>
+              <w:rPr>
+                <w:rFonts w:ascii="Times New Roman" w:eastAsia="Times New Roman" w:hAnsi="Times New Roman"/>
+                <w:bCs/>
+                <w:sz w:val="20"/>
+                <w:szCs w:val="20"/>
+                <w:u w:val="single"/>
+                <w:lang w:val="ru-RU" w:eastAsia="ru-RU"/>
+              </w:rPr>
+              <w:t xml:space="preserve"> </w:t>
+            </w:r>
+            <w:proofErr w:type="spellStart"/>
+            <w:r>
+              <w:rPr>
+                <w:rFonts w:ascii="Times New Roman" w:eastAsia="Times New Roman" w:hAnsi="Times New Roman"/>
+                <w:bCs/>
+                <w:sz w:val="20"/>
+                <w:szCs w:val="20"/>
+                <w:u w:val="single"/>
+                <w:lang w:val="ru-RU" w:eastAsia="ru-RU"/>
+              </w:rPr>
+              <w:t>рівень</w:t>
+            </w:r>
+            <w:proofErr w:type="spellEnd"/>
+            <w:r>
+              <w:rPr>
+                <w:rFonts w:ascii="Times New Roman" w:eastAsia="Times New Roman" w:hAnsi="Times New Roman"/>
+                <w:bCs/>
+                <w:sz w:val="20"/>
+                <w:szCs w:val="20"/>
+                <w:u w:val="single"/>
+                <w:lang w:val="ru-RU" w:eastAsia="ru-RU"/>
+              </w:rPr>
+              <w:t xml:space="preserve"> </w:t>
+            </w:r>
+            <w:proofErr w:type="spellStart"/>
+            <w:r>
+              <w:rPr>
+                <w:rFonts w:ascii="Times New Roman" w:eastAsia="Times New Roman" w:hAnsi="Times New Roman"/>
+                <w:bCs/>
+                <w:sz w:val="20"/>
+                <w:szCs w:val="20"/>
+                <w:u w:val="single"/>
+                <w:lang w:val="ru-RU" w:eastAsia="ru-RU"/>
+              </w:rPr>
+              <w:t>професійної</w:t>
+            </w:r>
+            <w:proofErr w:type="spellEnd"/>
+            <w:r>
+              <w:rPr>
+                <w:rFonts w:ascii="Times New Roman" w:eastAsia="Times New Roman" w:hAnsi="Times New Roman"/>
+                <w:bCs/>
+                <w:sz w:val="20"/>
+                <w:szCs w:val="20"/>
+                <w:u w:val="single"/>
+                <w:lang w:val="ru-RU" w:eastAsia="ru-RU"/>
+              </w:rPr>
+              <w:t xml:space="preserve"> </w:t>
+            </w:r>
+            <w:proofErr w:type="spellStart"/>
+            <w:r>
+              <w:rPr>
+                <w:rFonts w:ascii="Times New Roman" w:eastAsia="Times New Roman" w:hAnsi="Times New Roman"/>
+                <w:bCs/>
+                <w:sz w:val="20"/>
+                <w:szCs w:val="20"/>
+                <w:u w:val="single"/>
+                <w:lang w:val="ru-RU" w:eastAsia="ru-RU"/>
+              </w:rPr>
+              <w:t>підготовки</w:t>
+            </w:r>
+            <w:proofErr w:type="spellEnd"/>
+            <w:r>
+              <w:rPr>
+                <w:rFonts w:ascii="Times New Roman" w:eastAsia="Times New Roman" w:hAnsi="Times New Roman"/>
+                <w:bCs/>
+                <w:sz w:val="20"/>
+                <w:szCs w:val="20"/>
+                <w:u w:val="single"/>
+                <w:lang w:val="ru-RU" w:eastAsia="ru-RU"/>
+              </w:rPr>
+              <w:t xml:space="preserve">, </w:t>
+            </w:r>
+            <w:proofErr w:type="spellStart"/>
+            <w:r>
+              <w:rPr>
+                <w:rFonts w:ascii="Times New Roman" w:eastAsia="Times New Roman" w:hAnsi="Times New Roman"/>
+                <w:bCs/>
+                <w:sz w:val="20"/>
+                <w:szCs w:val="20"/>
+                <w:u w:val="single"/>
+                <w:lang w:val="ru-RU" w:eastAsia="ru-RU"/>
+              </w:rPr>
+              <w:t>самостійність</w:t>
+            </w:r>
+            <w:proofErr w:type="spellEnd"/>
+            <w:r>
+              <w:rPr>
+                <w:rFonts w:ascii="Times New Roman" w:eastAsia="Times New Roman" w:hAnsi="Times New Roman"/>
+                <w:bCs/>
+                <w:sz w:val="20"/>
+                <w:szCs w:val="20"/>
+                <w:u w:val="single"/>
+                <w:lang w:val="ru-RU" w:eastAsia="ru-RU"/>
+              </w:rPr>
+              <w:t xml:space="preserve"> та </w:t>
+            </w:r>
+            <w:proofErr w:type="spellStart"/>
+            <w:r>
+              <w:rPr>
+                <w:rFonts w:ascii="Times New Roman" w:eastAsia="Times New Roman" w:hAnsi="Times New Roman"/>
+                <w:bCs/>
+                <w:sz w:val="20"/>
+                <w:szCs w:val="20"/>
+                <w:u w:val="single"/>
+                <w:lang w:val="ru-RU" w:eastAsia="ru-RU"/>
+              </w:rPr>
+              <w:t>відповідальність</w:t>
+            </w:r>
+            <w:proofErr w:type="spellEnd"/>
+            <w:r>
+              <w:rPr>
+                <w:rFonts w:ascii="Times New Roman" w:eastAsia="Times New Roman" w:hAnsi="Times New Roman"/>
+                <w:bCs/>
+                <w:sz w:val="20"/>
+                <w:szCs w:val="20"/>
+                <w:u w:val="single"/>
+                <w:lang w:val="ru-RU" w:eastAsia="ru-RU"/>
+              </w:rPr>
+              <w:t xml:space="preserve"> </w:t>
+            </w:r>
+            <w:proofErr w:type="spellStart"/>
+            <w:r>
+              <w:rPr>
+                <w:rFonts w:ascii="Times New Roman" w:eastAsia="Times New Roman" w:hAnsi="Times New Roman"/>
+                <w:bCs/>
+                <w:sz w:val="20"/>
+                <w:szCs w:val="20"/>
+                <w:u w:val="single"/>
+                <w:lang w:val="ru-RU" w:eastAsia="ru-RU"/>
+              </w:rPr>
+              <w:t>під</w:t>
+            </w:r>
+            <w:proofErr w:type="spellEnd"/>
+            <w:r>
+              <w:rPr>
+                <w:rFonts w:ascii="Times New Roman" w:eastAsia="Times New Roman" w:hAnsi="Times New Roman"/>
+                <w:bCs/>
+                <w:sz w:val="20"/>
+                <w:szCs w:val="20"/>
+                <w:u w:val="single"/>
+                <w:lang w:val="ru-RU" w:eastAsia="ru-RU"/>
+              </w:rPr>
+              <w:t xml:space="preserve"> час </w:t>
+            </w:r>
+            <w:proofErr w:type="spellStart"/>
+            <w:r>
+              <w:rPr>
+                <w:rFonts w:ascii="Times New Roman" w:eastAsia="Times New Roman" w:hAnsi="Times New Roman"/>
+                <w:bCs/>
+                <w:sz w:val="20"/>
+                <w:szCs w:val="20"/>
+                <w:u w:val="single"/>
+                <w:lang w:val="ru-RU" w:eastAsia="ru-RU"/>
+              </w:rPr>
+              <w:t>виконання</w:t>
+            </w:r>
+            <w:proofErr w:type="spellEnd"/>
+            <w:r>
+              <w:rPr>
+                <w:rFonts w:ascii="Times New Roman" w:eastAsia="Times New Roman" w:hAnsi="Times New Roman"/>
+                <w:bCs/>
+                <w:sz w:val="20"/>
+                <w:szCs w:val="20"/>
+                <w:u w:val="single"/>
+                <w:lang w:val="ru-RU" w:eastAsia="ru-RU"/>
+              </w:rPr>
+              <w:t xml:space="preserve"> </w:t>
+            </w:r>
+            <w:proofErr w:type="spellStart"/>
+            <w:r>
+              <w:rPr>
+                <w:rFonts w:ascii="Times New Roman" w:eastAsia="Times New Roman" w:hAnsi="Times New Roman"/>
+                <w:bCs/>
+                <w:sz w:val="20"/>
+                <w:szCs w:val="20"/>
+                <w:u w:val="single"/>
+                <w:lang w:val="ru-RU" w:eastAsia="ru-RU"/>
+              </w:rPr>
+              <w:t>поставлених</w:t>
+            </w:r>
+            <w:proofErr w:type="spellEnd"/>
+            <w:r>
+              <w:rPr>
+                <w:rFonts w:ascii="Times New Roman" w:eastAsia="Times New Roman" w:hAnsi="Times New Roman"/>
+                <w:bCs/>
+                <w:sz w:val="20"/>
+                <w:szCs w:val="20"/>
+                <w:u w:val="single"/>
+                <w:lang w:val="ru-RU" w:eastAsia="ru-RU"/>
+              </w:rPr>
+              <w:t xml:space="preserve"> </w:t>
+            </w:r>
+            <w:proofErr w:type="spellStart"/>
+            <w:r>
+              <w:rPr>
+                <w:rFonts w:ascii="Times New Roman" w:eastAsia="Times New Roman" w:hAnsi="Times New Roman"/>
+                <w:bCs/>
+                <w:sz w:val="20"/>
+                <w:szCs w:val="20"/>
+                <w:u w:val="single"/>
+                <w:lang w:val="ru-RU" w:eastAsia="ru-RU"/>
+              </w:rPr>
+              <w:t>завдань</w:t>
+            </w:r>
+            <w:proofErr w:type="spellEnd"/>
+            <w:r>
+              <w:rPr>
+                <w:rFonts w:ascii="Times New Roman" w:eastAsia="Times New Roman" w:hAnsi="Times New Roman"/>
+                <w:bCs/>
+                <w:sz w:val="20"/>
+                <w:szCs w:val="20"/>
+                <w:u w:val="single"/>
+                <w:lang w:val="ru-RU" w:eastAsia="ru-RU"/>
+              </w:rPr>
+              <w:t xml:space="preserve">. Провела </w:t>
+            </w:r>
+            <w:proofErr w:type="spellStart"/>
+            <w:r>
+              <w:rPr>
+                <w:rFonts w:ascii="Times New Roman" w:eastAsia="Times New Roman" w:hAnsi="Times New Roman"/>
+                <w:bCs/>
+                <w:sz w:val="20"/>
+                <w:szCs w:val="20"/>
+                <w:u w:val="single"/>
+                <w:lang w:val="ru-RU" w:eastAsia="ru-RU"/>
+              </w:rPr>
+              <w:t>аналіз</w:t>
+            </w:r>
+            <w:proofErr w:type="spellEnd"/>
+            <w:r>
+              <w:rPr>
+                <w:rFonts w:ascii="Times New Roman" w:eastAsia="Times New Roman" w:hAnsi="Times New Roman"/>
+                <w:bCs/>
+                <w:sz w:val="20"/>
+                <w:szCs w:val="20"/>
+                <w:u w:val="single"/>
+                <w:lang w:val="ru-RU" w:eastAsia="ru-RU"/>
+              </w:rPr>
+              <w:t xml:space="preserve"> </w:t>
+            </w:r>
+            <w:proofErr w:type="spellStart"/>
+            <w:r>
+              <w:rPr>
+                <w:rFonts w:ascii="Times New Roman" w:eastAsia="Times New Roman" w:hAnsi="Times New Roman"/>
+                <w:bCs/>
+                <w:sz w:val="20"/>
+                <w:szCs w:val="20"/>
+                <w:u w:val="single"/>
+                <w:lang w:val="ru-RU" w:eastAsia="ru-RU"/>
+              </w:rPr>
+              <w:t>існуючих</w:t>
+            </w:r>
+            <w:proofErr w:type="spellEnd"/>
+            <w:r>
+              <w:rPr>
+                <w:rFonts w:ascii="Times New Roman" w:eastAsia="Times New Roman" w:hAnsi="Times New Roman"/>
+                <w:bCs/>
+                <w:sz w:val="20"/>
+                <w:szCs w:val="20"/>
+                <w:u w:val="single"/>
+                <w:lang w:val="ru-RU" w:eastAsia="ru-RU"/>
+              </w:rPr>
+              <w:t xml:space="preserve"> </w:t>
+            </w:r>
+            <w:proofErr w:type="spellStart"/>
+            <w:r>
+              <w:rPr>
+                <w:rFonts w:ascii="Times New Roman" w:eastAsia="Times New Roman" w:hAnsi="Times New Roman"/>
+                <w:bCs/>
+                <w:sz w:val="20"/>
+                <w:szCs w:val="20"/>
+                <w:u w:val="single"/>
+                <w:lang w:val="ru-RU" w:eastAsia="ru-RU"/>
+              </w:rPr>
+              <w:t>рішень</w:t>
+            </w:r>
+            <w:proofErr w:type="spellEnd"/>
+            <w:r>
+              <w:rPr>
+                <w:rFonts w:ascii="Times New Roman" w:eastAsia="Times New Roman" w:hAnsi="Times New Roman"/>
+                <w:bCs/>
+                <w:sz w:val="20"/>
+                <w:szCs w:val="20"/>
+                <w:u w:val="single"/>
+                <w:lang w:val="ru-RU" w:eastAsia="ru-RU"/>
+              </w:rPr>
+              <w:t xml:space="preserve">, </w:t>
+            </w:r>
+            <w:proofErr w:type="spellStart"/>
+            <w:r>
+              <w:rPr>
+                <w:rFonts w:ascii="Times New Roman" w:eastAsia="Times New Roman" w:hAnsi="Times New Roman"/>
+                <w:bCs/>
+                <w:sz w:val="20"/>
+                <w:szCs w:val="20"/>
+                <w:u w:val="single"/>
+                <w:lang w:val="ru-RU" w:eastAsia="ru-RU"/>
+              </w:rPr>
+              <w:t>дослідила</w:t>
+            </w:r>
+            <w:proofErr w:type="spellEnd"/>
+            <w:r>
+              <w:rPr>
+                <w:rFonts w:ascii="Times New Roman" w:eastAsia="Times New Roman" w:hAnsi="Times New Roman"/>
+                <w:bCs/>
+                <w:sz w:val="20"/>
+                <w:szCs w:val="20"/>
+                <w:u w:val="single"/>
+                <w:lang w:val="ru-RU" w:eastAsia="ru-RU"/>
+              </w:rPr>
+              <w:t xml:space="preserve"> </w:t>
+            </w:r>
+            <w:proofErr w:type="spellStart"/>
+            <w:r>
+              <w:rPr>
+                <w:rFonts w:ascii="Times New Roman" w:eastAsia="Times New Roman" w:hAnsi="Times New Roman"/>
+                <w:bCs/>
+                <w:sz w:val="20"/>
+                <w:szCs w:val="20"/>
+                <w:u w:val="single"/>
+                <w:lang w:val="ru-RU" w:eastAsia="ru-RU"/>
+              </w:rPr>
+              <w:t>методи</w:t>
+            </w:r>
+            <w:proofErr w:type="spellEnd"/>
+            <w:r>
+              <w:rPr>
+                <w:rFonts w:ascii="Times New Roman" w:eastAsia="Times New Roman" w:hAnsi="Times New Roman"/>
+                <w:bCs/>
+                <w:sz w:val="20"/>
+                <w:szCs w:val="20"/>
+                <w:u w:val="single"/>
+                <w:lang w:val="ru-RU" w:eastAsia="ru-RU"/>
+              </w:rPr>
+              <w:t xml:space="preserve"> штучного </w:t>
+            </w:r>
+            <w:proofErr w:type="spellStart"/>
+            <w:r>
+              <w:rPr>
+                <w:rFonts w:ascii="Times New Roman" w:eastAsia="Times New Roman" w:hAnsi="Times New Roman"/>
+                <w:bCs/>
+                <w:sz w:val="20"/>
+                <w:szCs w:val="20"/>
+                <w:u w:val="single"/>
+                <w:lang w:val="ru-RU" w:eastAsia="ru-RU"/>
+              </w:rPr>
+              <w:t>інтелекту</w:t>
+            </w:r>
+            <w:proofErr w:type="spellEnd"/>
+            <w:r>
+              <w:rPr>
+                <w:rFonts w:ascii="Times New Roman" w:eastAsia="Times New Roman" w:hAnsi="Times New Roman"/>
+                <w:bCs/>
+                <w:sz w:val="20"/>
+                <w:szCs w:val="20"/>
+                <w:u w:val="single"/>
+                <w:lang w:val="ru-RU" w:eastAsia="ru-RU"/>
+              </w:rPr>
+              <w:t xml:space="preserve"> та </w:t>
+            </w:r>
+            <w:proofErr w:type="spellStart"/>
+            <w:r>
+              <w:rPr>
+                <w:rFonts w:ascii="Times New Roman" w:eastAsia="Times New Roman" w:hAnsi="Times New Roman"/>
+                <w:bCs/>
+                <w:sz w:val="20"/>
+                <w:szCs w:val="20"/>
+                <w:u w:val="single"/>
+                <w:lang w:val="ru-RU" w:eastAsia="ru-RU"/>
+              </w:rPr>
+              <w:t>розробила</w:t>
+            </w:r>
+            <w:proofErr w:type="spellEnd"/>
+            <w:r>
+              <w:rPr>
+                <w:rFonts w:ascii="Times New Roman" w:eastAsia="Times New Roman" w:hAnsi="Times New Roman"/>
+                <w:bCs/>
+                <w:sz w:val="20"/>
+                <w:szCs w:val="20"/>
+                <w:u w:val="single"/>
+                <w:lang w:val="ru-RU" w:eastAsia="ru-RU"/>
+              </w:rPr>
+              <w:t xml:space="preserve"> систему </w:t>
+            </w:r>
+            <w:proofErr w:type="spellStart"/>
+            <w:r>
+              <w:rPr>
+                <w:rFonts w:ascii="Times New Roman" w:eastAsia="Times New Roman" w:hAnsi="Times New Roman"/>
+                <w:bCs/>
+                <w:sz w:val="20"/>
+                <w:szCs w:val="20"/>
+                <w:u w:val="single"/>
+                <w:lang w:val="ru-RU" w:eastAsia="ru-RU"/>
+              </w:rPr>
+              <w:t>автоматизованого</w:t>
+            </w:r>
+            <w:proofErr w:type="spellEnd"/>
+            <w:r>
+              <w:rPr>
+                <w:rFonts w:ascii="Times New Roman" w:eastAsia="Times New Roman" w:hAnsi="Times New Roman"/>
+                <w:bCs/>
+                <w:sz w:val="20"/>
+                <w:szCs w:val="20"/>
+                <w:u w:val="single"/>
+                <w:lang w:val="ru-RU" w:eastAsia="ru-RU"/>
+              </w:rPr>
+              <w:t xml:space="preserve"> </w:t>
+            </w:r>
+            <w:proofErr w:type="spellStart"/>
+            <w:r>
+              <w:rPr>
+                <w:rFonts w:ascii="Times New Roman" w:eastAsia="Times New Roman" w:hAnsi="Times New Roman"/>
+                <w:bCs/>
+                <w:sz w:val="20"/>
+                <w:szCs w:val="20"/>
+                <w:u w:val="single"/>
+                <w:lang w:val="ru-RU" w:eastAsia="ru-RU"/>
+              </w:rPr>
+              <w:t>виявлення</w:t>
+            </w:r>
+            <w:proofErr w:type="spellEnd"/>
+            <w:r>
+              <w:rPr>
+                <w:rFonts w:ascii="Times New Roman" w:eastAsia="Times New Roman" w:hAnsi="Times New Roman"/>
+                <w:bCs/>
+                <w:sz w:val="20"/>
+                <w:szCs w:val="20"/>
+                <w:u w:val="single"/>
+                <w:lang w:val="ru-RU" w:eastAsia="ru-RU"/>
+              </w:rPr>
+              <w:t xml:space="preserve"> </w:t>
+            </w:r>
+            <w:proofErr w:type="spellStart"/>
+            <w:r>
+              <w:rPr>
+                <w:rFonts w:ascii="Times New Roman" w:eastAsia="Times New Roman" w:hAnsi="Times New Roman"/>
+                <w:bCs/>
+                <w:sz w:val="20"/>
+                <w:szCs w:val="20"/>
+                <w:u w:val="single"/>
+                <w:lang w:val="ru-RU" w:eastAsia="ru-RU"/>
+              </w:rPr>
+              <w:t>дефектів</w:t>
+            </w:r>
+            <w:proofErr w:type="spellEnd"/>
+            <w:r>
+              <w:rPr>
+                <w:rFonts w:ascii="Times New Roman" w:eastAsia="Times New Roman" w:hAnsi="Times New Roman"/>
+                <w:bCs/>
+                <w:sz w:val="20"/>
+                <w:szCs w:val="20"/>
+                <w:u w:val="single"/>
+                <w:lang w:val="ru-RU" w:eastAsia="ru-RU"/>
+              </w:rPr>
+              <w:t xml:space="preserve"> </w:t>
+            </w:r>
+            <w:proofErr w:type="spellStart"/>
+            <w:r>
+              <w:rPr>
+                <w:rFonts w:ascii="Times New Roman" w:eastAsia="Times New Roman" w:hAnsi="Times New Roman"/>
+                <w:bCs/>
+                <w:sz w:val="20"/>
+                <w:szCs w:val="20"/>
+                <w:u w:val="single"/>
+                <w:lang w:val="ru-RU" w:eastAsia="ru-RU"/>
+              </w:rPr>
+              <w:t>фасадів</w:t>
+            </w:r>
+            <w:proofErr w:type="spellEnd"/>
+            <w:r>
+              <w:rPr>
+                <w:rFonts w:ascii="Times New Roman" w:eastAsia="Times New Roman" w:hAnsi="Times New Roman"/>
+                <w:bCs/>
+                <w:sz w:val="20"/>
+                <w:szCs w:val="20"/>
+                <w:u w:val="single"/>
+                <w:lang w:val="ru-RU" w:eastAsia="ru-RU"/>
+              </w:rPr>
+              <w:t xml:space="preserve"> </w:t>
+            </w:r>
+            <w:proofErr w:type="spellStart"/>
+            <w:r>
+              <w:rPr>
+                <w:rFonts w:ascii="Times New Roman" w:eastAsia="Times New Roman" w:hAnsi="Times New Roman"/>
+                <w:bCs/>
+                <w:sz w:val="20"/>
+                <w:szCs w:val="20"/>
+                <w:u w:val="single"/>
+                <w:lang w:val="ru-RU" w:eastAsia="ru-RU"/>
+              </w:rPr>
+              <w:t>будівель</w:t>
+            </w:r>
+            <w:proofErr w:type="spellEnd"/>
+            <w:r>
+              <w:rPr>
+                <w:rFonts w:ascii="Times New Roman" w:eastAsia="Times New Roman" w:hAnsi="Times New Roman"/>
+                <w:bCs/>
+                <w:sz w:val="20"/>
+                <w:szCs w:val="20"/>
+                <w:u w:val="single"/>
+                <w:lang w:val="ru-RU" w:eastAsia="ru-RU"/>
+              </w:rPr>
+              <w:t xml:space="preserve">. У </w:t>
+            </w:r>
+            <w:proofErr w:type="spellStart"/>
+            <w:r>
+              <w:rPr>
+                <w:rFonts w:ascii="Times New Roman" w:eastAsia="Times New Roman" w:hAnsi="Times New Roman"/>
+                <w:bCs/>
+                <w:sz w:val="20"/>
+                <w:szCs w:val="20"/>
+                <w:u w:val="single"/>
+                <w:lang w:val="ru-RU" w:eastAsia="ru-RU"/>
+              </w:rPr>
+              <w:t>повному</w:t>
+            </w:r>
+            <w:proofErr w:type="spellEnd"/>
+            <w:r>
+              <w:rPr>
+                <w:rFonts w:ascii="Times New Roman" w:eastAsia="Times New Roman" w:hAnsi="Times New Roman"/>
+                <w:bCs/>
+                <w:sz w:val="20"/>
+                <w:szCs w:val="20"/>
+                <w:u w:val="single"/>
+                <w:lang w:val="ru-RU" w:eastAsia="ru-RU"/>
+              </w:rPr>
+              <w:t xml:space="preserve"> </w:t>
+            </w:r>
+            <w:proofErr w:type="spellStart"/>
+            <w:r>
+              <w:rPr>
+                <w:rFonts w:ascii="Times New Roman" w:eastAsia="Times New Roman" w:hAnsi="Times New Roman"/>
+                <w:bCs/>
+                <w:sz w:val="20"/>
+                <w:szCs w:val="20"/>
+                <w:u w:val="single"/>
+                <w:lang w:val="ru-RU" w:eastAsia="ru-RU"/>
+              </w:rPr>
+              <w:t>обсязі</w:t>
+            </w:r>
+            <w:proofErr w:type="spellEnd"/>
+            <w:r>
+              <w:rPr>
+                <w:rFonts w:ascii="Times New Roman" w:eastAsia="Times New Roman" w:hAnsi="Times New Roman"/>
+                <w:bCs/>
+                <w:sz w:val="20"/>
+                <w:szCs w:val="20"/>
+                <w:u w:val="single"/>
+                <w:lang w:val="ru-RU" w:eastAsia="ru-RU"/>
+              </w:rPr>
+              <w:t xml:space="preserve"> </w:t>
+            </w:r>
+            <w:proofErr w:type="spellStart"/>
+            <w:r>
+              <w:rPr>
+                <w:rFonts w:ascii="Times New Roman" w:eastAsia="Times New Roman" w:hAnsi="Times New Roman"/>
+                <w:bCs/>
+                <w:sz w:val="20"/>
+                <w:szCs w:val="20"/>
+                <w:u w:val="single"/>
+                <w:lang w:val="ru-RU" w:eastAsia="ru-RU"/>
+              </w:rPr>
+              <w:t>виконала</w:t>
+            </w:r>
+            <w:proofErr w:type="spellEnd"/>
+            <w:r>
+              <w:rPr>
+                <w:rFonts w:ascii="Times New Roman" w:eastAsia="Times New Roman" w:hAnsi="Times New Roman"/>
+                <w:bCs/>
+                <w:sz w:val="20"/>
+                <w:szCs w:val="20"/>
+                <w:u w:val="single"/>
+                <w:lang w:val="ru-RU" w:eastAsia="ru-RU"/>
+              </w:rPr>
+              <w:t xml:space="preserve"> </w:t>
+            </w:r>
+            <w:proofErr w:type="spellStart"/>
+            <w:r>
+              <w:rPr>
+                <w:rFonts w:ascii="Times New Roman" w:eastAsia="Times New Roman" w:hAnsi="Times New Roman"/>
+                <w:bCs/>
+                <w:sz w:val="20"/>
+                <w:szCs w:val="20"/>
+                <w:u w:val="single"/>
+                <w:lang w:val="ru-RU" w:eastAsia="ru-RU"/>
+              </w:rPr>
+              <w:t>програму</w:t>
+            </w:r>
+            <w:proofErr w:type="spellEnd"/>
+            <w:r>
+              <w:rPr>
+                <w:rFonts w:ascii="Times New Roman" w:eastAsia="Times New Roman" w:hAnsi="Times New Roman"/>
+                <w:bCs/>
+                <w:sz w:val="20"/>
+                <w:szCs w:val="20"/>
+                <w:u w:val="single"/>
+                <w:lang w:val="ru-RU" w:eastAsia="ru-RU"/>
+              </w:rPr>
+              <w:t xml:space="preserve"> </w:t>
+            </w:r>
+            <w:proofErr w:type="gramStart"/>
+            <w:r>
+              <w:rPr>
+                <w:rFonts w:ascii="Times New Roman" w:eastAsia="Times New Roman" w:hAnsi="Times New Roman"/>
+                <w:bCs/>
+                <w:sz w:val="20"/>
+                <w:szCs w:val="20"/>
+                <w:u w:val="single"/>
+                <w:lang w:val="ru-RU" w:eastAsia="ru-RU"/>
+              </w:rPr>
+              <w:t>практики.</w:t>
+            </w:r>
+            <w:r>
+              <w:rPr>
+                <w:rFonts w:ascii="Times New Roman" w:eastAsia="Times New Roman" w:hAnsi="Times New Roman"/>
+                <w:bCs/>
+                <w:sz w:val="20"/>
+                <w:szCs w:val="20"/>
+                <w:lang w:eastAsia="ru-RU"/>
+              </w:rPr>
+              <w:t>_</w:t>
+            </w:r>
+            <w:proofErr w:type="gramEnd"/>
+            <w:r>
+              <w:rPr>
+                <w:rFonts w:ascii="Times New Roman" w:eastAsia="Times New Roman" w:hAnsi="Times New Roman"/>
+                <w:bCs/>
+                <w:sz w:val="20"/>
+                <w:szCs w:val="20"/>
+                <w:lang w:eastAsia="ru-RU"/>
+              </w:rPr>
+              <w:t>________________</w:t>
             </w:r>
           </w:p>
           <w:p>
@@ -1350,18 +2139,24 @@
                 <w:tab w:val="left" w:pos="176"/>
                 <w:tab w:val="left" w:pos="7513"/>
               </w:tabs>
-              <w:spacing w:after="0" w:line="360" w:lineRule="auto"/>
-              <w:ind w:left="282"/>
-              <w:jc w:val="center"/>
-            </w:pPr>
-            <w:r>
-              <w:rPr>
-                <w:rFonts w:ascii="Times New Roman" w:eastAsia="Times New Roman" w:hAnsi="Times New Roman"/>
-                <w:sz w:val="16"/>
-                <w:szCs w:val="16"/>
-                <w:lang w:eastAsia="ru-RU"/>
-              </w:rPr>
-              <w:lastRenderedPageBreak/>
+              <w:spacing w:after="0" w:line="240" w:lineRule="auto"/>
+            </w:pPr>
+            <w:r>
+              <w:rPr>
+                <w:rFonts w:ascii="Times New Roman" w:eastAsia="Times New Roman" w:hAnsi="Times New Roman"/>
+                <w:sz w:val="16"/>
+                <w:szCs w:val="16"/>
+                <w:lang w:eastAsia="ru-RU"/>
+              </w:rPr>
+              <w:t xml:space="preserve">                                                                  </w:t>
+            </w:r>
+            <w:r>
+              <w:rPr>
+                <w:rFonts w:ascii="Times New Roman" w:eastAsia="Times New Roman" w:hAnsi="Times New Roman"/>
+                <w:sz w:val="16"/>
+                <w:szCs w:val="16"/>
+                <w:lang w:eastAsia="ru-RU"/>
+              </w:rPr>
               <w:t xml:space="preserve">                            </w:t>
             </w:r>
             <w:r>
@@ -1400,7 +2195,6 @@
                 <w:sz w:val="16"/>
                 <w:szCs w:val="16"/>
               </w:rPr>
-              <w:lastRenderedPageBreak/>
               <w:t>МІНІСТЕРСТВО ОСВІТИ І НАУКИ</w:t>
             </w:r>
             <w:r>
@@ -2267,7 +3061,7 @@
               <w:rPr>
                 <w:rFonts w:ascii="Times New Roman" w:hAnsi="Times New Roman"/>
               </w:rPr>
-              <w:t>___</w:t>
+              <w:t>__</w:t>
             </w:r>
           </w:p>
           <w:p>
@@ -3670,23 +4464,6 @@
                 <w:rFonts w:ascii="Times New Roman" w:hAnsi="Times New Roman"/>
                 <w:sz w:val="20"/>
                 <w:szCs w:val="20"/>
-                <w:u w:val="single"/>
-              </w:rPr>
-              <w:t xml:space="preserve">  </w:t>
-            </w:r>
-            <w:r>
-              <w:rPr>
-                <w:rFonts w:ascii="Times New Roman" w:hAnsi="Times New Roman"/>
-                <w:sz w:val="20"/>
-                <w:szCs w:val="20"/>
-              </w:rPr>
-              <w:t xml:space="preserve"> </w:t>
-            </w:r>
-            <w:r>
-              <w:rPr>
-                <w:rFonts w:ascii="Times New Roman" w:hAnsi="Times New Roman"/>
-                <w:sz w:val="20"/>
-                <w:szCs w:val="20"/>
               </w:rPr>
               <w:t>_</w:t>
             </w:r>
@@ -3695,47 +4472,36 @@
                 <w:rFonts w:ascii="Times New Roman" w:hAnsi="Times New Roman"/>
                 <w:sz w:val="20"/>
                 <w:szCs w:val="20"/>
-                <w:highlight w:val="yellow"/>
-                <w:u w:val="single"/>
-              </w:rPr>
-              <w:t>_____________</w:t>
-            </w:r>
-            <w:r>
-              <w:rPr>
-                <w:rFonts w:ascii="Times New Roman" w:hAnsi="Times New Roman"/>
-                <w:sz w:val="20"/>
-                <w:szCs w:val="20"/>
-                <w:highlight w:val="yellow"/>
-                <w:u w:val="single"/>
-              </w:rPr>
-              <w:t>ПІБ</w:t>
-            </w:r>
-            <w:r>
-              <w:rPr>
-                <w:rFonts w:ascii="Times New Roman" w:hAnsi="Times New Roman"/>
-                <w:sz w:val="20"/>
-                <w:szCs w:val="20"/>
-                <w:highlight w:val="yellow"/>
-                <w:u w:val="single"/>
-              </w:rPr>
-              <w:t>___________________</w:t>
-            </w:r>
-            <w:r>
-              <w:rPr>
-                <w:rFonts w:ascii="Times New Roman" w:hAnsi="Times New Roman"/>
-                <w:sz w:val="20"/>
-                <w:szCs w:val="20"/>
-                <w:highlight w:val="yellow"/>
               </w:rPr>
               <w:t>_</w:t>
             </w:r>
-            <w:r>
-              <w:rPr>
-                <w:rFonts w:ascii="Times New Roman" w:hAnsi="Times New Roman"/>
-                <w:sz w:val="20"/>
-                <w:szCs w:val="20"/>
-              </w:rPr>
-              <w:t>_______</w:t>
+            <w:proofErr w:type="spellStart"/>
+            <w:r>
+              <w:rPr>
+                <w:rFonts w:ascii="Times New Roman" w:hAnsi="Times New Roman"/>
+                <w:sz w:val="20"/>
+                <w:szCs w:val="20"/>
+                <w:u w:val="single"/>
+              </w:rPr>
+              <w:t>Букасов</w:t>
+            </w:r>
+            <w:proofErr w:type="spellEnd"/>
+            <w:r>
+              <w:rPr>
+                <w:rFonts w:ascii="Times New Roman" w:hAnsi="Times New Roman"/>
+                <w:sz w:val="20"/>
+                <w:szCs w:val="20"/>
+                <w:u w:val="single"/>
+              </w:rPr>
+              <w:t xml:space="preserve"> Максим Михайлович</w:t>
+            </w:r>
+            <w:r>
+              <w:rPr>
+                <w:rFonts w:ascii="Times New Roman" w:hAnsi="Times New Roman"/>
+                <w:sz w:val="20"/>
+                <w:szCs w:val="20"/>
+              </w:rPr>
+              <w:t>__</w:t>
             </w:r>
             <w:r>
               <w:rPr>
@@ -3806,7 +4572,6 @@
                 <w:rFonts w:ascii="Times New Roman" w:hAnsi="Times New Roman"/>
                 <w:sz w:val="20"/>
                 <w:szCs w:val="20"/>
-                <w:highlight w:val="yellow"/>
               </w:rPr>
               <w:t xml:space="preserve">М.П.         </w:t>
             </w:r>
@@ -3815,17 +4580,8 @@
                 <w:rFonts w:ascii="Times New Roman" w:hAnsi="Times New Roman"/>
                 <w:sz w:val="16"/>
                 <w:szCs w:val="16"/>
-                <w:highlight w:val="yellow"/>
-              </w:rPr>
-              <w:t xml:space="preserve">Підпис </w:t>
-            </w:r>
-            <w:r>
-              <w:rPr>
-                <w:rFonts w:ascii="Times New Roman" w:hAnsi="Times New Roman"/>
-                <w:sz w:val="16"/>
-                <w:szCs w:val="16"/>
-              </w:rPr>
-              <w:t xml:space="preserve">                                      </w:t>
+              </w:rPr>
+              <w:t xml:space="preserve">Підпис                                       </w:t>
             </w:r>
             <w:r>
               <w:rPr>
@@ -3848,7 +4604,6 @@
                 <w:rFonts w:ascii="Times New Roman" w:hAnsi="Times New Roman"/>
                 <w:sz w:val="20"/>
                 <w:szCs w:val="20"/>
-                <w:highlight w:val="yellow"/>
               </w:rPr>
               <w:t xml:space="preserve">М.П.          </w:t>
             </w:r>
@@ -3857,7 +4612,6 @@
                 <w:rFonts w:ascii="Times New Roman" w:hAnsi="Times New Roman"/>
                 <w:sz w:val="16"/>
                 <w:szCs w:val="16"/>
-                <w:highlight w:val="yellow"/>
               </w:rPr>
               <w:t>Підпис</w:t>
             </w:r>
@@ -3897,76 +4651,36 @@
                 <w:rFonts w:ascii="Times New Roman" w:hAnsi="Times New Roman"/>
                 <w:sz w:val="20"/>
                 <w:szCs w:val="20"/>
-                <w:highlight w:val="yellow"/>
-                <w:u w:val="single"/>
-              </w:rPr>
-              <w:t>____</w:t>
-            </w:r>
-            <w:r>
-              <w:rPr>
-                <w:rFonts w:ascii="Times New Roman" w:hAnsi="Times New Roman"/>
-                <w:sz w:val="20"/>
-                <w:szCs w:val="20"/>
-                <w:highlight w:val="yellow"/>
-                <w:u w:val="single"/>
-              </w:rPr>
-              <w:t>_________</w:t>
-            </w:r>
-            <w:r>
-              <w:rPr>
-                <w:rFonts w:ascii="Times New Roman" w:hAnsi="Times New Roman"/>
-                <w:sz w:val="20"/>
-                <w:szCs w:val="20"/>
-                <w:highlight w:val="yellow"/>
-                <w:u w:val="single"/>
+              </w:rPr>
+              <w:t>_</w:t>
+            </w:r>
+            <w:proofErr w:type="spellStart"/>
+            <w:r>
+              <w:rPr>
+                <w:rFonts w:ascii="Times New Roman" w:hAnsi="Times New Roman"/>
+                <w:sz w:val="20"/>
+                <w:szCs w:val="20"/>
+                <w:u w:val="single"/>
+              </w:rPr>
+              <w:t>Белоус</w:t>
+            </w:r>
+            <w:proofErr w:type="spellEnd"/>
+            <w:r>
+              <w:rPr>
+                <w:rFonts w:ascii="Times New Roman" w:hAnsi="Times New Roman"/>
+                <w:sz w:val="20"/>
+                <w:szCs w:val="20"/>
+                <w:u w:val="single"/>
+              </w:rPr>
+              <w:t xml:space="preserve"> Роман Володимирович</w:t>
+            </w:r>
+            <w:r>
+              <w:rPr>
+                <w:rFonts w:ascii="Times New Roman" w:hAnsi="Times New Roman"/>
+                <w:sz w:val="20"/>
+                <w:szCs w:val="20"/>
               </w:rPr>
               <w:t>__</w:t>
-            </w:r>
-            <w:r>
-              <w:rPr>
-                <w:rFonts w:ascii="Times New Roman" w:hAnsi="Times New Roman"/>
-                <w:sz w:val="20"/>
-                <w:szCs w:val="20"/>
-                <w:highlight w:val="yellow"/>
-                <w:u w:val="single"/>
-              </w:rPr>
-              <w:t>ПІБ</w:t>
-            </w:r>
-            <w:r>
-              <w:rPr>
-                <w:rFonts w:ascii="Times New Roman" w:hAnsi="Times New Roman"/>
-                <w:sz w:val="20"/>
-                <w:szCs w:val="20"/>
-                <w:highlight w:val="yellow"/>
-                <w:u w:val="single"/>
-              </w:rPr>
-              <w:t>_____</w:t>
-            </w:r>
-            <w:r>
-              <w:rPr>
-                <w:rFonts w:ascii="Times New Roman" w:hAnsi="Times New Roman"/>
-                <w:sz w:val="20"/>
-                <w:szCs w:val="20"/>
-                <w:highlight w:val="yellow"/>
-                <w:u w:val="single"/>
-              </w:rPr>
-              <w:t>______</w:t>
-            </w:r>
-            <w:r>
-              <w:rPr>
-                <w:rFonts w:ascii="Times New Roman" w:hAnsi="Times New Roman"/>
-                <w:sz w:val="20"/>
-                <w:szCs w:val="20"/>
-              </w:rPr>
-              <w:t>___</w:t>
-            </w:r>
-            <w:r>
-              <w:rPr>
-                <w:rFonts w:ascii="Times New Roman" w:hAnsi="Times New Roman"/>
-                <w:sz w:val="20"/>
-                <w:szCs w:val="20"/>
-              </w:rPr>
-              <w:t>_____</w:t>
             </w:r>
           </w:p>
         </w:tc>
@@ -4726,7 +5440,7 @@
             <w:r>
               <w:rPr>
                 <w:rFonts w:ascii="Cambria" w:hAnsi="Cambria"/>
-                <w:highlight w:val="yellow"/>
+                <w:u w:val="single"/>
                 <w:lang w:val="ru-RU"/>
               </w:rPr>
               <w:t>7</w:t>
@@ -4763,7 +5477,82 @@
                 <w:szCs w:val="20"/>
                 <w:lang w:eastAsia="ru-RU"/>
               </w:rPr>
-              <w:t>__________________</w:t>
+              <w:t>___</w:t>
+            </w:r>
+            <w:r>
+              <w:rPr>
+                <w:rFonts w:ascii="Times New Roman" w:eastAsia="Times New Roman" w:hAnsi="Times New Roman"/>
+                <w:b/>
+                <w:sz w:val="20"/>
+                <w:szCs w:val="20"/>
+                <w:lang w:eastAsia="ru-RU"/>
+              </w:rPr>
+              <w:t>_</w:t>
+            </w:r>
+            <w:r>
+              <w:rPr>
+                <w:rFonts w:ascii="Times New Roman" w:eastAsia="Times New Roman" w:hAnsi="Times New Roman"/>
+                <w:bCs/>
+                <w:sz w:val="20"/>
+                <w:szCs w:val="20"/>
+                <w:u w:val="single"/>
+                <w:lang w:eastAsia="ru-RU"/>
+              </w:rPr>
+              <w:t>05</w:t>
+            </w:r>
+            <w:r>
+              <w:rPr>
+                <w:rFonts w:ascii="Times New Roman" w:eastAsia="Times New Roman" w:hAnsi="Times New Roman"/>
+                <w:bCs/>
+                <w:sz w:val="20"/>
+                <w:szCs w:val="20"/>
+                <w:u w:val="single"/>
+                <w:lang w:eastAsia="ru-RU"/>
+              </w:rPr>
+              <w:t>.</w:t>
+            </w:r>
+            <w:r>
+              <w:rPr>
+                <w:rFonts w:ascii="Times New Roman" w:eastAsia="Times New Roman" w:hAnsi="Times New Roman"/>
+                <w:bCs/>
+                <w:sz w:val="20"/>
+                <w:szCs w:val="20"/>
+                <w:u w:val="single"/>
+                <w:lang w:eastAsia="ru-RU"/>
+              </w:rPr>
+              <w:t>10</w:t>
+            </w:r>
+            <w:r>
+              <w:rPr>
+                <w:rFonts w:ascii="Times New Roman" w:eastAsia="Times New Roman" w:hAnsi="Times New Roman"/>
+                <w:bCs/>
+                <w:sz w:val="20"/>
+                <w:szCs w:val="20"/>
+                <w:u w:val="single"/>
+                <w:lang w:eastAsia="ru-RU"/>
+              </w:rPr>
+              <w:t>–</w:t>
+            </w:r>
+            <w:r>
+              <w:rPr>
+                <w:rFonts w:ascii="Times New Roman" w:eastAsia="Times New Roman" w:hAnsi="Times New Roman"/>
+                <w:bCs/>
+                <w:sz w:val="20"/>
+                <w:szCs w:val="20"/>
+                <w:u w:val="single"/>
+                <w:lang w:eastAsia="ru-RU"/>
+              </w:rPr>
+              <w:t>09.10</w:t>
+            </w:r>
+            <w:r>
+              <w:rPr>
+                <w:rFonts w:ascii="Times New Roman" w:eastAsia="Times New Roman" w:hAnsi="Times New Roman"/>
+                <w:b/>
+                <w:sz w:val="20"/>
+                <w:szCs w:val="20"/>
+                <w:lang w:eastAsia="ru-RU"/>
+              </w:rPr>
+              <w:t>____</w:t>
             </w:r>
             <w:r>
               <w:rPr>
@@ -4886,25 +5675,61 @@
                 <w:tab w:val="left" w:pos="7513"/>
               </w:tabs>
               <w:spacing w:after="0" w:line="480" w:lineRule="auto"/>
-              <w:ind w:left="601"/>
+              <w:ind w:left="601" w:right="286"/>
               <w:jc w:val="both"/>
               <w:rPr>
                 <w:rFonts w:ascii="Times New Roman" w:eastAsia="Times New Roman" w:hAnsi="Times New Roman"/>
-                <w:b/>
-                <w:sz w:val="20"/>
-                <w:szCs w:val="20"/>
-                <w:lang w:eastAsia="ru-RU"/>
-              </w:rPr>
-            </w:pPr>
-            <w:r>
-              <w:rPr>
-                <w:rFonts w:ascii="Times New Roman" w:eastAsia="Times New Roman" w:hAnsi="Times New Roman"/>
-                <w:b/>
-                <w:sz w:val="20"/>
-                <w:szCs w:val="20"/>
-                <w:lang w:eastAsia="ru-RU"/>
-              </w:rPr>
-              <w:t>_____________________________________________________________________</w:t>
+                <w:bCs/>
+                <w:sz w:val="20"/>
+                <w:szCs w:val="20"/>
+                <w:u w:val="single"/>
+                <w:lang w:eastAsia="ru-RU"/>
+              </w:rPr>
+            </w:pPr>
+            <w:r>
+              <w:rPr>
+                <w:rFonts w:ascii="Times New Roman" w:eastAsia="Times New Roman" w:hAnsi="Times New Roman"/>
+                <w:bCs/>
+                <w:sz w:val="20"/>
+                <w:szCs w:val="20"/>
+                <w:u w:val="single"/>
+                <w:lang w:eastAsia="ru-RU"/>
+              </w:rPr>
+              <w:t xml:space="preserve">Завершено розробку користувацького веб-інтерфейсу застосунку, інтегровано відображення просторової 3D-моделі будівлі. Наразі триває етап налаштування алгоритмів </w:t>
+            </w:r>
+            <w:proofErr w:type="spellStart"/>
+            <w:r>
+              <w:rPr>
+                <w:rFonts w:ascii="Times New Roman" w:eastAsia="Times New Roman" w:hAnsi="Times New Roman"/>
+                <w:bCs/>
+                <w:sz w:val="20"/>
+                <w:szCs w:val="20"/>
+                <w:u w:val="single"/>
+                <w:lang w:eastAsia="ru-RU"/>
+              </w:rPr>
+              <w:t>мапінгу</w:t>
+            </w:r>
+            <w:proofErr w:type="spellEnd"/>
+            <w:r>
+              <w:rPr>
+                <w:rFonts w:ascii="Times New Roman" w:eastAsia="Times New Roman" w:hAnsi="Times New Roman"/>
+                <w:bCs/>
+                <w:sz w:val="20"/>
+                <w:szCs w:val="20"/>
+                <w:u w:val="single"/>
+                <w:lang w:eastAsia="ru-RU"/>
+              </w:rPr>
+              <w:t xml:space="preserve"> знайдених дефектів безпосередньо на цю 3D-модель.</w:t>
+            </w:r>
+            <w:r>
+              <w:rPr>
+                <w:rFonts w:ascii="Times New Roman" w:eastAsia="Times New Roman" w:hAnsi="Times New Roman"/>
+                <w:bCs/>
+                <w:sz w:val="20"/>
+                <w:szCs w:val="20"/>
+                <w:lang w:eastAsia="ru-RU"/>
+              </w:rPr>
+              <w:t>________</w:t>
             </w:r>
           </w:p>
           <w:p>
@@ -4914,165 +5739,263 @@
                 <w:tab w:val="left" w:pos="7513"/>
               </w:tabs>
               <w:spacing w:after="0" w:line="480" w:lineRule="auto"/>
-              <w:ind w:left="601"/>
+              <w:ind w:left="601" w:right="286"/>
               <w:jc w:val="both"/>
               <w:rPr>
                 <w:rFonts w:ascii="Times New Roman" w:eastAsia="Times New Roman" w:hAnsi="Times New Roman"/>
-                <w:b/>
-                <w:sz w:val="20"/>
-                <w:szCs w:val="20"/>
-                <w:lang w:eastAsia="ru-RU"/>
-              </w:rPr>
-            </w:pPr>
-            <w:r>
-              <w:rPr>
-                <w:rFonts w:ascii="Times New Roman" w:eastAsia="Times New Roman" w:hAnsi="Times New Roman"/>
-                <w:b/>
-                <w:sz w:val="20"/>
-                <w:szCs w:val="20"/>
-                <w:lang w:eastAsia="ru-RU"/>
-              </w:rPr>
-              <w:t>_____________________________________________________________________</w:t>
-            </w:r>
-          </w:p>
-          <w:p>
-            <w:pPr>
-              <w:tabs>
-                <w:tab w:val="left" w:pos="601"/>
-                <w:tab w:val="left" w:pos="7513"/>
-              </w:tabs>
-              <w:spacing w:after="0" w:line="480" w:lineRule="auto"/>
-              <w:ind w:left="601"/>
-              <w:jc w:val="both"/>
-              <w:rPr>
-                <w:rFonts w:ascii="Times New Roman" w:eastAsia="Times New Roman" w:hAnsi="Times New Roman"/>
-                <w:b/>
-                <w:sz w:val="20"/>
-                <w:szCs w:val="20"/>
-                <w:lang w:eastAsia="ru-RU"/>
-              </w:rPr>
-            </w:pPr>
-            <w:r>
-              <w:rPr>
-                <w:rFonts w:ascii="Times New Roman" w:eastAsia="Times New Roman" w:hAnsi="Times New Roman"/>
-                <w:b/>
-                <w:sz w:val="20"/>
-                <w:szCs w:val="20"/>
-                <w:lang w:eastAsia="ru-RU"/>
-              </w:rPr>
-              <w:t>_____________________________________________________________________</w:t>
-            </w:r>
-          </w:p>
-          <w:p>
-            <w:pPr>
-              <w:tabs>
-                <w:tab w:val="left" w:pos="601"/>
-                <w:tab w:val="left" w:pos="7513"/>
-              </w:tabs>
-              <w:spacing w:after="0" w:line="480" w:lineRule="auto"/>
-              <w:ind w:left="601"/>
-              <w:jc w:val="both"/>
-              <w:rPr>
-                <w:rFonts w:ascii="Times New Roman" w:eastAsia="Times New Roman" w:hAnsi="Times New Roman"/>
-                <w:b/>
-                <w:sz w:val="20"/>
-                <w:szCs w:val="20"/>
-                <w:lang w:eastAsia="ru-RU"/>
-              </w:rPr>
-            </w:pPr>
-            <w:r>
-              <w:rPr>
-                <w:rFonts w:ascii="Times New Roman" w:eastAsia="Times New Roman" w:hAnsi="Times New Roman"/>
-                <w:b/>
-                <w:sz w:val="20"/>
-                <w:szCs w:val="20"/>
-                <w:lang w:eastAsia="ru-RU"/>
-              </w:rPr>
-              <w:t>_____________________________________________________________________</w:t>
-            </w:r>
-          </w:p>
-          <w:p>
-            <w:pPr>
-              <w:tabs>
-                <w:tab w:val="left" w:pos="601"/>
-                <w:tab w:val="left" w:pos="7513"/>
-              </w:tabs>
-              <w:spacing w:after="0" w:line="480" w:lineRule="auto"/>
-              <w:ind w:left="601"/>
-              <w:jc w:val="both"/>
-              <w:rPr>
-                <w:rFonts w:ascii="Times New Roman" w:eastAsia="Times New Roman" w:hAnsi="Times New Roman"/>
-                <w:b/>
-                <w:sz w:val="20"/>
-                <w:szCs w:val="20"/>
-                <w:lang w:eastAsia="ru-RU"/>
-              </w:rPr>
-            </w:pPr>
-            <w:r>
-              <w:rPr>
-                <w:rFonts w:ascii="Times New Roman" w:eastAsia="Times New Roman" w:hAnsi="Times New Roman"/>
-                <w:b/>
-                <w:sz w:val="20"/>
-                <w:szCs w:val="20"/>
-                <w:lang w:eastAsia="ru-RU"/>
-              </w:rPr>
-              <w:t>_____________________________________________________________________</w:t>
-            </w:r>
-          </w:p>
-          <w:p>
-            <w:pPr>
-              <w:tabs>
-                <w:tab w:val="left" w:pos="601"/>
-                <w:tab w:val="left" w:pos="7513"/>
-              </w:tabs>
-              <w:spacing w:after="0" w:line="480" w:lineRule="auto"/>
-              <w:ind w:left="601"/>
-              <w:jc w:val="both"/>
-              <w:rPr>
-                <w:rFonts w:ascii="Times New Roman" w:eastAsia="Times New Roman" w:hAnsi="Times New Roman"/>
-                <w:b/>
-                <w:sz w:val="20"/>
-                <w:szCs w:val="20"/>
-                <w:lang w:eastAsia="ru-RU"/>
-              </w:rPr>
-            </w:pPr>
-            <w:r>
-              <w:rPr>
-                <w:rFonts w:ascii="Times New Roman" w:eastAsia="Times New Roman" w:hAnsi="Times New Roman"/>
-                <w:b/>
-                <w:sz w:val="20"/>
-                <w:szCs w:val="20"/>
-                <w:lang w:eastAsia="ru-RU"/>
-              </w:rPr>
-              <w:t>_____________________________________________________________________</w:t>
-            </w:r>
-          </w:p>
-          <w:p>
-            <w:pPr>
-              <w:tabs>
-                <w:tab w:val="left" w:pos="601"/>
-                <w:tab w:val="left" w:pos="7513"/>
-              </w:tabs>
-              <w:spacing w:after="0" w:line="480" w:lineRule="auto"/>
-              <w:ind w:left="601"/>
-              <w:jc w:val="both"/>
-              <w:rPr>
-                <w:rFonts w:ascii="Times New Roman" w:eastAsia="Times New Roman" w:hAnsi="Times New Roman"/>
-                <w:b/>
-                <w:sz w:val="20"/>
-                <w:szCs w:val="20"/>
-                <w:lang w:eastAsia="ru-RU"/>
-              </w:rPr>
-            </w:pPr>
-            <w:r>
-              <w:rPr>
-                <w:rFonts w:ascii="Times New Roman" w:eastAsia="Times New Roman" w:hAnsi="Times New Roman"/>
-                <w:b/>
-                <w:sz w:val="20"/>
-                <w:szCs w:val="20"/>
-                <w:lang w:eastAsia="ru-RU"/>
-              </w:rPr>
-              <w:t>_____________________________________________________________________</w:t>
+                <w:bCs/>
+                <w:sz w:val="20"/>
+                <w:szCs w:val="20"/>
+                <w:u w:val="single"/>
+                <w:lang w:eastAsia="ru-RU"/>
+              </w:rPr>
+            </w:pPr>
+            <w:r>
+              <w:rPr>
+                <w:rFonts w:ascii="Times New Roman" w:eastAsia="Times New Roman" w:hAnsi="Times New Roman"/>
+                <w:bCs/>
+                <w:sz w:val="20"/>
+                <w:szCs w:val="20"/>
+                <w:u w:val="single"/>
+                <w:lang w:eastAsia="ru-RU"/>
+              </w:rPr>
+              <w:t xml:space="preserve">Проведено фінальне тестування YOLOv9-c на тестовій вибірці. Загальна точність сегментації за метрикою </w:t>
+            </w:r>
+            <w:proofErr w:type="spellStart"/>
+            <w:r>
+              <w:rPr>
+                <w:rFonts w:ascii="Times New Roman" w:eastAsia="Times New Roman" w:hAnsi="Times New Roman"/>
+                <w:bCs/>
+                <w:sz w:val="20"/>
+                <w:szCs w:val="20"/>
+                <w:u w:val="single"/>
+                <w:lang w:eastAsia="ru-RU"/>
+              </w:rPr>
+              <w:t>Mask</w:t>
+            </w:r>
+            <w:proofErr w:type="spellEnd"/>
+            <w:r>
+              <w:rPr>
+                <w:rFonts w:ascii="Times New Roman" w:eastAsia="Times New Roman" w:hAnsi="Times New Roman"/>
+                <w:bCs/>
+                <w:sz w:val="20"/>
+                <w:szCs w:val="20"/>
+                <w:u w:val="single"/>
+                <w:lang w:eastAsia="ru-RU"/>
+              </w:rPr>
+              <w:t xml:space="preserve"> mAP@0.5 склала 7</w:t>
+            </w:r>
+            <w:r>
+              <w:rPr>
+                <w:rFonts w:ascii="Times New Roman" w:eastAsia="Times New Roman" w:hAnsi="Times New Roman"/>
+                <w:bCs/>
+                <w:sz w:val="20"/>
+                <w:szCs w:val="20"/>
+                <w:u w:val="single"/>
+                <w:lang w:eastAsia="ru-RU"/>
+              </w:rPr>
+              <w:t>8</w:t>
+            </w:r>
+            <w:r>
+              <w:rPr>
+                <w:rFonts w:ascii="Times New Roman" w:eastAsia="Times New Roman" w:hAnsi="Times New Roman"/>
+                <w:bCs/>
+                <w:sz w:val="20"/>
+                <w:szCs w:val="20"/>
+                <w:u w:val="single"/>
+                <w:lang w:eastAsia="ru-RU"/>
+              </w:rPr>
+              <w:t>,</w:t>
+            </w:r>
+            <w:r>
+              <w:rPr>
+                <w:rFonts w:ascii="Times New Roman" w:eastAsia="Times New Roman" w:hAnsi="Times New Roman"/>
+                <w:bCs/>
+                <w:sz w:val="20"/>
+                <w:szCs w:val="20"/>
+                <w:u w:val="single"/>
+                <w:lang w:eastAsia="ru-RU"/>
+              </w:rPr>
+              <w:t>1</w:t>
+            </w:r>
+            <w:r>
+              <w:rPr>
+                <w:rFonts w:ascii="Times New Roman" w:eastAsia="Times New Roman" w:hAnsi="Times New Roman"/>
+                <w:bCs/>
+                <w:sz w:val="20"/>
+                <w:szCs w:val="20"/>
+                <w:u w:val="single"/>
+                <w:lang w:eastAsia="ru-RU"/>
+              </w:rPr>
+              <w:t xml:space="preserve">%. Система продемонструвала високу ефективність розпізнавання: точність для </w:t>
+            </w:r>
+            <w:proofErr w:type="spellStart"/>
+            <w:r>
+              <w:rPr>
+                <w:rFonts w:ascii="Times New Roman" w:eastAsia="Times New Roman" w:hAnsi="Times New Roman"/>
+                <w:bCs/>
+                <w:sz w:val="20"/>
+                <w:szCs w:val="20"/>
+                <w:u w:val="single"/>
+                <w:lang w:eastAsia="ru-RU"/>
+              </w:rPr>
+              <w:t>відшарувань</w:t>
+            </w:r>
+            <w:proofErr w:type="spellEnd"/>
+            <w:r>
+              <w:rPr>
+                <w:rFonts w:ascii="Times New Roman" w:eastAsia="Times New Roman" w:hAnsi="Times New Roman"/>
+                <w:bCs/>
+                <w:sz w:val="20"/>
+                <w:szCs w:val="20"/>
+                <w:u w:val="single"/>
+                <w:lang w:eastAsia="ru-RU"/>
+              </w:rPr>
+              <w:t xml:space="preserve"> склала 9</w:t>
+            </w:r>
+            <w:r>
+              <w:rPr>
+                <w:rFonts w:ascii="Times New Roman" w:eastAsia="Times New Roman" w:hAnsi="Times New Roman"/>
+                <w:bCs/>
+                <w:sz w:val="20"/>
+                <w:szCs w:val="20"/>
+                <w:u w:val="single"/>
+                <w:lang w:eastAsia="ru-RU"/>
+              </w:rPr>
+              <w:t>5</w:t>
+            </w:r>
+            <w:r>
+              <w:rPr>
+                <w:rFonts w:ascii="Times New Roman" w:eastAsia="Times New Roman" w:hAnsi="Times New Roman"/>
+                <w:bCs/>
+                <w:sz w:val="20"/>
+                <w:szCs w:val="20"/>
+                <w:u w:val="single"/>
+                <w:lang w:eastAsia="ru-RU"/>
+              </w:rPr>
+              <w:t>,</w:t>
+            </w:r>
+            <w:r>
+              <w:rPr>
+                <w:rFonts w:ascii="Times New Roman" w:eastAsia="Times New Roman" w:hAnsi="Times New Roman"/>
+                <w:bCs/>
+                <w:sz w:val="20"/>
+                <w:szCs w:val="20"/>
+                <w:u w:val="single"/>
+                <w:lang w:eastAsia="ru-RU"/>
+              </w:rPr>
+              <w:t>6</w:t>
+            </w:r>
+            <w:r>
+              <w:rPr>
+                <w:rFonts w:ascii="Times New Roman" w:eastAsia="Times New Roman" w:hAnsi="Times New Roman"/>
+                <w:bCs/>
+                <w:sz w:val="20"/>
+                <w:szCs w:val="20"/>
+                <w:u w:val="single"/>
+                <w:lang w:eastAsia="ru-RU"/>
+              </w:rPr>
+              <w:t xml:space="preserve">%, а для складного класу </w:t>
+            </w:r>
+            <w:proofErr w:type="spellStart"/>
+            <w:r>
+              <w:rPr>
+                <w:rFonts w:ascii="Times New Roman" w:eastAsia="Times New Roman" w:hAnsi="Times New Roman"/>
+                <w:bCs/>
+                <w:sz w:val="20"/>
+                <w:szCs w:val="20"/>
+                <w:u w:val="single"/>
+                <w:lang w:eastAsia="ru-RU"/>
+              </w:rPr>
+              <w:t>тріщин</w:t>
+            </w:r>
+            <w:proofErr w:type="spellEnd"/>
+            <w:r>
+              <w:rPr>
+                <w:rFonts w:ascii="Times New Roman" w:eastAsia="Times New Roman" w:hAnsi="Times New Roman"/>
+                <w:bCs/>
+                <w:sz w:val="20"/>
+                <w:szCs w:val="20"/>
+                <w:u w:val="single"/>
+                <w:lang w:eastAsia="ru-RU"/>
+              </w:rPr>
+              <w:t xml:space="preserve"> </w:t>
+            </w:r>
+            <w:r>
+              <w:rPr>
+                <w:rFonts w:ascii="Times New Roman" w:eastAsia="Times New Roman" w:hAnsi="Times New Roman"/>
+                <w:bCs/>
+                <w:sz w:val="20"/>
+                <w:szCs w:val="20"/>
+                <w:u w:val="single"/>
+                <w:lang w:eastAsia="ru-RU"/>
+              </w:rPr>
+              <w:t>–</w:t>
+            </w:r>
+            <w:r>
+              <w:rPr>
+                <w:rFonts w:ascii="Times New Roman" w:eastAsia="Times New Roman" w:hAnsi="Times New Roman"/>
+                <w:bCs/>
+                <w:sz w:val="20"/>
+                <w:szCs w:val="20"/>
+                <w:u w:val="single"/>
+                <w:lang w:eastAsia="ru-RU"/>
+              </w:rPr>
+              <w:t> </w:t>
+            </w:r>
+            <w:r>
+              <w:rPr>
+                <w:rFonts w:ascii="Times New Roman" w:eastAsia="Times New Roman" w:hAnsi="Times New Roman"/>
+                <w:bCs/>
+                <w:sz w:val="20"/>
+                <w:szCs w:val="20"/>
+                <w:u w:val="single"/>
+                <w:lang w:eastAsia="ru-RU"/>
+              </w:rPr>
+              <w:t>60</w:t>
+            </w:r>
+            <w:r>
+              <w:rPr>
+                <w:rFonts w:ascii="Times New Roman" w:eastAsia="Times New Roman" w:hAnsi="Times New Roman"/>
+                <w:bCs/>
+                <w:sz w:val="20"/>
+                <w:szCs w:val="20"/>
+                <w:u w:val="single"/>
+                <w:lang w:eastAsia="ru-RU"/>
+              </w:rPr>
+              <w:t>,</w:t>
+            </w:r>
+            <w:r>
+              <w:rPr>
+                <w:rFonts w:ascii="Times New Roman" w:eastAsia="Times New Roman" w:hAnsi="Times New Roman"/>
+                <w:bCs/>
+                <w:sz w:val="20"/>
+                <w:szCs w:val="20"/>
+                <w:u w:val="single"/>
+                <w:lang w:eastAsia="ru-RU"/>
+              </w:rPr>
+              <w:t>5</w:t>
+            </w:r>
+            <w:r>
+              <w:rPr>
+                <w:rFonts w:ascii="Times New Roman" w:eastAsia="Times New Roman" w:hAnsi="Times New Roman"/>
+                <w:bCs/>
+                <w:sz w:val="20"/>
+                <w:szCs w:val="20"/>
+                <w:u w:val="single"/>
+                <w:lang w:eastAsia="ru-RU"/>
+              </w:rPr>
+              <w:t xml:space="preserve">%. </w:t>
+            </w:r>
+            <w:r>
+              <w:rPr>
+                <w:rFonts w:ascii="Times New Roman" w:eastAsia="Times New Roman" w:hAnsi="Times New Roman"/>
+                <w:bCs/>
+                <w:sz w:val="20"/>
+                <w:szCs w:val="20"/>
+                <w:lang w:eastAsia="ru-RU"/>
+              </w:rPr>
+              <w:t>________________________</w:t>
             </w:r>
           </w:p>
           <w:p>
@@ -5127,7 +6050,7 @@
             <w:r>
               <w:rPr>
                 <w:rFonts w:ascii="Cambria" w:hAnsi="Cambria"/>
-                <w:highlight w:val="yellow"/>
+                <w:u w:val="single"/>
                 <w:lang w:val="ru-RU"/>
               </w:rPr>
               <w:t>8</w:t>
@@ -5164,7 +6087,82 @@
                 <w:szCs w:val="20"/>
                 <w:lang w:eastAsia="ru-RU"/>
               </w:rPr>
-              <w:t>__________________</w:t>
+              <w:t>___</w:t>
+            </w:r>
+            <w:r>
+              <w:rPr>
+                <w:rFonts w:ascii="Times New Roman" w:eastAsia="Times New Roman" w:hAnsi="Times New Roman"/>
+                <w:b/>
+                <w:sz w:val="20"/>
+                <w:szCs w:val="20"/>
+                <w:lang w:eastAsia="ru-RU"/>
+              </w:rPr>
+              <w:t>_</w:t>
+            </w:r>
+            <w:r>
+              <w:rPr>
+                <w:rFonts w:ascii="Times New Roman" w:eastAsia="Times New Roman" w:hAnsi="Times New Roman"/>
+                <w:bCs/>
+                <w:sz w:val="20"/>
+                <w:szCs w:val="20"/>
+                <w:u w:val="single"/>
+                <w:lang w:eastAsia="ru-RU"/>
+              </w:rPr>
+              <w:t>12</w:t>
+            </w:r>
+            <w:r>
+              <w:rPr>
+                <w:rFonts w:ascii="Times New Roman" w:eastAsia="Times New Roman" w:hAnsi="Times New Roman"/>
+                <w:bCs/>
+                <w:sz w:val="20"/>
+                <w:szCs w:val="20"/>
+                <w:u w:val="single"/>
+                <w:lang w:eastAsia="ru-RU"/>
+              </w:rPr>
+              <w:t>.</w:t>
+            </w:r>
+            <w:r>
+              <w:rPr>
+                <w:rFonts w:ascii="Times New Roman" w:eastAsia="Times New Roman" w:hAnsi="Times New Roman"/>
+                <w:bCs/>
+                <w:sz w:val="20"/>
+                <w:szCs w:val="20"/>
+                <w:u w:val="single"/>
+                <w:lang w:eastAsia="ru-RU"/>
+              </w:rPr>
+              <w:t>10</w:t>
+            </w:r>
+            <w:r>
+              <w:rPr>
+                <w:rFonts w:ascii="Times New Roman" w:eastAsia="Times New Roman" w:hAnsi="Times New Roman"/>
+                <w:bCs/>
+                <w:sz w:val="20"/>
+                <w:szCs w:val="20"/>
+                <w:u w:val="single"/>
+                <w:lang w:eastAsia="ru-RU"/>
+              </w:rPr>
+              <w:t>–</w:t>
+            </w:r>
+            <w:r>
+              <w:rPr>
+                <w:rFonts w:ascii="Times New Roman" w:eastAsia="Times New Roman" w:hAnsi="Times New Roman"/>
+                <w:bCs/>
+                <w:sz w:val="20"/>
+                <w:szCs w:val="20"/>
+                <w:u w:val="single"/>
+                <w:lang w:eastAsia="ru-RU"/>
+              </w:rPr>
+              <w:t>15.10</w:t>
+            </w:r>
+            <w:r>
+              <w:rPr>
+                <w:rFonts w:ascii="Times New Roman" w:eastAsia="Times New Roman" w:hAnsi="Times New Roman"/>
+                <w:b/>
+                <w:sz w:val="20"/>
+                <w:szCs w:val="20"/>
+                <w:lang w:eastAsia="ru-RU"/>
+              </w:rPr>
+              <w:t>____</w:t>
             </w:r>
             <w:r>
               <w:rPr>
@@ -5283,197 +6281,144 @@
           <w:p>
             <w:pPr>
               <w:tabs>
-                <w:tab w:val="left" w:pos="601"/>
+                <w:tab w:val="left" w:pos="176"/>
                 <w:tab w:val="left" w:pos="7513"/>
               </w:tabs>
               <w:spacing w:after="0" w:line="480" w:lineRule="auto"/>
-              <w:ind w:left="601"/>
+              <w:ind w:left="633" w:right="283"/>
               <w:jc w:val="both"/>
               <w:rPr>
                 <w:rFonts w:ascii="Times New Roman" w:eastAsia="Times New Roman" w:hAnsi="Times New Roman"/>
-                <w:b/>
-                <w:sz w:val="20"/>
-                <w:szCs w:val="20"/>
-                <w:lang w:eastAsia="ru-RU"/>
-              </w:rPr>
-            </w:pPr>
-            <w:r>
-              <w:rPr>
-                <w:rFonts w:ascii="Times New Roman" w:eastAsia="Times New Roman" w:hAnsi="Times New Roman"/>
-                <w:b/>
-                <w:sz w:val="20"/>
-                <w:szCs w:val="20"/>
-                <w:lang w:eastAsia="ru-RU"/>
-              </w:rPr>
-              <w:t>_____________________________________________________________________</w:t>
-            </w:r>
-          </w:p>
-          <w:p>
-            <w:pPr>
-              <w:tabs>
-                <w:tab w:val="left" w:pos="601"/>
-                <w:tab w:val="left" w:pos="7513"/>
-              </w:tabs>
-              <w:spacing w:after="0" w:line="480" w:lineRule="auto"/>
-              <w:ind w:left="601"/>
-              <w:jc w:val="both"/>
-              <w:rPr>
-                <w:rFonts w:ascii="Times New Roman" w:eastAsia="Times New Roman" w:hAnsi="Times New Roman"/>
-                <w:b/>
-                <w:sz w:val="20"/>
-                <w:szCs w:val="20"/>
-                <w:lang w:eastAsia="ru-RU"/>
-              </w:rPr>
-            </w:pPr>
-            <w:r>
-              <w:rPr>
-                <w:rFonts w:ascii="Times New Roman" w:eastAsia="Times New Roman" w:hAnsi="Times New Roman"/>
-                <w:b/>
-                <w:sz w:val="20"/>
-                <w:szCs w:val="20"/>
-                <w:lang w:eastAsia="ru-RU"/>
-              </w:rPr>
-              <w:t>_____________________________________________________________________</w:t>
-            </w:r>
-          </w:p>
-          <w:p>
-            <w:pPr>
-              <w:tabs>
-                <w:tab w:val="left" w:pos="601"/>
-                <w:tab w:val="left" w:pos="7513"/>
-              </w:tabs>
-              <w:spacing w:after="0" w:line="480" w:lineRule="auto"/>
-              <w:ind w:left="601"/>
-              <w:jc w:val="both"/>
-              <w:rPr>
-                <w:rFonts w:ascii="Times New Roman" w:eastAsia="Times New Roman" w:hAnsi="Times New Roman"/>
-                <w:b/>
-                <w:sz w:val="20"/>
-                <w:szCs w:val="20"/>
-                <w:lang w:eastAsia="ru-RU"/>
-              </w:rPr>
-            </w:pPr>
-            <w:r>
-              <w:rPr>
-                <w:rFonts w:ascii="Times New Roman" w:eastAsia="Times New Roman" w:hAnsi="Times New Roman"/>
-                <w:b/>
-                <w:sz w:val="20"/>
-                <w:szCs w:val="20"/>
-                <w:lang w:eastAsia="ru-RU"/>
-              </w:rPr>
-              <w:t>_____________________________________________________________________</w:t>
-            </w:r>
-          </w:p>
-          <w:p>
-            <w:pPr>
-              <w:tabs>
-                <w:tab w:val="left" w:pos="601"/>
-                <w:tab w:val="left" w:pos="7513"/>
-              </w:tabs>
-              <w:spacing w:after="0" w:line="480" w:lineRule="auto"/>
-              <w:ind w:left="601"/>
-              <w:jc w:val="both"/>
-              <w:rPr>
-                <w:rFonts w:ascii="Times New Roman" w:eastAsia="Times New Roman" w:hAnsi="Times New Roman"/>
-                <w:b/>
-                <w:sz w:val="20"/>
-                <w:szCs w:val="20"/>
-                <w:lang w:eastAsia="ru-RU"/>
-              </w:rPr>
-            </w:pPr>
-            <w:r>
-              <w:rPr>
-                <w:rFonts w:ascii="Times New Roman" w:eastAsia="Times New Roman" w:hAnsi="Times New Roman"/>
-                <w:b/>
-                <w:sz w:val="20"/>
-                <w:szCs w:val="20"/>
-                <w:lang w:eastAsia="ru-RU"/>
-              </w:rPr>
-              <w:t>_____________________________________________________________________</w:t>
-            </w:r>
-          </w:p>
-          <w:p>
-            <w:pPr>
-              <w:tabs>
-                <w:tab w:val="left" w:pos="601"/>
-                <w:tab w:val="left" w:pos="7513"/>
-              </w:tabs>
-              <w:spacing w:after="0" w:line="480" w:lineRule="auto"/>
-              <w:ind w:left="601"/>
-              <w:jc w:val="both"/>
-              <w:rPr>
-                <w:rFonts w:ascii="Times New Roman" w:eastAsia="Times New Roman" w:hAnsi="Times New Roman"/>
-                <w:b/>
-                <w:sz w:val="20"/>
-                <w:szCs w:val="20"/>
-                <w:lang w:eastAsia="ru-RU"/>
-              </w:rPr>
-            </w:pPr>
-            <w:r>
-              <w:rPr>
-                <w:rFonts w:ascii="Times New Roman" w:eastAsia="Times New Roman" w:hAnsi="Times New Roman"/>
-                <w:b/>
-                <w:sz w:val="20"/>
-                <w:szCs w:val="20"/>
-                <w:lang w:eastAsia="ru-RU"/>
-              </w:rPr>
-              <w:t>_____________________________________________________________________</w:t>
-            </w:r>
-          </w:p>
-          <w:p>
-            <w:pPr>
-              <w:tabs>
-                <w:tab w:val="left" w:pos="601"/>
-                <w:tab w:val="left" w:pos="7513"/>
-              </w:tabs>
-              <w:spacing w:after="0" w:line="480" w:lineRule="auto"/>
-              <w:ind w:left="601"/>
-              <w:jc w:val="both"/>
-              <w:rPr>
-                <w:rFonts w:ascii="Times New Roman" w:eastAsia="Times New Roman" w:hAnsi="Times New Roman"/>
-                <w:b/>
-                <w:sz w:val="20"/>
-                <w:szCs w:val="20"/>
-                <w:lang w:eastAsia="ru-RU"/>
-              </w:rPr>
-            </w:pPr>
-            <w:r>
-              <w:rPr>
-                <w:rFonts w:ascii="Times New Roman" w:eastAsia="Times New Roman" w:hAnsi="Times New Roman"/>
-                <w:b/>
-                <w:sz w:val="20"/>
-                <w:szCs w:val="20"/>
-                <w:lang w:eastAsia="ru-RU"/>
-              </w:rPr>
-              <w:t>_____________________________________________________________________</w:t>
-            </w:r>
-          </w:p>
-          <w:p>
-            <w:pPr>
-              <w:tabs>
-                <w:tab w:val="left" w:pos="601"/>
-                <w:tab w:val="left" w:pos="7513"/>
-              </w:tabs>
-              <w:spacing w:after="0" w:line="480" w:lineRule="auto"/>
-              <w:ind w:left="601"/>
-              <w:jc w:val="both"/>
-              <w:rPr>
-                <w:rFonts w:ascii="Times New Roman" w:eastAsia="Times New Roman" w:hAnsi="Times New Roman"/>
-                <w:b/>
-                <w:sz w:val="20"/>
-                <w:szCs w:val="20"/>
-                <w:lang w:eastAsia="ru-RU"/>
-              </w:rPr>
-            </w:pPr>
-            <w:r>
-              <w:rPr>
-                <w:rFonts w:ascii="Times New Roman" w:eastAsia="Times New Roman" w:hAnsi="Times New Roman"/>
-                <w:b/>
-                <w:sz w:val="20"/>
-                <w:szCs w:val="20"/>
-                <w:lang w:eastAsia="ru-RU"/>
-              </w:rPr>
-              <w:t>_____________________________________________________________________</w:t>
+                <w:bCs/>
+                <w:sz w:val="20"/>
+                <w:szCs w:val="20"/>
+                <w:u w:val="single"/>
+                <w:lang w:eastAsia="ru-RU"/>
+              </w:rPr>
+            </w:pPr>
+            <w:r>
+              <w:rPr>
+                <w:rFonts w:ascii="Times New Roman" w:eastAsia="Times New Roman" w:hAnsi="Times New Roman"/>
+                <w:bCs/>
+                <w:sz w:val="20"/>
+                <w:szCs w:val="20"/>
+                <w:u w:val="single"/>
+                <w:lang w:eastAsia="ru-RU"/>
+              </w:rPr>
+              <w:t xml:space="preserve">Підготовлено та оформлено індивідуальний звіт про проходження переддипломної практики. Систематизовано результати дослідження та експериментального тестування: показники точності моделі YOLOv9-c, коректність 3D-реконструкції у </w:t>
+            </w:r>
+            <w:proofErr w:type="spellStart"/>
+            <w:r>
+              <w:rPr>
+                <w:rFonts w:ascii="Times New Roman" w:eastAsia="Times New Roman" w:hAnsi="Times New Roman"/>
+                <w:bCs/>
+                <w:sz w:val="20"/>
+                <w:szCs w:val="20"/>
+                <w:u w:val="single"/>
+                <w:lang w:eastAsia="ru-RU"/>
+              </w:rPr>
+              <w:t>NodeODM</w:t>
+            </w:r>
+            <w:proofErr w:type="spellEnd"/>
+            <w:r>
+              <w:rPr>
+                <w:rFonts w:ascii="Times New Roman" w:eastAsia="Times New Roman" w:hAnsi="Times New Roman"/>
+                <w:bCs/>
+                <w:sz w:val="20"/>
+                <w:szCs w:val="20"/>
+                <w:u w:val="single"/>
+                <w:lang w:eastAsia="ru-RU"/>
+              </w:rPr>
+              <w:t xml:space="preserve"> та працездатність клієнт-серверного </w:t>
+            </w:r>
+            <w:proofErr w:type="spellStart"/>
+            <w:r>
+              <w:rPr>
+                <w:rFonts w:ascii="Times New Roman" w:eastAsia="Times New Roman" w:hAnsi="Times New Roman"/>
+                <w:bCs/>
+                <w:sz w:val="20"/>
+                <w:szCs w:val="20"/>
+                <w:u w:val="single"/>
+                <w:lang w:eastAsia="ru-RU"/>
+              </w:rPr>
+              <w:t>вебзастосунку</w:t>
+            </w:r>
+            <w:proofErr w:type="spellEnd"/>
+            <w:r>
+              <w:rPr>
+                <w:rFonts w:ascii="Times New Roman" w:eastAsia="Times New Roman" w:hAnsi="Times New Roman"/>
+                <w:bCs/>
+                <w:sz w:val="20"/>
+                <w:szCs w:val="20"/>
+                <w:u w:val="single"/>
+                <w:lang w:eastAsia="ru-RU"/>
+              </w:rPr>
+              <w:t>. Структуровано графічні матеріали для подальшого оформлення креслеників</w:t>
+            </w:r>
+            <w:r>
+              <w:rPr>
+                <w:rFonts w:ascii="Times New Roman" w:eastAsia="Times New Roman" w:hAnsi="Times New Roman"/>
+                <w:bCs/>
+                <w:sz w:val="20"/>
+                <w:szCs w:val="20"/>
+                <w:u w:val="single"/>
+                <w:lang w:eastAsia="ru-RU"/>
+              </w:rPr>
+              <w:t xml:space="preserve"> </w:t>
+            </w:r>
+            <w:r>
+              <w:rPr>
+                <w:rFonts w:ascii="Times New Roman" w:eastAsia="Times New Roman" w:hAnsi="Times New Roman"/>
+                <w:bCs/>
+                <w:sz w:val="20"/>
+                <w:szCs w:val="20"/>
+                <w:u w:val="single"/>
+                <w:lang w:eastAsia="ru-RU"/>
+              </w:rPr>
+              <w:t>магістерської</w:t>
+            </w:r>
+            <w:r>
+              <w:rPr>
+                <w:rFonts w:ascii="Times New Roman" w:eastAsia="Times New Roman" w:hAnsi="Times New Roman"/>
+                <w:bCs/>
+                <w:sz w:val="20"/>
+                <w:szCs w:val="20"/>
+                <w:u w:val="single"/>
+                <w:lang w:eastAsia="ru-RU"/>
+              </w:rPr>
+              <w:t xml:space="preserve"> </w:t>
+            </w:r>
+            <w:r>
+              <w:rPr>
+                <w:rFonts w:ascii="Times New Roman" w:eastAsia="Times New Roman" w:hAnsi="Times New Roman"/>
+                <w:bCs/>
+                <w:sz w:val="20"/>
+                <w:szCs w:val="20"/>
+                <w:u w:val="single"/>
+                <w:lang w:eastAsia="ru-RU"/>
+              </w:rPr>
+              <w:t>дисертації</w:t>
+            </w:r>
+            <w:r>
+              <w:rPr>
+                <w:rFonts w:ascii="Times New Roman" w:eastAsia="Times New Roman" w:hAnsi="Times New Roman"/>
+                <w:bCs/>
+                <w:sz w:val="20"/>
+                <w:szCs w:val="20"/>
+                <w:u w:val="single"/>
+                <w:lang w:eastAsia="ru-RU"/>
+              </w:rPr>
+              <w:t>.</w:t>
+            </w:r>
+            <w:r>
+              <w:rPr>
+                <w:rFonts w:ascii="Times New Roman" w:eastAsia="Times New Roman" w:hAnsi="Times New Roman"/>
+                <w:bCs/>
+                <w:sz w:val="20"/>
+                <w:szCs w:val="20"/>
+                <w:lang w:eastAsia="ru-RU"/>
+              </w:rPr>
+              <w:t>__________________________________ _____________________________________________________________________</w:t>
             </w:r>
           </w:p>
           <w:p>
@@ -5613,7 +6558,7 @@
             <w:r>
               <w:rPr>
                 <w:rFonts w:ascii="Cambria" w:hAnsi="Cambria"/>
-                <w:highlight w:val="yellow"/>
+                <w:u w:val="single"/>
                 <w:lang w:val="ru-RU"/>
               </w:rPr>
               <w:t>5</w:t>
@@ -5622,7 +6567,13 @@
               <w:rPr>
                 <w:rFonts w:ascii="UkrainianBaltica" w:hAnsi="UkrainianBaltica"/>
               </w:rPr>
-              <w:t>____ тиждень практики</w:t>
+              <w:t xml:space="preserve">___ </w:t>
+            </w:r>
+            <w:r>
+              <w:rPr>
+                <w:rFonts w:ascii="UkrainianBaltica" w:hAnsi="UkrainianBaltica"/>
+              </w:rPr>
+              <w:t>тиждень практики</w:t>
             </w:r>
           </w:p>
           <w:p>
@@ -5650,7 +6601,104 @@
                 <w:szCs w:val="20"/>
                 <w:lang w:eastAsia="ru-RU"/>
               </w:rPr>
-              <w:t>__________________</w:t>
+              <w:t>___</w:t>
+            </w:r>
+            <w:r>
+              <w:rPr>
+                <w:rFonts w:ascii="Times New Roman" w:eastAsia="Times New Roman" w:hAnsi="Times New Roman"/>
+                <w:b/>
+                <w:sz w:val="20"/>
+                <w:szCs w:val="20"/>
+                <w:lang w:eastAsia="ru-RU"/>
+              </w:rPr>
+              <w:t>_</w:t>
+            </w:r>
+            <w:r>
+              <w:rPr>
+                <w:rFonts w:ascii="Times New Roman" w:eastAsia="Times New Roman" w:hAnsi="Times New Roman"/>
+                <w:bCs/>
+                <w:sz w:val="20"/>
+                <w:szCs w:val="20"/>
+                <w:u w:val="single"/>
+                <w:lang w:eastAsia="ru-RU"/>
+              </w:rPr>
+              <w:t>21</w:t>
+            </w:r>
+            <w:r>
+              <w:rPr>
+                <w:rFonts w:ascii="Times New Roman" w:eastAsia="Times New Roman" w:hAnsi="Times New Roman"/>
+                <w:bCs/>
+                <w:sz w:val="20"/>
+                <w:szCs w:val="20"/>
+                <w:u w:val="single"/>
+                <w:lang w:eastAsia="ru-RU"/>
+              </w:rPr>
+              <w:t>.0</w:t>
+            </w:r>
+            <w:r>
+              <w:rPr>
+                <w:rFonts w:ascii="Times New Roman" w:eastAsia="Times New Roman" w:hAnsi="Times New Roman"/>
+                <w:bCs/>
+                <w:sz w:val="20"/>
+                <w:szCs w:val="20"/>
+                <w:u w:val="single"/>
+                <w:lang w:eastAsia="ru-RU"/>
+              </w:rPr>
+              <w:t>9</w:t>
+            </w:r>
+            <w:r>
+              <w:rPr>
+                <w:rFonts w:ascii="Times New Roman" w:eastAsia="Times New Roman" w:hAnsi="Times New Roman"/>
+                <w:bCs/>
+                <w:sz w:val="20"/>
+                <w:szCs w:val="20"/>
+                <w:u w:val="single"/>
+                <w:lang w:eastAsia="ru-RU"/>
+              </w:rPr>
+              <w:t>–</w:t>
+            </w:r>
+            <w:r>
+              <w:rPr>
+                <w:rFonts w:ascii="Times New Roman" w:eastAsia="Times New Roman" w:hAnsi="Times New Roman"/>
+                <w:bCs/>
+                <w:sz w:val="20"/>
+                <w:szCs w:val="20"/>
+                <w:u w:val="single"/>
+                <w:lang w:eastAsia="ru-RU"/>
+              </w:rPr>
+              <w:t>25.</w:t>
+            </w:r>
+            <w:r>
+              <w:rPr>
+                <w:rFonts w:ascii="Times New Roman" w:eastAsia="Times New Roman" w:hAnsi="Times New Roman"/>
+                <w:bCs/>
+                <w:sz w:val="20"/>
+                <w:szCs w:val="20"/>
+                <w:u w:val="single"/>
+                <w:lang w:eastAsia="ru-RU"/>
+              </w:rPr>
+              <w:t>0</w:t>
+            </w:r>
+            <w:r>
+              <w:rPr>
+                <w:rFonts w:ascii="Times New Roman" w:eastAsia="Times New Roman" w:hAnsi="Times New Roman"/>
+                <w:bCs/>
+                <w:sz w:val="20"/>
+                <w:szCs w:val="20"/>
+                <w:u w:val="single"/>
+                <w:lang w:eastAsia="ru-RU"/>
+              </w:rPr>
+              <w:t>9</w:t>
+            </w:r>
+            <w:r>
+              <w:rPr>
+                <w:rFonts w:ascii="Times New Roman" w:eastAsia="Times New Roman" w:hAnsi="Times New Roman"/>
+                <w:b/>
+                <w:sz w:val="20"/>
+                <w:szCs w:val="20"/>
+                <w:lang w:eastAsia="ru-RU"/>
+              </w:rPr>
+              <w:t>____</w:t>
             </w:r>
             <w:r>
               <w:rPr>
@@ -5770,94 +6818,277 @@
             <w:pPr>
               <w:tabs>
                 <w:tab w:val="left" w:pos="176"/>
-                <w:tab w:val="left" w:pos="7513"/>
+                <w:tab w:val="left" w:pos="7557"/>
               </w:tabs>
               <w:spacing w:after="0" w:line="480" w:lineRule="auto"/>
-              <w:ind w:left="284"/>
+              <w:ind w:left="284" w:right="280"/>
               <w:jc w:val="both"/>
               <w:rPr>
                 <w:rFonts w:ascii="Times New Roman" w:eastAsia="Times New Roman" w:hAnsi="Times New Roman"/>
-                <w:b/>
-                <w:sz w:val="20"/>
-                <w:szCs w:val="20"/>
-                <w:lang w:eastAsia="ru-RU"/>
-              </w:rPr>
-            </w:pPr>
-            <w:r>
-              <w:rPr>
-                <w:rFonts w:ascii="Times New Roman" w:eastAsia="Times New Roman" w:hAnsi="Times New Roman"/>
-                <w:b/>
-                <w:sz w:val="20"/>
-                <w:szCs w:val="20"/>
-                <w:lang w:eastAsia="ru-RU"/>
-              </w:rPr>
-              <w:t>________________________________________________________________________</w:t>
+                <w:bCs/>
+                <w:sz w:val="20"/>
+                <w:szCs w:val="20"/>
+                <w:u w:val="single"/>
+                <w:lang w:eastAsia="ru-RU"/>
+              </w:rPr>
+            </w:pPr>
+            <w:r>
+              <w:rPr>
+                <w:rFonts w:ascii="Times New Roman" w:eastAsia="Times New Roman" w:hAnsi="Times New Roman"/>
+                <w:bCs/>
+                <w:sz w:val="20"/>
+                <w:szCs w:val="20"/>
+                <w:u w:val="single"/>
+                <w:lang w:eastAsia="ru-RU"/>
+              </w:rPr>
+              <w:t xml:space="preserve">Проведено навчання та оптимізацію моделі YOLOv9-c (загальний час обчислень </w:t>
+            </w:r>
+            <w:r>
+              <w:rPr>
+                <w:rFonts w:ascii="Times New Roman" w:eastAsia="Times New Roman" w:hAnsi="Times New Roman"/>
+                <w:bCs/>
+                <w:sz w:val="20"/>
+                <w:szCs w:val="20"/>
+                <w:u w:val="single"/>
+                <w:lang w:eastAsia="ru-RU"/>
+              </w:rPr>
+              <w:t>–</w:t>
+            </w:r>
+            <w:r>
+              <w:rPr>
+                <w:rFonts w:ascii="Times New Roman" w:eastAsia="Times New Roman" w:hAnsi="Times New Roman"/>
+                <w:bCs/>
+                <w:sz w:val="20"/>
+                <w:szCs w:val="20"/>
+                <w:u w:val="single"/>
+                <w:lang w:eastAsia="ru-RU"/>
+              </w:rPr>
+              <w:t xml:space="preserve"> близько 23 годин</w:t>
+            </w:r>
+            <w:r>
+              <w:rPr>
+                <w:rFonts w:ascii="Times New Roman" w:eastAsia="Times New Roman" w:hAnsi="Times New Roman"/>
+                <w:bCs/>
+                <w:sz w:val="20"/>
+                <w:szCs w:val="20"/>
+                <w:u w:val="single"/>
+                <w:lang w:val="ru-RU" w:eastAsia="ru-RU"/>
+              </w:rPr>
+              <w:t xml:space="preserve">,  </w:t>
+            </w:r>
+            <w:r>
+              <w:rPr>
+                <w:rFonts w:ascii="Times New Roman" w:eastAsia="Times New Roman" w:hAnsi="Times New Roman"/>
+                <w:bCs/>
+                <w:sz w:val="20"/>
+                <w:szCs w:val="20"/>
+                <w:u w:val="single"/>
+                <w:lang w:eastAsia="ru-RU"/>
+              </w:rPr>
+              <w:t>кількість епох – 70</w:t>
+            </w:r>
+            <w:r>
+              <w:rPr>
+                <w:rFonts w:ascii="Times New Roman" w:eastAsia="Times New Roman" w:hAnsi="Times New Roman"/>
+                <w:bCs/>
+                <w:sz w:val="20"/>
+                <w:szCs w:val="20"/>
+                <w:u w:val="single"/>
+                <w:lang w:eastAsia="ru-RU"/>
+              </w:rPr>
+              <w:t>). Досягнуто таких результатів:</w:t>
+            </w:r>
+            <w:r>
+              <w:rPr>
+                <w:rFonts w:ascii="Times New Roman" w:eastAsia="Times New Roman" w:hAnsi="Times New Roman"/>
+                <w:bCs/>
+                <w:sz w:val="20"/>
+                <w:szCs w:val="20"/>
+                <w:lang w:eastAsia="ru-RU"/>
+              </w:rPr>
+              <w:t>______________</w:t>
             </w:r>
           </w:p>
           <w:p>
             <w:pPr>
               <w:tabs>
                 <w:tab w:val="left" w:pos="176"/>
-                <w:tab w:val="left" w:pos="7513"/>
+                <w:tab w:val="left" w:pos="7557"/>
               </w:tabs>
               <w:spacing w:after="0" w:line="480" w:lineRule="auto"/>
-              <w:ind w:left="284"/>
+              <w:ind w:left="284" w:right="280"/>
               <w:jc w:val="both"/>
               <w:rPr>
                 <w:rFonts w:ascii="Times New Roman" w:eastAsia="Times New Roman" w:hAnsi="Times New Roman"/>
-                <w:b/>
-                <w:sz w:val="20"/>
-                <w:szCs w:val="20"/>
-                <w:lang w:eastAsia="ru-RU"/>
-              </w:rPr>
-            </w:pPr>
-            <w:r>
-              <w:rPr>
-                <w:rFonts w:ascii="Times New Roman" w:eastAsia="Times New Roman" w:hAnsi="Times New Roman"/>
-                <w:b/>
-                <w:sz w:val="20"/>
-                <w:szCs w:val="20"/>
-                <w:lang w:eastAsia="ru-RU"/>
-              </w:rPr>
-              <w:t>________________________________________________________________________</w:t>
+                <w:bCs/>
+                <w:sz w:val="20"/>
+                <w:szCs w:val="20"/>
+                <w:u w:val="single"/>
+                <w:lang w:eastAsia="ru-RU"/>
+              </w:rPr>
+            </w:pPr>
+            <w:r>
+              <w:rPr>
+                <w:rFonts w:ascii="Times New Roman" w:eastAsia="Times New Roman" w:hAnsi="Times New Roman"/>
+                <w:bCs/>
+                <w:sz w:val="20"/>
+                <w:szCs w:val="20"/>
+                <w:u w:val="single"/>
+                <w:lang w:eastAsia="ru-RU"/>
+              </w:rPr>
+              <w:t xml:space="preserve">        – </w:t>
+            </w:r>
+            <w:r>
+              <w:rPr>
+                <w:rFonts w:ascii="Times New Roman" w:eastAsia="Times New Roman" w:hAnsi="Times New Roman"/>
+                <w:bCs/>
+                <w:sz w:val="20"/>
+                <w:szCs w:val="20"/>
+                <w:u w:val="single"/>
+                <w:lang w:eastAsia="ru-RU"/>
+              </w:rPr>
+              <w:t>Загальну точність (</w:t>
+            </w:r>
+            <w:proofErr w:type="spellStart"/>
+            <w:r>
+              <w:rPr>
+                <w:rFonts w:ascii="Times New Roman" w:eastAsia="Times New Roman" w:hAnsi="Times New Roman"/>
+                <w:bCs/>
+                <w:sz w:val="20"/>
+                <w:szCs w:val="20"/>
+                <w:u w:val="single"/>
+                <w:lang w:eastAsia="ru-RU"/>
+              </w:rPr>
+              <w:t>Mask</w:t>
+            </w:r>
+            <w:proofErr w:type="spellEnd"/>
+            <w:r>
+              <w:rPr>
+                <w:rFonts w:ascii="Times New Roman" w:eastAsia="Times New Roman" w:hAnsi="Times New Roman"/>
+                <w:bCs/>
+                <w:sz w:val="20"/>
+                <w:szCs w:val="20"/>
+                <w:u w:val="single"/>
+                <w:lang w:eastAsia="ru-RU"/>
+              </w:rPr>
+              <w:t xml:space="preserve"> mAP@0.5) підвищено з 71,5% до 76,9%, що успішно перевищує встановлену вимогу у 75%</w:t>
+            </w:r>
+            <w:r>
+              <w:rPr>
+                <w:rFonts w:ascii="Times New Roman" w:eastAsia="Times New Roman" w:hAnsi="Times New Roman"/>
+                <w:bCs/>
+                <w:sz w:val="20"/>
+                <w:szCs w:val="20"/>
+                <w:u w:val="single"/>
+                <w:lang w:val="ru-RU" w:eastAsia="ru-RU"/>
+              </w:rPr>
+              <w:t>;</w:t>
+            </w:r>
+            <w:r>
+              <w:rPr>
+                <w:rFonts w:ascii="Times New Roman" w:eastAsia="Times New Roman" w:hAnsi="Times New Roman"/>
+                <w:bCs/>
+                <w:sz w:val="20"/>
+                <w:szCs w:val="20"/>
+                <w:lang w:eastAsia="ru-RU"/>
+              </w:rPr>
+              <w:t>________________________________________</w:t>
             </w:r>
           </w:p>
           <w:p>
             <w:pPr>
               <w:tabs>
                 <w:tab w:val="left" w:pos="176"/>
-                <w:tab w:val="left" w:pos="7513"/>
+                <w:tab w:val="left" w:pos="7557"/>
               </w:tabs>
               <w:spacing w:after="0" w:line="480" w:lineRule="auto"/>
-              <w:ind w:left="284"/>
+              <w:ind w:left="284" w:right="280"/>
               <w:jc w:val="both"/>
               <w:rPr>
                 <w:rFonts w:ascii="Times New Roman" w:eastAsia="Times New Roman" w:hAnsi="Times New Roman"/>
-                <w:b/>
-                <w:sz w:val="20"/>
-                <w:szCs w:val="20"/>
-                <w:lang w:eastAsia="ru-RU"/>
-              </w:rPr>
-            </w:pPr>
-            <w:r>
-              <w:rPr>
-                <w:rFonts w:ascii="Times New Roman" w:eastAsia="Times New Roman" w:hAnsi="Times New Roman"/>
-                <w:b/>
-                <w:sz w:val="20"/>
-                <w:szCs w:val="20"/>
-                <w:lang w:eastAsia="ru-RU"/>
-              </w:rPr>
-              <w:t>________________________________________________________________________</w:t>
+                <w:bCs/>
+                <w:sz w:val="20"/>
+                <w:szCs w:val="20"/>
+                <w:u w:val="single"/>
+                <w:lang w:eastAsia="ru-RU"/>
+              </w:rPr>
+            </w:pPr>
+            <w:r>
+              <w:rPr>
+                <w:rFonts w:ascii="Times New Roman" w:eastAsia="Times New Roman" w:hAnsi="Times New Roman"/>
+                <w:bCs/>
+                <w:sz w:val="20"/>
+                <w:szCs w:val="20"/>
+                <w:u w:val="single"/>
+                <w:lang w:eastAsia="ru-RU"/>
+              </w:rPr>
+              <w:t xml:space="preserve">        – </w:t>
+            </w:r>
+            <w:r>
+              <w:rPr>
+                <w:rFonts w:ascii="Times New Roman" w:eastAsia="Times New Roman" w:hAnsi="Times New Roman"/>
+                <w:bCs/>
+                <w:sz w:val="20"/>
+                <w:szCs w:val="20"/>
+                <w:u w:val="single"/>
+                <w:lang w:eastAsia="ru-RU"/>
+              </w:rPr>
+              <w:t xml:space="preserve">Точність сегментації найскладнішого класу </w:t>
+            </w:r>
+            <w:proofErr w:type="spellStart"/>
+            <w:r>
+              <w:rPr>
+                <w:rFonts w:ascii="Times New Roman" w:eastAsia="Times New Roman" w:hAnsi="Times New Roman"/>
+                <w:bCs/>
+                <w:sz w:val="20"/>
+                <w:szCs w:val="20"/>
+                <w:u w:val="single"/>
+                <w:lang w:eastAsia="ru-RU"/>
+              </w:rPr>
+              <w:t>crack</w:t>
+            </w:r>
+            <w:proofErr w:type="spellEnd"/>
+            <w:r>
+              <w:rPr>
+                <w:rFonts w:ascii="Times New Roman" w:eastAsia="Times New Roman" w:hAnsi="Times New Roman"/>
+                <w:bCs/>
+                <w:sz w:val="20"/>
+                <w:szCs w:val="20"/>
+                <w:u w:val="single"/>
+                <w:lang w:eastAsia="ru-RU"/>
+              </w:rPr>
+              <w:t xml:space="preserve"> зросла з 47,2% до 57,9%</w:t>
+            </w:r>
+            <w:r>
+              <w:rPr>
+                <w:rFonts w:ascii="Times New Roman" w:eastAsia="Times New Roman" w:hAnsi="Times New Roman"/>
+                <w:bCs/>
+                <w:sz w:val="20"/>
+                <w:szCs w:val="20"/>
+                <w:u w:val="single"/>
+                <w:lang w:eastAsia="ru-RU"/>
+              </w:rPr>
+              <w:t>.</w:t>
+            </w:r>
+            <w:r>
+              <w:rPr>
+                <w:rFonts w:ascii="Times New Roman" w:eastAsia="Times New Roman" w:hAnsi="Times New Roman"/>
+                <w:bCs/>
+                <w:sz w:val="20"/>
+                <w:szCs w:val="20"/>
+                <w:lang w:eastAsia="ru-RU"/>
+              </w:rPr>
+              <w:t>____</w:t>
             </w:r>
           </w:p>
           <w:p>
             <w:pPr>
               <w:tabs>
                 <w:tab w:val="left" w:pos="176"/>
-                <w:tab w:val="left" w:pos="7513"/>
+                <w:tab w:val="left" w:pos="7557"/>
               </w:tabs>
               <w:spacing w:after="0" w:line="480" w:lineRule="auto"/>
-              <w:ind w:left="284"/>
+              <w:ind w:left="284" w:right="280"/>
               <w:jc w:val="both"/>
               <w:rPr>
                 <w:rFonts w:ascii="Times New Roman" w:eastAsia="Times New Roman" w:hAnsi="Times New Roman"/>
@@ -5870,96 +7101,112 @@
             <w:r>
               <w:rPr>
                 <w:rFonts w:ascii="Times New Roman" w:eastAsia="Times New Roman" w:hAnsi="Times New Roman"/>
-                <w:b/>
-                <w:sz w:val="20"/>
-                <w:szCs w:val="20"/>
-                <w:lang w:eastAsia="ru-RU"/>
-              </w:rPr>
-              <w:t>________________________________________________________________________</w:t>
-            </w:r>
-          </w:p>
-          <w:p>
-            <w:pPr>
-              <w:tabs>
-                <w:tab w:val="left" w:pos="176"/>
-                <w:tab w:val="left" w:pos="7513"/>
-              </w:tabs>
-              <w:spacing w:after="0" w:line="480" w:lineRule="auto"/>
-              <w:ind w:left="284"/>
-              <w:jc w:val="both"/>
-              <w:rPr>
-                <w:rFonts w:ascii="Times New Roman" w:eastAsia="Times New Roman" w:hAnsi="Times New Roman"/>
-                <w:b/>
-                <w:sz w:val="20"/>
-                <w:szCs w:val="20"/>
-                <w:lang w:eastAsia="ru-RU"/>
-              </w:rPr>
-            </w:pPr>
-            <w:r>
-              <w:rPr>
-                <w:rFonts w:ascii="Times New Roman" w:eastAsia="Times New Roman" w:hAnsi="Times New Roman"/>
-                <w:b/>
-                <w:sz w:val="20"/>
-                <w:szCs w:val="20"/>
-                <w:lang w:eastAsia="ru-RU"/>
-              </w:rPr>
-              <w:t>________________________________________________________________________</w:t>
-            </w:r>
-          </w:p>
-          <w:p>
-            <w:pPr>
-              <w:tabs>
-                <w:tab w:val="left" w:pos="176"/>
-                <w:tab w:val="left" w:pos="7513"/>
-              </w:tabs>
-              <w:spacing w:after="0" w:line="480" w:lineRule="auto"/>
-              <w:ind w:left="284"/>
-              <w:jc w:val="both"/>
-              <w:rPr>
-                <w:rFonts w:ascii="Times New Roman" w:eastAsia="Times New Roman" w:hAnsi="Times New Roman"/>
-                <w:b/>
-                <w:sz w:val="20"/>
-                <w:szCs w:val="20"/>
-                <w:lang w:eastAsia="ru-RU"/>
-              </w:rPr>
-            </w:pPr>
-            <w:r>
-              <w:rPr>
-                <w:rFonts w:ascii="Times New Roman" w:eastAsia="Times New Roman" w:hAnsi="Times New Roman"/>
-                <w:b/>
-                <w:sz w:val="20"/>
-                <w:szCs w:val="20"/>
-                <w:lang w:eastAsia="ru-RU"/>
-              </w:rPr>
-              <w:t>________________________________________________________________________</w:t>
-            </w:r>
-          </w:p>
-          <w:p>
-            <w:pPr>
-              <w:tabs>
-                <w:tab w:val="left" w:pos="176"/>
-                <w:tab w:val="left" w:pos="7513"/>
-              </w:tabs>
-              <w:spacing w:after="0" w:line="480" w:lineRule="auto"/>
-              <w:ind w:left="284"/>
-              <w:jc w:val="both"/>
-              <w:rPr>
-                <w:rFonts w:ascii="Times New Roman" w:eastAsia="Times New Roman" w:hAnsi="Times New Roman"/>
-                <w:b/>
-                <w:sz w:val="20"/>
-                <w:szCs w:val="20"/>
-                <w:lang w:eastAsia="ru-RU"/>
-              </w:rPr>
-            </w:pPr>
-            <w:r>
-              <w:rPr>
-                <w:rFonts w:ascii="Times New Roman" w:eastAsia="Times New Roman" w:hAnsi="Times New Roman"/>
-                <w:b/>
-                <w:sz w:val="20"/>
-                <w:szCs w:val="20"/>
-                <w:lang w:eastAsia="ru-RU"/>
-              </w:rPr>
-              <w:t>________________________________________________________________________</w:t>
+                <w:bCs/>
+                <w:sz w:val="20"/>
+                <w:szCs w:val="20"/>
+                <w:u w:val="single"/>
+                <w:lang w:eastAsia="ru-RU"/>
+              </w:rPr>
+              <w:t xml:space="preserve">Для максимізації показників якості передбачено подальше </w:t>
+            </w:r>
+            <w:proofErr w:type="spellStart"/>
+            <w:r>
+              <w:rPr>
+                <w:rFonts w:ascii="Times New Roman" w:eastAsia="Times New Roman" w:hAnsi="Times New Roman"/>
+                <w:bCs/>
+                <w:sz w:val="20"/>
+                <w:szCs w:val="20"/>
+                <w:u w:val="single"/>
+                <w:lang w:eastAsia="ru-RU"/>
+              </w:rPr>
+              <w:t>донавчання</w:t>
+            </w:r>
+            <w:proofErr w:type="spellEnd"/>
+            <w:r>
+              <w:rPr>
+                <w:rFonts w:ascii="Times New Roman" w:eastAsia="Times New Roman" w:hAnsi="Times New Roman"/>
+                <w:bCs/>
+                <w:sz w:val="20"/>
+                <w:szCs w:val="20"/>
+                <w:u w:val="single"/>
+                <w:lang w:eastAsia="ru-RU"/>
+              </w:rPr>
+              <w:t xml:space="preserve"> моделі. Також </w:t>
+            </w:r>
+            <w:r>
+              <w:rPr>
+                <w:rFonts w:ascii="Times New Roman" w:eastAsia="Times New Roman" w:hAnsi="Times New Roman"/>
+                <w:bCs/>
+                <w:sz w:val="20"/>
+                <w:szCs w:val="20"/>
+                <w:u w:val="single"/>
+                <w:lang w:eastAsia="ru-RU"/>
+              </w:rPr>
+              <w:t xml:space="preserve">розпочато </w:t>
+            </w:r>
+            <w:r>
+              <w:rPr>
+                <w:rFonts w:ascii="Times New Roman" w:eastAsia="Times New Roman" w:hAnsi="Times New Roman"/>
+                <w:bCs/>
+                <w:sz w:val="20"/>
+                <w:szCs w:val="20"/>
+                <w:u w:val="single"/>
+                <w:lang w:eastAsia="ru-RU"/>
+              </w:rPr>
+              <w:t>програмну реалізацію</w:t>
+            </w:r>
+            <w:r>
+              <w:rPr>
+                <w:rFonts w:ascii="Times New Roman" w:eastAsia="Times New Roman" w:hAnsi="Times New Roman"/>
+                <w:bCs/>
+                <w:sz w:val="20"/>
+                <w:szCs w:val="20"/>
+                <w:u w:val="single"/>
+                <w:lang w:eastAsia="ru-RU"/>
+              </w:rPr>
+              <w:t xml:space="preserve"> серверної частини</w:t>
+            </w:r>
+            <w:r>
+              <w:rPr>
+                <w:rFonts w:ascii="Times New Roman" w:eastAsia="Times New Roman" w:hAnsi="Times New Roman"/>
+                <w:bCs/>
+                <w:sz w:val="20"/>
+                <w:szCs w:val="20"/>
+                <w:u w:val="single"/>
+                <w:lang w:eastAsia="ru-RU"/>
+              </w:rPr>
+              <w:t xml:space="preserve"> системи</w:t>
+            </w:r>
+            <w:r>
+              <w:rPr>
+                <w:rFonts w:ascii="Times New Roman" w:eastAsia="Times New Roman" w:hAnsi="Times New Roman"/>
+                <w:bCs/>
+                <w:sz w:val="20"/>
+                <w:szCs w:val="20"/>
+                <w:u w:val="single"/>
+                <w:lang w:eastAsia="ru-RU"/>
+              </w:rPr>
+              <w:t>.</w:t>
+            </w:r>
+            <w:r>
+              <w:rPr>
+                <w:rFonts w:ascii="Times New Roman" w:eastAsia="Times New Roman" w:hAnsi="Times New Roman"/>
+                <w:bCs/>
+                <w:sz w:val="20"/>
+                <w:szCs w:val="20"/>
+                <w:lang w:eastAsia="ru-RU"/>
+              </w:rPr>
+              <w:t>_________</w:t>
+            </w:r>
+            <w:r>
+              <w:rPr>
+                <w:rFonts w:ascii="Times New Roman" w:eastAsia="Times New Roman" w:hAnsi="Times New Roman"/>
+                <w:bCs/>
+                <w:sz w:val="20"/>
+                <w:szCs w:val="20"/>
+                <w:lang w:eastAsia="ru-RU"/>
+              </w:rPr>
+              <w:t>____________</w:t>
             </w:r>
           </w:p>
           <w:p>
@@ -6014,7 +7261,7 @@
             <w:r>
               <w:rPr>
                 <w:rFonts w:ascii="Cambria" w:hAnsi="Cambria"/>
-                <w:highlight w:val="yellow"/>
+                <w:u w:val="single"/>
                 <w:lang w:val="ru-RU"/>
               </w:rPr>
               <w:t>6</w:t>
@@ -6051,7 +7298,82 @@
                 <w:szCs w:val="20"/>
                 <w:lang w:eastAsia="ru-RU"/>
               </w:rPr>
-              <w:t>__________________</w:t>
+              <w:t>___</w:t>
+            </w:r>
+            <w:r>
+              <w:rPr>
+                <w:rFonts w:ascii="Times New Roman" w:eastAsia="Times New Roman" w:hAnsi="Times New Roman"/>
+                <w:b/>
+                <w:sz w:val="20"/>
+                <w:szCs w:val="20"/>
+                <w:lang w:eastAsia="ru-RU"/>
+              </w:rPr>
+              <w:t>_</w:t>
+            </w:r>
+            <w:r>
+              <w:rPr>
+                <w:rFonts w:ascii="Times New Roman" w:eastAsia="Times New Roman" w:hAnsi="Times New Roman"/>
+                <w:bCs/>
+                <w:sz w:val="20"/>
+                <w:szCs w:val="20"/>
+                <w:u w:val="single"/>
+                <w:lang w:eastAsia="ru-RU"/>
+              </w:rPr>
+              <w:t>28</w:t>
+            </w:r>
+            <w:r>
+              <w:rPr>
+                <w:rFonts w:ascii="Times New Roman" w:eastAsia="Times New Roman" w:hAnsi="Times New Roman"/>
+                <w:bCs/>
+                <w:sz w:val="20"/>
+                <w:szCs w:val="20"/>
+                <w:u w:val="single"/>
+                <w:lang w:eastAsia="ru-RU"/>
+              </w:rPr>
+              <w:t>.0</w:t>
+            </w:r>
+            <w:r>
+              <w:rPr>
+                <w:rFonts w:ascii="Times New Roman" w:eastAsia="Times New Roman" w:hAnsi="Times New Roman"/>
+                <w:bCs/>
+                <w:sz w:val="20"/>
+                <w:szCs w:val="20"/>
+                <w:u w:val="single"/>
+                <w:lang w:eastAsia="ru-RU"/>
+              </w:rPr>
+              <w:t>9</w:t>
+            </w:r>
+            <w:r>
+              <w:rPr>
+                <w:rFonts w:ascii="Times New Roman" w:eastAsia="Times New Roman" w:hAnsi="Times New Roman"/>
+                <w:bCs/>
+                <w:sz w:val="20"/>
+                <w:szCs w:val="20"/>
+                <w:u w:val="single"/>
+                <w:lang w:eastAsia="ru-RU"/>
+              </w:rPr>
+              <w:t>–</w:t>
+            </w:r>
+            <w:r>
+              <w:rPr>
+                <w:rFonts w:ascii="Times New Roman" w:eastAsia="Times New Roman" w:hAnsi="Times New Roman"/>
+                <w:bCs/>
+                <w:sz w:val="20"/>
+                <w:szCs w:val="20"/>
+                <w:u w:val="single"/>
+                <w:lang w:eastAsia="ru-RU"/>
+              </w:rPr>
+              <w:t>02.10</w:t>
+            </w:r>
+            <w:r>
+              <w:rPr>
+                <w:rFonts w:ascii="Times New Roman" w:eastAsia="Times New Roman" w:hAnsi="Times New Roman"/>
+                <w:b/>
+                <w:sz w:val="20"/>
+                <w:szCs w:val="20"/>
+                <w:lang w:eastAsia="ru-RU"/>
+              </w:rPr>
+              <w:t>____</w:t>
             </w:r>
             <w:r>
               <w:rPr>
@@ -6171,196 +7493,158 @@
             <w:pPr>
               <w:tabs>
                 <w:tab w:val="left" w:pos="176"/>
-                <w:tab w:val="left" w:pos="7513"/>
+                <w:tab w:val="left" w:pos="7559"/>
               </w:tabs>
               <w:spacing w:after="0" w:line="480" w:lineRule="auto"/>
-              <w:ind w:left="284"/>
+              <w:ind w:left="284" w:right="287"/>
               <w:jc w:val="both"/>
               <w:rPr>
                 <w:rFonts w:ascii="Times New Roman" w:eastAsia="Times New Roman" w:hAnsi="Times New Roman"/>
-                <w:b/>
-                <w:sz w:val="20"/>
-                <w:szCs w:val="20"/>
-                <w:lang w:eastAsia="ru-RU"/>
-              </w:rPr>
-            </w:pPr>
-            <w:r>
-              <w:rPr>
-                <w:rFonts w:ascii="Times New Roman" w:eastAsia="Times New Roman" w:hAnsi="Times New Roman"/>
-                <w:b/>
-                <w:sz w:val="20"/>
-                <w:szCs w:val="20"/>
-                <w:lang w:eastAsia="ru-RU"/>
-              </w:rPr>
-              <w:t>________________________________________________________________________</w:t>
-            </w:r>
-          </w:p>
-          <w:p>
-            <w:pPr>
-              <w:tabs>
-                <w:tab w:val="left" w:pos="176"/>
-                <w:tab w:val="left" w:pos="7513"/>
-              </w:tabs>
-              <w:spacing w:after="0" w:line="480" w:lineRule="auto"/>
-              <w:ind w:left="284"/>
-              <w:jc w:val="both"/>
-              <w:rPr>
-                <w:rFonts w:ascii="Times New Roman" w:eastAsia="Times New Roman" w:hAnsi="Times New Roman"/>
-                <w:b/>
-                <w:sz w:val="20"/>
-                <w:szCs w:val="20"/>
-                <w:lang w:eastAsia="ru-RU"/>
-              </w:rPr>
-            </w:pPr>
-            <w:r>
-              <w:rPr>
-                <w:rFonts w:ascii="Times New Roman" w:eastAsia="Times New Roman" w:hAnsi="Times New Roman"/>
-                <w:b/>
-                <w:sz w:val="20"/>
-                <w:szCs w:val="20"/>
-                <w:lang w:eastAsia="ru-RU"/>
-              </w:rPr>
-              <w:t>________________________________________________________________________</w:t>
-            </w:r>
-          </w:p>
-          <w:p>
-            <w:pPr>
-              <w:tabs>
-                <w:tab w:val="left" w:pos="176"/>
-                <w:tab w:val="left" w:pos="7513"/>
-              </w:tabs>
-              <w:spacing w:after="0" w:line="480" w:lineRule="auto"/>
-              <w:ind w:left="284"/>
-              <w:jc w:val="both"/>
-              <w:rPr>
-                <w:rFonts w:ascii="Times New Roman" w:eastAsia="Times New Roman" w:hAnsi="Times New Roman"/>
-                <w:b/>
-                <w:sz w:val="20"/>
-                <w:szCs w:val="20"/>
-                <w:lang w:eastAsia="ru-RU"/>
-              </w:rPr>
-            </w:pPr>
-            <w:r>
-              <w:rPr>
-                <w:rFonts w:ascii="Times New Roman" w:eastAsia="Times New Roman" w:hAnsi="Times New Roman"/>
-                <w:b/>
-                <w:sz w:val="20"/>
-                <w:szCs w:val="20"/>
-                <w:lang w:eastAsia="ru-RU"/>
-              </w:rPr>
-              <w:t>________________________________________________________________________</w:t>
-            </w:r>
-          </w:p>
-          <w:p>
-            <w:pPr>
-              <w:tabs>
-                <w:tab w:val="left" w:pos="176"/>
-                <w:tab w:val="left" w:pos="7513"/>
-              </w:tabs>
-              <w:spacing w:after="0" w:line="480" w:lineRule="auto"/>
-              <w:ind w:left="284"/>
-              <w:jc w:val="both"/>
-              <w:rPr>
-                <w:rFonts w:ascii="Times New Roman" w:eastAsia="Times New Roman" w:hAnsi="Times New Roman"/>
-                <w:b/>
-                <w:sz w:val="20"/>
-                <w:szCs w:val="20"/>
-                <w:lang w:eastAsia="ru-RU"/>
-              </w:rPr>
-            </w:pPr>
-            <w:r>
-              <w:rPr>
-                <w:rFonts w:ascii="Times New Roman" w:eastAsia="Times New Roman" w:hAnsi="Times New Roman"/>
-                <w:b/>
-                <w:sz w:val="20"/>
-                <w:szCs w:val="20"/>
-                <w:lang w:eastAsia="ru-RU"/>
-              </w:rPr>
-              <w:t>________________________________________________________________________</w:t>
-            </w:r>
-          </w:p>
-          <w:p>
-            <w:pPr>
-              <w:tabs>
-                <w:tab w:val="left" w:pos="176"/>
-                <w:tab w:val="left" w:pos="7513"/>
-              </w:tabs>
-              <w:spacing w:after="0" w:line="480" w:lineRule="auto"/>
-              <w:ind w:left="284"/>
-              <w:jc w:val="both"/>
-              <w:rPr>
-                <w:rFonts w:ascii="Times New Roman" w:eastAsia="Times New Roman" w:hAnsi="Times New Roman"/>
-                <w:b/>
-                <w:sz w:val="20"/>
-                <w:szCs w:val="20"/>
-                <w:lang w:eastAsia="ru-RU"/>
-              </w:rPr>
-            </w:pPr>
-            <w:r>
-              <w:rPr>
-                <w:rFonts w:ascii="Times New Roman" w:eastAsia="Times New Roman" w:hAnsi="Times New Roman"/>
-                <w:b/>
-                <w:sz w:val="20"/>
-                <w:szCs w:val="20"/>
-                <w:lang w:eastAsia="ru-RU"/>
-              </w:rPr>
-              <w:t>________________________________________________________________________</w:t>
-            </w:r>
-          </w:p>
-          <w:p>
-            <w:pPr>
-              <w:tabs>
-                <w:tab w:val="left" w:pos="176"/>
-                <w:tab w:val="left" w:pos="7513"/>
-              </w:tabs>
-              <w:spacing w:after="0" w:line="480" w:lineRule="auto"/>
-              <w:ind w:left="284"/>
-              <w:jc w:val="both"/>
-              <w:rPr>
-                <w:rFonts w:ascii="Times New Roman" w:eastAsia="Times New Roman" w:hAnsi="Times New Roman"/>
-                <w:b/>
-                <w:sz w:val="20"/>
-                <w:szCs w:val="20"/>
-                <w:lang w:eastAsia="ru-RU"/>
-              </w:rPr>
-            </w:pPr>
-            <w:r>
-              <w:rPr>
-                <w:rFonts w:ascii="Times New Roman" w:eastAsia="Times New Roman" w:hAnsi="Times New Roman"/>
-                <w:b/>
-                <w:sz w:val="20"/>
-                <w:szCs w:val="20"/>
-                <w:lang w:eastAsia="ru-RU"/>
-              </w:rPr>
-              <w:t>________________________________________________________________________</w:t>
-            </w:r>
-          </w:p>
-          <w:p>
-            <w:pPr>
-              <w:tabs>
-                <w:tab w:val="left" w:pos="176"/>
-                <w:tab w:val="left" w:pos="7513"/>
-              </w:tabs>
-              <w:spacing w:after="0" w:line="480" w:lineRule="auto"/>
-              <w:ind w:left="284"/>
-              <w:jc w:val="both"/>
-              <w:rPr>
-                <w:rFonts w:ascii="Times New Roman" w:eastAsia="Times New Roman" w:hAnsi="Times New Roman"/>
-                <w:b/>
-                <w:sz w:val="20"/>
-                <w:szCs w:val="20"/>
-                <w:lang w:eastAsia="ru-RU"/>
-              </w:rPr>
-            </w:pPr>
-            <w:r>
-              <w:rPr>
-                <w:rFonts w:ascii="Times New Roman" w:eastAsia="Times New Roman" w:hAnsi="Times New Roman"/>
-                <w:b/>
-                <w:sz w:val="20"/>
-                <w:szCs w:val="20"/>
-                <w:lang w:eastAsia="ru-RU"/>
-              </w:rPr>
-              <w:t>________________________________________________________________________</w:t>
+                <w:bCs/>
+                <w:sz w:val="20"/>
+                <w:szCs w:val="20"/>
+                <w:u w:val="single"/>
+                <w:lang w:eastAsia="ru-RU"/>
+              </w:rPr>
+            </w:pPr>
+            <w:r>
+              <w:rPr>
+                <w:rFonts w:ascii="Times New Roman" w:eastAsia="Times New Roman" w:hAnsi="Times New Roman"/>
+                <w:bCs/>
+                <w:sz w:val="20"/>
+                <w:szCs w:val="20"/>
+                <w:u w:val="single"/>
+                <w:lang w:eastAsia="ru-RU"/>
+              </w:rPr>
+              <w:t xml:space="preserve">Виконано розробку базової архітектури </w:t>
+            </w:r>
+            <w:proofErr w:type="spellStart"/>
+            <w:r>
+              <w:rPr>
+                <w:rFonts w:ascii="Times New Roman" w:eastAsia="Times New Roman" w:hAnsi="Times New Roman"/>
+                <w:bCs/>
+                <w:sz w:val="20"/>
+                <w:szCs w:val="20"/>
+                <w:u w:val="single"/>
+                <w:lang w:eastAsia="ru-RU"/>
+              </w:rPr>
+              <w:t>фронтенд</w:t>
+            </w:r>
+            <w:proofErr w:type="spellEnd"/>
+            <w:r>
+              <w:rPr>
+                <w:rFonts w:ascii="Times New Roman" w:eastAsia="Times New Roman" w:hAnsi="Times New Roman"/>
+                <w:bCs/>
+                <w:sz w:val="20"/>
+                <w:szCs w:val="20"/>
+                <w:u w:val="single"/>
+                <w:lang w:eastAsia="ru-RU"/>
+              </w:rPr>
+              <w:t xml:space="preserve">-застосунку для зручної взаємодії користувача з системою та налаштовано API-взаємодію. Розпочато роботу над модулем просторової 3D-моделі будівлі, зокрема </w:t>
+            </w:r>
+            <w:proofErr w:type="spellStart"/>
+            <w:r>
+              <w:rPr>
+                <w:rFonts w:ascii="Times New Roman" w:eastAsia="Times New Roman" w:hAnsi="Times New Roman"/>
+                <w:bCs/>
+                <w:sz w:val="20"/>
+                <w:szCs w:val="20"/>
+                <w:u w:val="single"/>
+                <w:lang w:eastAsia="ru-RU"/>
+              </w:rPr>
+              <w:t>проєктування</w:t>
+            </w:r>
+            <w:proofErr w:type="spellEnd"/>
+            <w:r>
+              <w:rPr>
+                <w:rFonts w:ascii="Times New Roman" w:eastAsia="Times New Roman" w:hAnsi="Times New Roman"/>
+                <w:bCs/>
+                <w:sz w:val="20"/>
+                <w:szCs w:val="20"/>
+                <w:u w:val="single"/>
+                <w:lang w:eastAsia="ru-RU"/>
+              </w:rPr>
+              <w:t xml:space="preserve"> логіки </w:t>
+            </w:r>
+            <w:proofErr w:type="spellStart"/>
+            <w:r>
+              <w:rPr>
+                <w:rFonts w:ascii="Times New Roman" w:eastAsia="Times New Roman" w:hAnsi="Times New Roman"/>
+                <w:bCs/>
+                <w:sz w:val="20"/>
+                <w:szCs w:val="20"/>
+                <w:u w:val="single"/>
+                <w:lang w:eastAsia="ru-RU"/>
+              </w:rPr>
+              <w:t>рендерингу</w:t>
+            </w:r>
+            <w:proofErr w:type="spellEnd"/>
+            <w:r>
+              <w:rPr>
+                <w:rFonts w:ascii="Times New Roman" w:eastAsia="Times New Roman" w:hAnsi="Times New Roman"/>
+                <w:bCs/>
+                <w:sz w:val="20"/>
+                <w:szCs w:val="20"/>
+                <w:u w:val="single"/>
+                <w:lang w:eastAsia="ru-RU"/>
+              </w:rPr>
+              <w:t xml:space="preserve"> тривимірного об'єкта безпосередньо у браузері та підготовку інструментів для подальшого </w:t>
+            </w:r>
+            <w:proofErr w:type="spellStart"/>
+            <w:r>
+              <w:rPr>
+                <w:rFonts w:ascii="Times New Roman" w:eastAsia="Times New Roman" w:hAnsi="Times New Roman"/>
+                <w:bCs/>
+                <w:sz w:val="20"/>
+                <w:szCs w:val="20"/>
+                <w:u w:val="single"/>
+                <w:lang w:eastAsia="ru-RU"/>
+              </w:rPr>
+              <w:t>мапінгу</w:t>
+            </w:r>
+            <w:proofErr w:type="spellEnd"/>
+            <w:r>
+              <w:rPr>
+                <w:rFonts w:ascii="Times New Roman" w:eastAsia="Times New Roman" w:hAnsi="Times New Roman"/>
+                <w:bCs/>
+                <w:sz w:val="20"/>
+                <w:szCs w:val="20"/>
+                <w:u w:val="single"/>
+                <w:lang w:eastAsia="ru-RU"/>
+              </w:rPr>
+              <w:t xml:space="preserve"> знайдених</w:t>
+            </w:r>
+            <w:r>
+              <w:rPr>
+                <w:rFonts w:ascii="Times New Roman" w:eastAsia="Times New Roman" w:hAnsi="Times New Roman"/>
+                <w:bCs/>
+                <w:sz w:val="20"/>
+                <w:szCs w:val="20"/>
+                <w:u w:val="single"/>
+                <w:lang w:eastAsia="ru-RU"/>
+              </w:rPr>
+              <w:t xml:space="preserve"> </w:t>
+            </w:r>
+            <w:r>
+              <w:rPr>
+                <w:rFonts w:ascii="Times New Roman" w:eastAsia="Times New Roman" w:hAnsi="Times New Roman"/>
+                <w:bCs/>
+                <w:sz w:val="20"/>
+                <w:szCs w:val="20"/>
+                <w:u w:val="single"/>
+                <w:lang w:eastAsia="ru-RU"/>
+              </w:rPr>
+              <w:t>дефектів.</w:t>
+            </w:r>
+            <w:r>
+              <w:rPr>
+                <w:rFonts w:ascii="Times New Roman" w:eastAsia="Times New Roman" w:hAnsi="Times New Roman"/>
+                <w:bCs/>
+                <w:sz w:val="20"/>
+                <w:szCs w:val="20"/>
+                <w:lang w:eastAsia="ru-RU"/>
+              </w:rPr>
+              <w:t>____________________________________ ________________________________________________________________________________________________________________________________________________</w:t>
             </w:r>
           </w:p>
           <w:p>
@@ -9329,16 +10613,38 @@
                 <w:szCs w:val="20"/>
                 <w:lang w:eastAsia="ru-RU"/>
               </w:rPr>
-              <w:t>Хмелюк М.С.</w:t>
-            </w:r>
-            <w:r>
-              <w:rPr>
-                <w:rFonts w:ascii="Times New Roman" w:eastAsia="Times New Roman" w:hAnsi="Times New Roman"/>
-                <w:sz w:val="20"/>
-                <w:szCs w:val="20"/>
-                <w:lang w:eastAsia="ru-RU"/>
-              </w:rPr>
-              <w:t>_____________</w:t>
+              <w:t>_____</w:t>
+            </w:r>
+            <w:proofErr w:type="spellStart"/>
+            <w:r>
+              <w:rPr>
+                <w:rFonts w:ascii="Times New Roman" w:eastAsia="Times New Roman" w:hAnsi="Times New Roman"/>
+                <w:sz w:val="20"/>
+                <w:szCs w:val="20"/>
+                <w:u w:val="single"/>
+                <w:lang w:eastAsia="ru-RU"/>
+              </w:rPr>
+              <w:t>Хмелюк</w:t>
+            </w:r>
+            <w:proofErr w:type="spellEnd"/>
+            <w:r>
+              <w:rPr>
+                <w:rFonts w:ascii="Times New Roman" w:eastAsia="Times New Roman" w:hAnsi="Times New Roman"/>
+                <w:sz w:val="20"/>
+                <w:szCs w:val="20"/>
+                <w:u w:val="single"/>
+                <w:lang w:eastAsia="ru-RU"/>
+              </w:rPr>
+              <w:t xml:space="preserve"> М.С.</w:t>
+            </w:r>
+            <w:r>
+              <w:rPr>
+                <w:rFonts w:ascii="Times New Roman" w:eastAsia="Times New Roman" w:hAnsi="Times New Roman"/>
+                <w:sz w:val="20"/>
+                <w:szCs w:val="20"/>
+                <w:lang w:eastAsia="ru-RU"/>
+              </w:rPr>
+              <w:t>________</w:t>
             </w:r>
           </w:p>
           <w:p>
@@ -9360,16 +10666,34 @@
                 <w:szCs w:val="16"/>
                 <w:lang w:eastAsia="ru-RU"/>
               </w:rPr>
-              <w:t xml:space="preserve">                                           </w:t>
-            </w:r>
-            <w:r>
-              <w:rPr>
-                <w:rFonts w:ascii="Times New Roman" w:eastAsia="Times New Roman" w:hAnsi="Times New Roman"/>
-                <w:sz w:val="16"/>
-                <w:szCs w:val="16"/>
-                <w:lang w:eastAsia="ru-RU"/>
-              </w:rPr>
-              <w:t>(підпис)                             (прізвище та ініціали)</w:t>
+              <w:t xml:space="preserve">                         </w:t>
+            </w:r>
+            <w:r>
+              <w:rPr>
+                <w:rFonts w:ascii="Times New Roman" w:eastAsia="Times New Roman" w:hAnsi="Times New Roman"/>
+                <w:sz w:val="16"/>
+                <w:szCs w:val="16"/>
+                <w:lang w:eastAsia="ru-RU"/>
+              </w:rPr>
+              <w:t xml:space="preserve">(підпис)                       </w:t>
+            </w:r>
+            <w:r>
+              <w:rPr>
+                <w:rFonts w:ascii="Times New Roman" w:eastAsia="Times New Roman" w:hAnsi="Times New Roman"/>
+                <w:sz w:val="16"/>
+                <w:szCs w:val="16"/>
+                <w:lang w:eastAsia="ru-RU"/>
+              </w:rPr>
+              <w:t xml:space="preserve">                     </w:t>
+            </w:r>
+            <w:r>
+              <w:rPr>
+                <w:rFonts w:ascii="Times New Roman" w:eastAsia="Times New Roman" w:hAnsi="Times New Roman"/>
+                <w:sz w:val="16"/>
+                <w:szCs w:val="16"/>
+                <w:lang w:eastAsia="ru-RU"/>
+              </w:rPr>
+              <w:t xml:space="preserve">      (прізвище та ініціали)</w:t>
             </w:r>
           </w:p>
           <w:p>
@@ -9418,6 +10742,15 @@
                 <w:szCs w:val="20"/>
                 <w:lang w:eastAsia="ru-RU"/>
               </w:rPr>
+              <w:t>_</w:t>
+            </w:r>
+            <w:r>
+              <w:rPr>
+                <w:rFonts w:ascii="Times New Roman" w:eastAsia="Times New Roman" w:hAnsi="Times New Roman"/>
+                <w:sz w:val="20"/>
+                <w:szCs w:val="20"/>
+                <w:lang w:eastAsia="ru-RU"/>
+              </w:rPr>
               <w:t>__</w:t>
             </w:r>
             <w:r>
@@ -9427,26 +10760,92 @@
                 <w:szCs w:val="20"/>
                 <w:lang w:eastAsia="ru-RU"/>
               </w:rPr>
+              <w:t>_</w:t>
+            </w:r>
+            <w:r>
+              <w:rPr>
+                <w:rFonts w:ascii="Times New Roman" w:eastAsia="Times New Roman" w:hAnsi="Times New Roman"/>
+                <w:sz w:val="20"/>
+                <w:szCs w:val="20"/>
+                <w:lang w:eastAsia="ru-RU"/>
+              </w:rPr>
+              <w:t>__</w:t>
+            </w:r>
+            <w:r>
+              <w:rPr>
+                <w:rFonts w:ascii="Times New Roman" w:eastAsia="Times New Roman" w:hAnsi="Times New Roman"/>
+                <w:sz w:val="20"/>
+                <w:szCs w:val="20"/>
+                <w:lang w:eastAsia="ru-RU"/>
+              </w:rPr>
+              <w:t>__</w:t>
+            </w:r>
+            <w:r>
+              <w:rPr>
+                <w:rFonts w:ascii="Times New Roman" w:eastAsia="Times New Roman" w:hAnsi="Times New Roman"/>
+                <w:sz w:val="20"/>
+                <w:szCs w:val="20"/>
+                <w:lang w:eastAsia="ru-RU"/>
+              </w:rPr>
+              <w:t xml:space="preserve"> _______</w:t>
+            </w:r>
+            <w:r>
+              <w:rPr>
+                <w:rFonts w:ascii="Times New Roman" w:eastAsia="Times New Roman" w:hAnsi="Times New Roman"/>
+                <w:sz w:val="20"/>
+                <w:szCs w:val="20"/>
+                <w:lang w:eastAsia="ru-RU"/>
+              </w:rPr>
+              <w:t>_</w:t>
+            </w:r>
+            <w:proofErr w:type="spellStart"/>
+            <w:r>
+              <w:rPr>
+                <w:rFonts w:ascii="Times New Roman" w:eastAsia="Times New Roman" w:hAnsi="Times New Roman"/>
+                <w:sz w:val="20"/>
+                <w:szCs w:val="20"/>
+                <w:u w:val="single"/>
+                <w:lang w:eastAsia="ru-RU"/>
+              </w:rPr>
+              <w:t>Белоус</w:t>
+            </w:r>
+            <w:proofErr w:type="spellEnd"/>
+            <w:r>
+              <w:rPr>
+                <w:rFonts w:ascii="Times New Roman" w:eastAsia="Times New Roman" w:hAnsi="Times New Roman"/>
+                <w:sz w:val="20"/>
+                <w:szCs w:val="20"/>
+                <w:u w:val="single"/>
+                <w:lang w:eastAsia="ru-RU"/>
+              </w:rPr>
+              <w:t xml:space="preserve"> Р. В.</w:t>
+            </w:r>
+            <w:r>
+              <w:rPr>
+                <w:rFonts w:ascii="Times New Roman" w:eastAsia="Times New Roman" w:hAnsi="Times New Roman"/>
+                <w:sz w:val="20"/>
+                <w:szCs w:val="20"/>
+                <w:lang w:eastAsia="ru-RU"/>
+              </w:rPr>
+              <w:t>__</w:t>
+            </w:r>
+            <w:r>
+              <w:rPr>
+                <w:rFonts w:ascii="Times New Roman" w:eastAsia="Times New Roman" w:hAnsi="Times New Roman"/>
+                <w:sz w:val="20"/>
+                <w:szCs w:val="20"/>
+                <w:lang w:eastAsia="ru-RU"/>
+              </w:rPr>
+              <w:t>__</w:t>
+            </w:r>
+            <w:r>
+              <w:rPr>
+                <w:rFonts w:ascii="Times New Roman" w:eastAsia="Times New Roman" w:hAnsi="Times New Roman"/>
+                <w:sz w:val="20"/>
+                <w:szCs w:val="20"/>
+                <w:lang w:eastAsia="ru-RU"/>
+              </w:rPr>
               <w:t>___</w:t>
-            </w:r>
-            <w:r>
-              <w:rPr>
-                <w:rFonts w:ascii="Times New Roman" w:eastAsia="Times New Roman" w:hAnsi="Times New Roman"/>
-                <w:sz w:val="20"/>
-                <w:szCs w:val="20"/>
-                <w:highlight w:val="yellow"/>
-                <w:lang w:eastAsia="ru-RU"/>
-              </w:rPr>
-              <w:t>________________________</w:t>
-            </w:r>
-            <w:r>
-              <w:rPr>
-                <w:rFonts w:ascii="Times New Roman" w:eastAsia="Times New Roman" w:hAnsi="Times New Roman"/>
-                <w:sz w:val="20"/>
-                <w:szCs w:val="20"/>
-                <w:lang w:eastAsia="ru-RU"/>
-              </w:rPr>
-              <w:t>____</w:t>
             </w:r>
           </w:p>
           <w:p>
@@ -9467,16 +10866,52 @@
                 <w:szCs w:val="16"/>
                 <w:lang w:eastAsia="ru-RU"/>
               </w:rPr>
-              <w:t xml:space="preserve">                                                            </w:t>
-            </w:r>
-            <w:r>
-              <w:rPr>
-                <w:rFonts w:ascii="Times New Roman" w:eastAsia="Times New Roman" w:hAnsi="Times New Roman"/>
-                <w:sz w:val="16"/>
-                <w:szCs w:val="16"/>
-                <w:lang w:eastAsia="ru-RU"/>
-              </w:rPr>
-              <w:t>(підпис)                               (прізвище та ініціали)</w:t>
+              <w:t xml:space="preserve">                                     </w:t>
+            </w:r>
+            <w:r>
+              <w:rPr>
+                <w:rFonts w:ascii="Times New Roman" w:eastAsia="Times New Roman" w:hAnsi="Times New Roman"/>
+                <w:sz w:val="16"/>
+                <w:szCs w:val="16"/>
+                <w:lang w:eastAsia="ru-RU"/>
+              </w:rPr>
+              <w:t xml:space="preserve">            </w:t>
+            </w:r>
+            <w:r>
+              <w:rPr>
+                <w:rFonts w:ascii="Times New Roman" w:eastAsia="Times New Roman" w:hAnsi="Times New Roman"/>
+                <w:sz w:val="16"/>
+                <w:szCs w:val="16"/>
+                <w:lang w:eastAsia="ru-RU"/>
+              </w:rPr>
+              <w:t xml:space="preserve">                 </w:t>
+            </w:r>
+            <w:r>
+              <w:rPr>
+                <w:rFonts w:ascii="Times New Roman" w:eastAsia="Times New Roman" w:hAnsi="Times New Roman"/>
+                <w:sz w:val="16"/>
+                <w:szCs w:val="16"/>
+                <w:lang w:eastAsia="ru-RU"/>
+              </w:rPr>
+              <w:t xml:space="preserve">     </w:t>
+            </w:r>
+            <w:r>
+              <w:rPr>
+                <w:rFonts w:ascii="Times New Roman" w:eastAsia="Times New Roman" w:hAnsi="Times New Roman"/>
+                <w:sz w:val="16"/>
+                <w:szCs w:val="16"/>
+                <w:lang w:eastAsia="ru-RU"/>
+              </w:rPr>
+              <w:t xml:space="preserve">      </w:t>
+            </w:r>
+            <w:r>
+              <w:rPr>
+                <w:rFonts w:ascii="Times New Roman" w:eastAsia="Times New Roman" w:hAnsi="Times New Roman"/>
+                <w:sz w:val="16"/>
+                <w:szCs w:val="16"/>
+                <w:lang w:eastAsia="ru-RU"/>
+              </w:rPr>
+              <w:t>(підпис)                         (прізвище та ініціали)</w:t>
             </w:r>
           </w:p>
           <w:p>
@@ -9744,7 +11179,7 @@
             <w:pPr>
               <w:tabs>
                 <w:tab w:val="left" w:pos="601"/>
-                <w:tab w:val="left" w:pos="7513"/>
+                <w:tab w:val="left" w:pos="7557"/>
               </w:tabs>
               <w:spacing w:after="0" w:line="480" w:lineRule="auto"/>
               <w:ind w:left="601" w:right="289"/>
@@ -10656,7 +12091,7 @@
             <w:pPr>
               <w:tabs>
                 <w:tab w:val="left" w:pos="601"/>
-                <w:tab w:val="left" w:pos="7513"/>
+                <w:tab w:val="left" w:pos="7863"/>
               </w:tabs>
               <w:spacing w:after="0" w:line="480" w:lineRule="auto"/>
               <w:ind w:left="601" w:right="288"/>
@@ -10929,18 +12364,7 @@
                 <w:u w:val="single"/>
                 <w:lang w:eastAsia="ru-RU"/>
               </w:rPr>
-              <w:t>1</w:t>
-            </w:r>
-            <w:r>
-              <w:rPr>
-                <w:rFonts w:ascii="Times New Roman" w:eastAsia="Times New Roman" w:hAnsi="Times New Roman"/>
-                <w:bCs/>
-                <w:sz w:val="20"/>
-                <w:szCs w:val="20"/>
-                <w:u w:val="single"/>
-                <w:lang w:eastAsia="ru-RU"/>
-              </w:rPr>
-              <w:t>8</w:t>
+              <w:t>18</w:t>
             </w:r>
             <w:r>
               <w:rPr>
@@ -11095,7 +12519,7 @@
                 <w:tab w:val="left" w:pos="7513"/>
               </w:tabs>
               <w:spacing w:after="0" w:line="480" w:lineRule="auto"/>
-              <w:ind w:left="601"/>
+              <w:ind w:left="601" w:right="280"/>
               <w:jc w:val="both"/>
               <w:rPr>
                 <w:rFonts w:ascii="Times New Roman" w:eastAsia="Times New Roman" w:hAnsi="Times New Roman"/>
@@ -11187,18 +12611,7 @@
                 <w:u w:val="single"/>
                 <w:lang w:eastAsia="ru-RU"/>
               </w:rPr>
-              <w:t xml:space="preserve"> із використанням GPU-прискорювача. Розпочато навчання моделі YOLOv9-C-SEG на підготовленому наборі даних та налаштовано збереження результатів навчання і ваг моделі</w:t>
-            </w:r>
-            <w:r>
-              <w:rPr>
-                <w:rFonts w:ascii="Times New Roman" w:eastAsia="Times New Roman" w:hAnsi="Times New Roman"/>
-                <w:bCs/>
-                <w:sz w:val="20"/>
-                <w:szCs w:val="20"/>
-                <w:u w:val="single"/>
-                <w:lang w:eastAsia="ru-RU"/>
-              </w:rPr>
-              <w:t xml:space="preserve">. Завершено </w:t>
+              <w:t xml:space="preserve"> із використанням GPU-прискорювача. Розпочато навчання моделі YOLOv9-C-SEG на підготовленому наборі даних та налаштовано збереження результатів навчання і ваг моделі. Завершено </w:t>
             </w:r>
             <w:proofErr w:type="spellStart"/>
             <w:r>
@@ -11222,28 +12635,17 @@
                 <w:u w:val="single"/>
                 <w:lang w:eastAsia="ru-RU"/>
               </w:rPr>
-              <w:t xml:space="preserve"> архітектури веб-додатка</w:t>
-            </w:r>
-            <w:r>
-              <w:rPr>
-                <w:rFonts w:ascii="Times New Roman" w:eastAsia="Times New Roman" w:hAnsi="Times New Roman"/>
-                <w:bCs/>
-                <w:sz w:val="20"/>
-                <w:szCs w:val="20"/>
-                <w:u w:val="single"/>
-                <w:lang w:eastAsia="ru-RU"/>
-              </w:rPr>
-              <w:t>.</w:t>
-            </w:r>
-            <w:r>
-              <w:rPr>
-                <w:rFonts w:ascii="Times New Roman" w:eastAsia="Times New Roman" w:hAnsi="Times New Roman"/>
-                <w:bCs/>
-                <w:sz w:val="20"/>
-                <w:szCs w:val="20"/>
-                <w:lang w:eastAsia="ru-RU"/>
-              </w:rPr>
-              <w:t>_____________________________</w:t>
+              <w:t xml:space="preserve"> архітектури веб-додатка.</w:t>
+            </w:r>
+            <w:r>
+              <w:rPr>
+                <w:rFonts w:ascii="Times New Roman" w:eastAsia="Times New Roman" w:hAnsi="Times New Roman"/>
+                <w:bCs/>
+                <w:sz w:val="20"/>
+                <w:szCs w:val="20"/>
+                <w:lang w:eastAsia="ru-RU"/>
+              </w:rPr>
+              <w:t>________________</w:t>
             </w:r>
             <w:r>
               <w:rPr>
@@ -11991,6 +13393,17 @@
       <w:lang w:val="uk-UA" w:eastAsia="en-US"/>
     </w:rPr>
   </w:style>
+  <w:style w:type="paragraph" w:styleId="ListParagraph">
+    <w:name w:val="List Paragraph"/>
+    <w:basedOn w:val="Normal"/>
+    <w:uiPriority w:val="34"/>
+    <w:qFormat/>
+    <w:rsid w:val="007854E2"/>
+    <w:pPr>
+      <w:ind w:left="720"/>
+      <w:contextualSpacing/>
+    </w:pPr>
+  </w:style>
 </w:styles>
 </file>
 

</xml_diff>